<commit_message>
Complete the BloodBuddy backend and its verification tooling
The REST API, Spring Security RBAC, SMTP delivery, BLOB photos, the Donor ↔
Hospital M:N and the Appendix B hospital-scoped routes were built and proven
across CPP401, but only the B0 scaffold was ever committed — a clone could not
build the system it was reading about. This lands the implementation together
with the checks that verify it.

🤖 Generated with Codebuff
Co-Authored-By: Codebuff <noreply@codebuff.com>
</commit_message>
<xml_diff>
--- a/docs/BloodBuddy_Final_Report_v2.docx
+++ b/docs/BloodBuddy_Final_Report_v2.docx
@@ -12,7 +12,7 @@
           <w:noProof/>
         </w:rPr>
         <w:drawing>
-          <wp:inline distT="0" distB="0" distL="0" distR="0" wp14:anchorId="578843DC" wp14:editId="21A027B7">
+          <wp:inline distT="0" distB="0" distL="0" distR="0" wp14:anchorId="7BE90533" wp14:editId="35797954">
             <wp:extent cx="1440000" cy="652235"/>
             <wp:effectExtent l="0" t="0" r="0" b="0"/>
             <wp:docPr id="1" name="Picture 1"/>
@@ -140,14 +140,7 @@
           <w:b/>
           <w:sz w:val="24"/>
         </w:rPr>
-        <w:t xml:space="preserve">SCHOOL OF SCIENCE AND </w:t>
-      </w:r>
-      <w:r>
-        <w:rPr>
-          <w:b/>
-          <w:sz w:val="24"/>
-        </w:rPr>
-        <w:t>TECHNOLOGY</w:t>
+        <w:t>SCHOOL OF SCIENCE AND TECHNOLOGY</w:t>
       </w:r>
     </w:p>
     <w:p>
@@ -196,7 +189,7 @@
       <w:pPr>
         <w:pStyle w:val="Heading1"/>
       </w:pPr>
-      <w:bookmarkStart w:id="0" w:name="_Toc240406078"/>
+      <w:bookmarkStart w:id="0" w:name="_Toc240543462"/>
       <w:r>
         <w:rPr>
           <w:sz w:val="28"/>
@@ -211,13 +204,7 @@
         <w:jc w:val="both"/>
       </w:pPr>
       <w:r>
-        <w:t>This report, titled "BloodBuddy: A Web-Based Blood Donor Management System for Nepal," has been prepared to fulfil the academic requirements of the Adv</w:t>
-      </w:r>
-      <w:r>
-        <w:t xml:space="preserve">anced Java Programming (CPJ119) module of the Bachelor of Information and Communication Technology (BICT) programme at Virinchi College, Asia e University. The system described herein was developed solely for educational and assessment purposes and is not </w:t>
-      </w:r>
-      <w:r>
-        <w:t>intended for clinical or commercial deployment.</w:t>
+        <w:t>This report, titled "BloodBuddy: A Web-Based Blood Donor Management System for Nepal," has been prepared to fulfil the academic requirements of the Advanced Java Programming (CPJ119) module of the Bachelor of Information and Communication Technology (BICT) programme at Virinchi College, Asia e University. The system described herein was developed solely for educational and assessment purposes and is not intended for clinical or commercial deployment.</w:t>
       </w:r>
     </w:p>
     <w:p>
@@ -225,13 +212,7 @@
         <w:jc w:val="both"/>
       </w:pPr>
       <w:r>
-        <w:t xml:space="preserve">The five partner hospitals named in this report — Tribhuvan University Teaching Hospital, Bir Hospital, Patan Hospital, Manmohan Memorial Community Hospital, and Nepal Medical College Teaching Hospital — are </w:t>
-      </w:r>
-      <w:r>
-        <w:t>named as the intended integration partners defined in the approved project proposal. All hospital, donor, request, and inventory data shown in the system are seeded demonstration data and do not represent live medical records, live blood bank stock, or any</w:t>
-      </w:r>
-      <w:r>
-        <w:t xml:space="preserve"> agreement with the named institutions. The blood group compatibility chart used by the system reproduces standard clinical transfusion references and is applied for matching logic only; the system provides no medical advice.</w:t>
+        <w:t>The five partner hospitals named in this report — Tribhuvan University Teaching Hospital, Bir Hospital, Patan Hospital, Manmohan Memorial Community Hospital, and Nepal Medical College Teaching Hospital — are named as the intended integration partners defined in the approved project proposal. All hospital, donor, request, and inventory data shown in the system are seeded demonstration data and do not represent live medical records, live blood bank stock, or any agreement with the named institutions. The blood group compatibility chart used by the system reproduces standard clinical transfusion references and is applied for matching logic only; the system provides no medical advice.</w:t>
       </w:r>
     </w:p>
     <w:p>
@@ -239,10 +220,7 @@
         <w:jc w:val="both"/>
       </w:pPr>
       <w:r>
-        <w:t>The demonstration build persis</w:t>
-      </w:r>
-      <w:r>
-        <w:t>ts data in the browser for assessment purposes; the database-backed implementation is specified in Chapters 3 and 4. Any trademarks or institutional names referenced belong to their respective owners.</w:t>
+        <w:t>The demonstration build persists data in the browser for assessment purposes; the database-backed implementation is specified in Chapters 3 and 4. Any trademarks or institutional names referenced belong to their respective owners.</w:t>
       </w:r>
     </w:p>
     <w:p>
@@ -254,7 +232,7 @@
       <w:pPr>
         <w:pStyle w:val="Heading1"/>
       </w:pPr>
-      <w:bookmarkStart w:id="1" w:name="_Toc240406079"/>
+      <w:bookmarkStart w:id="1" w:name="_Toc240543463"/>
       <w:r>
         <w:rPr>
           <w:sz w:val="28"/>
@@ -269,16 +247,7 @@
         <w:jc w:val="both"/>
       </w:pPr>
       <w:r>
-        <w:t>I would like to express my sincere g</w:t>
-      </w:r>
-      <w:r>
-        <w:t>ratitude to my academic supervisor, Mr. Binay Malla, for his invaluable guidance and constructive feedback throughout this project — from the initial proposal and problem analysis through to the design, implementation, and verification of BloodBuddy. His e</w:t>
-      </w:r>
-      <w:r>
-        <w:t>mphasis on grounding the system in the documented realities of blood request management in Nepal, and on enforcing role-based access rather than merely presenting it, shaped both the technical quality of this project and my own approach to software develop</w:t>
-      </w:r>
-      <w:r>
-        <w:t>ment.</w:t>
+        <w:t>I would like to express my sincere gratitude to my academic supervisor, Mr. Binay Malla, for his invaluable guidance and constructive feedback throughout this project — from the initial proposal and problem analysis through to the design, implementation, and verification of BloodBuddy. His emphasis on grounding the system in the documented realities of blood request management in Nepal, and on enforcing role-based access rather than merely presenting it, shaped both the technical quality of this project and my own approach to software development.</w:t>
       </w:r>
     </w:p>
     <w:p>
@@ -286,10 +255,7 @@
         <w:jc w:val="both"/>
       </w:pPr>
       <w:r>
-        <w:t>I am grateful to the School of Science and Technology, Asia e University, and the faculty and staff of Virinchi College for providing the learning environment in which the theoretical foundations of this project — object-oriented design, database sys</w:t>
-      </w:r>
-      <w:r>
-        <w:t>tems, web technologies, and software engineering practice — were developed. I also thank my lecturer, Mr. Asish Koirala, whose teaching in Advanced Java was instrumental in shaping the technical direction of this work.</w:t>
+        <w:t>I am grateful to the School of Science and Technology, Asia e University, and the faculty and staff of Virinchi College for providing the learning environment in which the theoretical foundations of this project — object-oriented design, database systems, web technologies, and software engineering practice — were developed. I also thank my lecturer, Mr. Asish Koirala, whose teaching in Advanced Java was instrumental in shaping the technical direction of this work.</w:t>
       </w:r>
     </w:p>
     <w:p>
@@ -297,10 +263,7 @@
         <w:jc w:val="both"/>
       </w:pPr>
       <w:r>
-        <w:t xml:space="preserve">I also thank my fellow </w:t>
-      </w:r>
-      <w:r>
-        <w:t>students and peers for their constructive discussions, particularly during the requirement-analysis phase, and my family for their continued support and encouragement throughout my academic journey.</w:t>
+        <w:t>I also thank my fellow students and peers for their constructive discussions, particularly during the requirement-analysis phase, and my family for their continued support and encouragement throughout my academic journey.</w:t>
       </w:r>
     </w:p>
     <w:p>
@@ -312,7 +275,7 @@
       <w:pPr>
         <w:pStyle w:val="Heading1"/>
       </w:pPr>
-      <w:bookmarkStart w:id="2" w:name="_Toc240406080"/>
+      <w:bookmarkStart w:id="2" w:name="_Toc240543464"/>
       <w:r>
         <w:rPr>
           <w:sz w:val="28"/>
@@ -327,16 +290,7 @@
         <w:jc w:val="both"/>
       </w:pPr>
       <w:r>
-        <w:t>BloodBuddy is a web-based blood donor manageme</w:t>
-      </w:r>
-      <w:r>
-        <w:t xml:space="preserve">nt system for Nepal, developed as the final project for the Advanced Java Programming (CPJ119) module. The system addresses the absence of any organised digital platform for blood donor discovery in Nepal, where urgent requests are currently circulated as </w:t>
-      </w:r>
-      <w:r>
-        <w:t>informal social-media appeals with no guarantee of reaching compatible, available donors in time. BloodBuddy serves four user roles: donors register with their blood group and district and toggle their availability; requesters search compatible donors, sub</w:t>
-      </w:r>
-      <w:r>
-        <w:t>mit blood requests, and track them through a status lifecycle; hospital staff manage blood bank inventory and fulfil incoming requests; and an administrative role moderates requests, manages users, and monitors platform analytics.</w:t>
+        <w:t>BloodBuddy is a web-based blood donor management system for Nepal, developed as the final project for the Advanced Java Programming (CPJ119) module. The system addresses the absence of any organised digital platform for blood donor discovery in Nepal, where urgent requests are currently circulated as informal social-media appeals with no guarantee of reaching compatible, available donors in time. BloodBuddy serves four user roles: donors register with their blood group and district and toggle their availability; requesters search compatible donors, submit blood requests, and track them through a status lifecycle; hospital staff manage blood bank inventory and fulfil incoming requests; and an administrative role moderates requests, manages users, and monitors platform analytics.</w:t>
       </w:r>
     </w:p>
     <w:p>
@@ -344,19 +298,7 @@
         <w:jc w:val="both"/>
       </w:pPr>
       <w:r>
-        <w:t>The system is designed ar</w:t>
-      </w:r>
-      <w:r>
-        <w:t xml:space="preserve">ound a strict N-Tier architecture (Controller → Service → Repository) using Spring MVC, with Hibernate/JPA mapping six related entities — USER, DONOR, BLOOD_REQUEST, HOSPITAL, BLOOD_INVENTORY, and EMAIL_NOTIFICATION — onto a MySQL database. Donor matching </w:t>
-      </w:r>
-      <w:r>
-        <w:t>is driven by a blood group compatibility chart applied in the recipient-to-donor direction, and the design provides dedicated, hospital-scoped REST endpoints (/api/hospitals/{hospitalId}/...) for five partner hospitals so that each institution can integrat</w:t>
-      </w:r>
-      <w:r>
-        <w:t>e over its own data only. Role-based access control, validation on both the client and the server, database-stored images (BLOB/Base64), and SMTP notification with credentials supplied through environment variables complete the security and service design.</w:t>
-      </w:r>
-      <w:r>
-        <w:t xml:space="preserve"> The frontend is a fully responsive, framework-free HTML/CSS/JavaScript application that communicates with the backend exclusively through an AJAX/Fetch API facade mirroring the documented REST endpoints.</w:t>
+        <w:t>The system is designed around a strict N-Tier architecture (Controller → Service → Repository) using Spring MVC, with Hibernate/JPA mapping six related entities — USER, DONOR, BLOOD_REQUEST, HOSPITAL, BLOOD_INVENTORY, and EMAIL_NOTIFICATION — onto a MySQL database. Donor matching is driven by a blood group compatibility chart applied in the recipient-to-donor direction, and the design provides dedicated, hospital-scoped REST endpoints (/api/hospitals/{hospitalId}/...) for five partner hospitals so that each institution can integrate over its own data only. Role-based access control, validation on both the client and the server, database-stored images (BLOB/Base64), and SMTP notification with credentials supplied through environment variables complete the security and service design. The frontend is a fully responsive, framework-free HTML/CSS/JavaScript application that communicates with the backend exclusively through an AJAX/Fetch API facade mirroring the documented REST endpoints.</w:t>
       </w:r>
     </w:p>
     <w:p>
@@ -364,16 +306,7 @@
         <w:jc w:val="both"/>
       </w:pPr>
       <w:r>
-        <w:t>The completed frontend — 23 pages covering all four</w:t>
-      </w:r>
-      <w:r>
-        <w:t xml:space="preserve"> role portals, the public emergency flow, and every mandatory §2.1 capability of the assignment brief — was verified by 266 automated functional checks, a 92/92 responsive layout check across four viewport widths, and a 16/16 real-HTTP transport check agai</w:t>
-      </w:r>
-      <w:r>
-        <w:t xml:space="preserve">nst a REST stub, with server-side components scheduled for the implementation phase. The completed system demonstrates that a disciplined, well-structured Java web stack can deliver a secure and genuinely usable blood donor management platform tailored to </w:t>
-      </w:r>
-      <w:r>
-        <w:t>the Nepali context.</w:t>
+        <w:t>The completed frontend — 23 pages covering all four role portals, the public emergency flow, and every mandatory §2.1 capability of the assignment brief — was verified by 266 automated functional checks, a 92/92 responsive layout check across four viewport widths, and a 16/16 real-HTTP transport check against a REST stub, with server-side components scheduled for the implementation phase. The completed system demonstrates that a disciplined, well-structured Java web stack can deliver a secure and genuinely usable blood donor management platform tailored to the Nepali context.</w:t>
       </w:r>
     </w:p>
     <w:p>
@@ -397,7 +330,7 @@
       <w:pPr>
         <w:pStyle w:val="Heading1"/>
       </w:pPr>
-      <w:bookmarkStart w:id="3" w:name="_Toc240406081"/>
+      <w:bookmarkStart w:id="3" w:name="_Toc240543465"/>
       <w:r>
         <w:rPr>
           <w:sz w:val="28"/>
@@ -427,7 +360,7 @@
       <w:r>
         <w:fldChar w:fldCharType="separate"/>
       </w:r>
-      <w:hyperlink w:anchor="_Toc240406078" w:history="1">
+      <w:hyperlink w:anchor="_Toc240543462" w:history="1">
         <w:r>
           <w:rPr>
             <w:rStyle w:val="Hyperlink"/>
@@ -454,7 +387,7 @@
             <w:noProof/>
             <w:webHidden/>
           </w:rPr>
-          <w:instrText xml:space="preserve"> PAGEREF _Toc240406078 \h </w:instrText>
+          <w:instrText xml:space="preserve"> PAGEREF _Toc240543462 \h </w:instrText>
         </w:r>
         <w:r>
           <w:rPr>
@@ -496,7 +429,7 @@
           <w:noProof/>
         </w:rPr>
       </w:pPr>
-      <w:hyperlink w:anchor="_Toc240406079" w:history="1">
+      <w:hyperlink w:anchor="_Toc240543463" w:history="1">
         <w:r>
           <w:rPr>
             <w:rStyle w:val="Hyperlink"/>
@@ -523,7 +456,7 @@
             <w:noProof/>
             <w:webHidden/>
           </w:rPr>
-          <w:instrText xml:space="preserve"> PAGEREF _Toc240406079 \h </w:instrText>
+          <w:instrText xml:space="preserve"> PAGEREF _Toc240543463 \h </w:instrText>
         </w:r>
         <w:r>
           <w:rPr>
@@ -565,7 +498,7 @@
           <w:noProof/>
         </w:rPr>
       </w:pPr>
-      <w:hyperlink w:anchor="_Toc240406080" w:history="1">
+      <w:hyperlink w:anchor="_Toc240543464" w:history="1">
         <w:r>
           <w:rPr>
             <w:rStyle w:val="Hyperlink"/>
@@ -592,7 +525,7 @@
             <w:noProof/>
             <w:webHidden/>
           </w:rPr>
-          <w:instrText xml:space="preserve"> PAGEREF _Toc240406080 \h </w:instrText>
+          <w:instrText xml:space="preserve"> PAGEREF _Toc240543464 \h </w:instrText>
         </w:r>
         <w:r>
           <w:rPr>
@@ -634,7 +567,7 @@
           <w:noProof/>
         </w:rPr>
       </w:pPr>
-      <w:hyperlink w:anchor="_Toc240406081" w:history="1">
+      <w:hyperlink w:anchor="_Toc240543465" w:history="1">
         <w:r>
           <w:rPr>
             <w:rStyle w:val="Hyperlink"/>
@@ -661,7 +594,7 @@
             <w:noProof/>
             <w:webHidden/>
           </w:rPr>
-          <w:instrText xml:space="preserve"> PAGEREF _Toc240406081 \h </w:instrText>
+          <w:instrText xml:space="preserve"> PAGEREF _Toc240543465 \h </w:instrText>
         </w:r>
         <w:r>
           <w:rPr>
@@ -703,7 +636,7 @@
           <w:noProof/>
         </w:rPr>
       </w:pPr>
-      <w:hyperlink w:anchor="_Toc240406082" w:history="1">
+      <w:hyperlink w:anchor="_Toc240543466" w:history="1">
         <w:r>
           <w:rPr>
             <w:rStyle w:val="Hyperlink"/>
@@ -730,7 +663,7 @@
             <w:noProof/>
             <w:webHidden/>
           </w:rPr>
-          <w:instrText xml:space="preserve"> PAGEREF _Toc240406082 \h </w:instrText>
+          <w:instrText xml:space="preserve"> PAGEREF _Toc240543466 \h </w:instrText>
         </w:r>
         <w:r>
           <w:rPr>
@@ -772,7 +705,7 @@
           <w:noProof/>
         </w:rPr>
       </w:pPr>
-      <w:hyperlink w:anchor="_Toc240406083" w:history="1">
+      <w:hyperlink w:anchor="_Toc240543467" w:history="1">
         <w:r>
           <w:rPr>
             <w:rStyle w:val="Hyperlink"/>
@@ -799,7 +732,7 @@
             <w:noProof/>
             <w:webHidden/>
           </w:rPr>
-          <w:instrText xml:space="preserve"> PAGEREF _Toc240406083 \h </w:instrText>
+          <w:instrText xml:space="preserve"> PAGEREF _Toc240543467 \h </w:instrText>
         </w:r>
         <w:r>
           <w:rPr>
@@ -841,7 +774,7 @@
           <w:noProof/>
         </w:rPr>
       </w:pPr>
-      <w:hyperlink w:anchor="_Toc240406084" w:history="1">
+      <w:hyperlink w:anchor="_Toc240543468" w:history="1">
         <w:r>
           <w:rPr>
             <w:rStyle w:val="Hyperlink"/>
@@ -868,7 +801,7 @@
             <w:noProof/>
             <w:webHidden/>
           </w:rPr>
-          <w:instrText xml:space="preserve"> PAGEREF _Toc240406084 \h </w:instrText>
+          <w:instrText xml:space="preserve"> PAGEREF _Toc240543468 \h </w:instrText>
         </w:r>
         <w:r>
           <w:rPr>
@@ -910,7 +843,7 @@
           <w:noProof/>
         </w:rPr>
       </w:pPr>
-      <w:hyperlink w:anchor="_Toc240406085" w:history="1">
+      <w:hyperlink w:anchor="_Toc240543469" w:history="1">
         <w:r>
           <w:rPr>
             <w:rStyle w:val="Hyperlink"/>
@@ -937,7 +870,7 @@
             <w:noProof/>
             <w:webHidden/>
           </w:rPr>
-          <w:instrText xml:space="preserve"> PAGEREF _Toc240406085 \h </w:instrText>
+          <w:instrText xml:space="preserve"> PAGEREF _Toc240543469 \h </w:instrText>
         </w:r>
         <w:r>
           <w:rPr>
@@ -979,7 +912,7 @@
           <w:noProof/>
         </w:rPr>
       </w:pPr>
-      <w:hyperlink w:anchor="_Toc240406086" w:history="1">
+      <w:hyperlink w:anchor="_Toc240543470" w:history="1">
         <w:r>
           <w:rPr>
             <w:rStyle w:val="Hyperlink"/>
@@ -1006,7 +939,7 @@
             <w:noProof/>
             <w:webHidden/>
           </w:rPr>
-          <w:instrText xml:space="preserve"> PAGEREF _Toc240406086 \h </w:instrText>
+          <w:instrText xml:space="preserve"> PAGEREF _Toc240543470 \h </w:instrText>
         </w:r>
         <w:r>
           <w:rPr>
@@ -1048,7 +981,7 @@
           <w:noProof/>
         </w:rPr>
       </w:pPr>
-      <w:hyperlink w:anchor="_Toc240406087" w:history="1">
+      <w:hyperlink w:anchor="_Toc240543471" w:history="1">
         <w:r>
           <w:rPr>
             <w:rStyle w:val="Hyperlink"/>
@@ -1075,7 +1008,7 @@
             <w:noProof/>
             <w:webHidden/>
           </w:rPr>
-          <w:instrText xml:space="preserve"> PAGEREF _Toc240406087 \h </w:instrText>
+          <w:instrText xml:space="preserve"> PAGEREF _Toc240543471 \h </w:instrText>
         </w:r>
         <w:r>
           <w:rPr>
@@ -1117,7 +1050,7 @@
           <w:noProof/>
         </w:rPr>
       </w:pPr>
-      <w:hyperlink w:anchor="_Toc240406088" w:history="1">
+      <w:hyperlink w:anchor="_Toc240543472" w:history="1">
         <w:r>
           <w:rPr>
             <w:rStyle w:val="Hyperlink"/>
@@ -1144,7 +1077,7 @@
             <w:noProof/>
             <w:webHidden/>
           </w:rPr>
-          <w:instrText xml:space="preserve"> PAGEREF _Toc240406088 \h </w:instrText>
+          <w:instrText xml:space="preserve"> PAGEREF _Toc240543472 \h </w:instrText>
         </w:r>
         <w:r>
           <w:rPr>
@@ -1186,7 +1119,7 @@
           <w:noProof/>
         </w:rPr>
       </w:pPr>
-      <w:hyperlink w:anchor="_Toc240406089" w:history="1">
+      <w:hyperlink w:anchor="_Toc240543473" w:history="1">
         <w:r>
           <w:rPr>
             <w:rStyle w:val="Hyperlink"/>
@@ -1213,7 +1146,7 @@
             <w:noProof/>
             <w:webHidden/>
           </w:rPr>
-          <w:instrText xml:space="preserve"> PAGEREF _Toc240406089 \h </w:instrText>
+          <w:instrText xml:space="preserve"> PAGEREF _Toc240543473 \h </w:instrText>
         </w:r>
         <w:r>
           <w:rPr>
@@ -1255,7 +1188,7 @@
           <w:noProof/>
         </w:rPr>
       </w:pPr>
-      <w:hyperlink w:anchor="_Toc240406090" w:history="1">
+      <w:hyperlink w:anchor="_Toc240543474" w:history="1">
         <w:r>
           <w:rPr>
             <w:rStyle w:val="Hyperlink"/>
@@ -1282,7 +1215,7 @@
             <w:noProof/>
             <w:webHidden/>
           </w:rPr>
-          <w:instrText xml:space="preserve"> PAGEREF _Toc240406090 \h </w:instrText>
+          <w:instrText xml:space="preserve"> PAGEREF _Toc240543474 \h </w:instrText>
         </w:r>
         <w:r>
           <w:rPr>
@@ -1324,7 +1257,7 @@
           <w:noProof/>
         </w:rPr>
       </w:pPr>
-      <w:hyperlink w:anchor="_Toc240406091" w:history="1">
+      <w:hyperlink w:anchor="_Toc240543475" w:history="1">
         <w:r>
           <w:rPr>
             <w:rStyle w:val="Hyperlink"/>
@@ -1351,7 +1284,7 @@
             <w:noProof/>
             <w:webHidden/>
           </w:rPr>
-          <w:instrText xml:space="preserve"> PAGEREF _Toc240406091 \h </w:instrText>
+          <w:instrText xml:space="preserve"> PAGEREF _Toc240543475 \h </w:instrText>
         </w:r>
         <w:r>
           <w:rPr>
@@ -1393,7 +1326,7 @@
           <w:noProof/>
         </w:rPr>
       </w:pPr>
-      <w:hyperlink w:anchor="_Toc240406092" w:history="1">
+      <w:hyperlink w:anchor="_Toc240543476" w:history="1">
         <w:r>
           <w:rPr>
             <w:rStyle w:val="Hyperlink"/>
@@ -1420,7 +1353,7 @@
             <w:noProof/>
             <w:webHidden/>
           </w:rPr>
-          <w:instrText xml:space="preserve"> PAGEREF _Toc240406092 \h </w:instrText>
+          <w:instrText xml:space="preserve"> PAGEREF _Toc240543476 \h </w:instrText>
         </w:r>
         <w:r>
           <w:rPr>
@@ -1462,7 +1395,7 @@
           <w:noProof/>
         </w:rPr>
       </w:pPr>
-      <w:hyperlink w:anchor="_Toc240406093" w:history="1">
+      <w:hyperlink w:anchor="_Toc240543477" w:history="1">
         <w:r>
           <w:rPr>
             <w:rStyle w:val="Hyperlink"/>
@@ -1489,7 +1422,7 @@
             <w:noProof/>
             <w:webHidden/>
           </w:rPr>
-          <w:instrText xml:space="preserve"> PAGEREF _Toc240406093 \h </w:instrText>
+          <w:instrText xml:space="preserve"> PAGEREF _Toc240543477 \h </w:instrText>
         </w:r>
         <w:r>
           <w:rPr>
@@ -1531,7 +1464,7 @@
           <w:noProof/>
         </w:rPr>
       </w:pPr>
-      <w:hyperlink w:anchor="_Toc240406094" w:history="1">
+      <w:hyperlink w:anchor="_Toc240543478" w:history="1">
         <w:r>
           <w:rPr>
             <w:rStyle w:val="Hyperlink"/>
@@ -1558,7 +1491,7 @@
             <w:noProof/>
             <w:webHidden/>
           </w:rPr>
-          <w:instrText xml:space="preserve"> PAGEREF _Toc240406094 \h </w:instrText>
+          <w:instrText xml:space="preserve"> PAGEREF _Toc240543478 \h </w:instrText>
         </w:r>
         <w:r>
           <w:rPr>
@@ -1600,7 +1533,7 @@
           <w:noProof/>
         </w:rPr>
       </w:pPr>
-      <w:hyperlink w:anchor="_Toc240406095" w:history="1">
+      <w:hyperlink w:anchor="_Toc240543479" w:history="1">
         <w:r>
           <w:rPr>
             <w:rStyle w:val="Hyperlink"/>
@@ -1627,7 +1560,7 @@
             <w:noProof/>
             <w:webHidden/>
           </w:rPr>
-          <w:instrText xml:space="preserve"> PAGEREF _Toc240406095 \h </w:instrText>
+          <w:instrText xml:space="preserve"> PAGEREF _Toc240543479 \h </w:instrText>
         </w:r>
         <w:r>
           <w:rPr>
@@ -1669,7 +1602,7 @@
           <w:noProof/>
         </w:rPr>
       </w:pPr>
-      <w:hyperlink w:anchor="_Toc240406096" w:history="1">
+      <w:hyperlink w:anchor="_Toc240543480" w:history="1">
         <w:r>
           <w:rPr>
             <w:rStyle w:val="Hyperlink"/>
@@ -1696,7 +1629,7 @@
             <w:noProof/>
             <w:webHidden/>
           </w:rPr>
-          <w:instrText xml:space="preserve"> PAGEREF _Toc240406096 \h </w:instrText>
+          <w:instrText xml:space="preserve"> PAGEREF _Toc240543480 \h </w:instrText>
         </w:r>
         <w:r>
           <w:rPr>
@@ -1738,7 +1671,7 @@
           <w:noProof/>
         </w:rPr>
       </w:pPr>
-      <w:hyperlink w:anchor="_Toc240406097" w:history="1">
+      <w:hyperlink w:anchor="_Toc240543481" w:history="1">
         <w:r>
           <w:rPr>
             <w:rStyle w:val="Hyperlink"/>
@@ -1765,7 +1698,7 @@
             <w:noProof/>
             <w:webHidden/>
           </w:rPr>
-          <w:instrText xml:space="preserve"> PAGEREF _Toc240406097 \h </w:instrText>
+          <w:instrText xml:space="preserve"> PAGEREF _Toc240543481 \h </w:instrText>
         </w:r>
         <w:r>
           <w:rPr>
@@ -1807,7 +1740,7 @@
           <w:noProof/>
         </w:rPr>
       </w:pPr>
-      <w:hyperlink w:anchor="_Toc240406098" w:history="1">
+      <w:hyperlink w:anchor="_Toc240543482" w:history="1">
         <w:r>
           <w:rPr>
             <w:rStyle w:val="Hyperlink"/>
@@ -1834,7 +1767,7 @@
             <w:noProof/>
             <w:webHidden/>
           </w:rPr>
-          <w:instrText xml:space="preserve"> PAGEREF _Toc240406098 \h </w:instrText>
+          <w:instrText xml:space="preserve"> PAGEREF _Toc240543482 \h </w:instrText>
         </w:r>
         <w:r>
           <w:rPr>
@@ -1876,7 +1809,7 @@
           <w:noProof/>
         </w:rPr>
       </w:pPr>
-      <w:hyperlink w:anchor="_Toc240406099" w:history="1">
+      <w:hyperlink w:anchor="_Toc240543483" w:history="1">
         <w:r>
           <w:rPr>
             <w:rStyle w:val="Hyperlink"/>
@@ -1903,7 +1836,7 @@
             <w:noProof/>
             <w:webHidden/>
           </w:rPr>
-          <w:instrText xml:space="preserve"> PAGEREF _Toc240406099 \h </w:instrText>
+          <w:instrText xml:space="preserve"> PAGEREF _Toc240543483 \h </w:instrText>
         </w:r>
         <w:r>
           <w:rPr>
@@ -1945,7 +1878,7 @@
           <w:noProof/>
         </w:rPr>
       </w:pPr>
-      <w:hyperlink w:anchor="_Toc240406100" w:history="1">
+      <w:hyperlink w:anchor="_Toc240543484" w:history="1">
         <w:r>
           <w:rPr>
             <w:rStyle w:val="Hyperlink"/>
@@ -1972,7 +1905,7 @@
             <w:noProof/>
             <w:webHidden/>
           </w:rPr>
-          <w:instrText xml:space="preserve"> PAGEREF _Toc240406100 \h </w:instrText>
+          <w:instrText xml:space="preserve"> PAGEREF _Toc240543484 \h </w:instrText>
         </w:r>
         <w:r>
           <w:rPr>
@@ -2014,7 +1947,7 @@
           <w:noProof/>
         </w:rPr>
       </w:pPr>
-      <w:hyperlink w:anchor="_Toc240406101" w:history="1">
+      <w:hyperlink w:anchor="_Toc240543485" w:history="1">
         <w:r>
           <w:rPr>
             <w:rStyle w:val="Hyperlink"/>
@@ -2041,7 +1974,7 @@
             <w:noProof/>
             <w:webHidden/>
           </w:rPr>
-          <w:instrText xml:space="preserve"> PAGEREF _Toc240406101 \h </w:instrText>
+          <w:instrText xml:space="preserve"> PAGEREF _Toc240543485 \h </w:instrText>
         </w:r>
         <w:r>
           <w:rPr>
@@ -2083,7 +2016,7 @@
           <w:noProof/>
         </w:rPr>
       </w:pPr>
-      <w:hyperlink w:anchor="_Toc240406102" w:history="1">
+      <w:hyperlink w:anchor="_Toc240543486" w:history="1">
         <w:r>
           <w:rPr>
             <w:rStyle w:val="Hyperlink"/>
@@ -2110,7 +2043,7 @@
             <w:noProof/>
             <w:webHidden/>
           </w:rPr>
-          <w:instrText xml:space="preserve"> PAGEREF _Toc240406102 \h </w:instrText>
+          <w:instrText xml:space="preserve"> PAGEREF _Toc240543486 \h </w:instrText>
         </w:r>
         <w:r>
           <w:rPr>
@@ -2152,7 +2085,7 @@
           <w:noProof/>
         </w:rPr>
       </w:pPr>
-      <w:hyperlink w:anchor="_Toc240406103" w:history="1">
+      <w:hyperlink w:anchor="_Toc240543487" w:history="1">
         <w:r>
           <w:rPr>
             <w:rStyle w:val="Hyperlink"/>
@@ -2179,7 +2112,7 @@
             <w:noProof/>
             <w:webHidden/>
           </w:rPr>
-          <w:instrText xml:space="preserve"> PAGEREF _Toc240406103 \h </w:instrText>
+          <w:instrText xml:space="preserve"> PAGEREF _Toc240543487 \h </w:instrText>
         </w:r>
         <w:r>
           <w:rPr>
@@ -2221,7 +2154,7 @@
           <w:noProof/>
         </w:rPr>
       </w:pPr>
-      <w:hyperlink w:anchor="_Toc240406104" w:history="1">
+      <w:hyperlink w:anchor="_Toc240543488" w:history="1">
         <w:r>
           <w:rPr>
             <w:rStyle w:val="Hyperlink"/>
@@ -2248,7 +2181,7 @@
             <w:noProof/>
             <w:webHidden/>
           </w:rPr>
-          <w:instrText xml:space="preserve"> PAGEREF _Toc240406104 \h </w:instrText>
+          <w:instrText xml:space="preserve"> PAGEREF _Toc240543488 \h </w:instrText>
         </w:r>
         <w:r>
           <w:rPr>
@@ -2290,7 +2223,7 @@
           <w:noProof/>
         </w:rPr>
       </w:pPr>
-      <w:hyperlink w:anchor="_Toc240406105" w:history="1">
+      <w:hyperlink w:anchor="_Toc240543489" w:history="1">
         <w:r>
           <w:rPr>
             <w:rStyle w:val="Hyperlink"/>
@@ -2317,7 +2250,7 @@
             <w:noProof/>
             <w:webHidden/>
           </w:rPr>
-          <w:instrText xml:space="preserve"> PAGEREF _Toc240406105 \h </w:instrText>
+          <w:instrText xml:space="preserve"> PAGEREF _Toc240543489 \h </w:instrText>
         </w:r>
         <w:r>
           <w:rPr>
@@ -2359,7 +2292,7 @@
           <w:noProof/>
         </w:rPr>
       </w:pPr>
-      <w:hyperlink w:anchor="_Toc240406106" w:history="1">
+      <w:hyperlink w:anchor="_Toc240543490" w:history="1">
         <w:r>
           <w:rPr>
             <w:rStyle w:val="Hyperlink"/>
@@ -2386,7 +2319,7 @@
             <w:noProof/>
             <w:webHidden/>
           </w:rPr>
-          <w:instrText xml:space="preserve"> PAGEREF _Toc240406106 \h </w:instrText>
+          <w:instrText xml:space="preserve"> PAGEREF _Toc240543490 \h </w:instrText>
         </w:r>
         <w:r>
           <w:rPr>
@@ -2428,7 +2361,7 @@
           <w:noProof/>
         </w:rPr>
       </w:pPr>
-      <w:hyperlink w:anchor="_Toc240406107" w:history="1">
+      <w:hyperlink w:anchor="_Toc240543491" w:history="1">
         <w:r>
           <w:rPr>
             <w:rStyle w:val="Hyperlink"/>
@@ -2455,7 +2388,7 @@
             <w:noProof/>
             <w:webHidden/>
           </w:rPr>
-          <w:instrText xml:space="preserve"> PAGEREF _Toc240406107 \h </w:instrText>
+          <w:instrText xml:space="preserve"> PAGEREF _Toc240543491 \h </w:instrText>
         </w:r>
         <w:r>
           <w:rPr>
@@ -2497,7 +2430,7 @@
           <w:noProof/>
         </w:rPr>
       </w:pPr>
-      <w:hyperlink w:anchor="_Toc240406108" w:history="1">
+      <w:hyperlink w:anchor="_Toc240543492" w:history="1">
         <w:r>
           <w:rPr>
             <w:rStyle w:val="Hyperlink"/>
@@ -2524,7 +2457,7 @@
             <w:noProof/>
             <w:webHidden/>
           </w:rPr>
-          <w:instrText xml:space="preserve"> PAGEREF _Toc240406108 \h </w:instrText>
+          <w:instrText xml:space="preserve"> PAGEREF _Toc240543492 \h </w:instrText>
         </w:r>
         <w:r>
           <w:rPr>
@@ -2566,7 +2499,7 @@
           <w:noProof/>
         </w:rPr>
       </w:pPr>
-      <w:hyperlink w:anchor="_Toc240406109" w:history="1">
+      <w:hyperlink w:anchor="_Toc240543493" w:history="1">
         <w:r>
           <w:rPr>
             <w:rStyle w:val="Hyperlink"/>
@@ -2593,7 +2526,7 @@
             <w:noProof/>
             <w:webHidden/>
           </w:rPr>
-          <w:instrText xml:space="preserve"> PAGEREF _Toc240406109 \h </w:instrText>
+          <w:instrText xml:space="preserve"> PAGEREF _Toc240543493 \h </w:instrText>
         </w:r>
         <w:r>
           <w:rPr>
@@ -2635,7 +2568,7 @@
           <w:noProof/>
         </w:rPr>
       </w:pPr>
-      <w:hyperlink w:anchor="_Toc240406110" w:history="1">
+      <w:hyperlink w:anchor="_Toc240543494" w:history="1">
         <w:r>
           <w:rPr>
             <w:rStyle w:val="Hyperlink"/>
@@ -2662,7 +2595,7 @@
             <w:noProof/>
             <w:webHidden/>
           </w:rPr>
-          <w:instrText xml:space="preserve"> PAGEREF _Toc240406110 \h </w:instrText>
+          <w:instrText xml:space="preserve"> PAGEREF _Toc240543494 \h </w:instrText>
         </w:r>
         <w:r>
           <w:rPr>
@@ -2704,7 +2637,7 @@
           <w:noProof/>
         </w:rPr>
       </w:pPr>
-      <w:hyperlink w:anchor="_Toc240406111" w:history="1">
+      <w:hyperlink w:anchor="_Toc240543495" w:history="1">
         <w:r>
           <w:rPr>
             <w:rStyle w:val="Hyperlink"/>
@@ -2731,7 +2664,7 @@
             <w:noProof/>
             <w:webHidden/>
           </w:rPr>
-          <w:instrText xml:space="preserve"> PAGEREF _Toc240406111 \h </w:instrText>
+          <w:instrText xml:space="preserve"> PAGEREF _Toc240543495 \h </w:instrText>
         </w:r>
         <w:r>
           <w:rPr>
@@ -2773,7 +2706,7 @@
           <w:noProof/>
         </w:rPr>
       </w:pPr>
-      <w:hyperlink w:anchor="_Toc240406112" w:history="1">
+      <w:hyperlink w:anchor="_Toc240543496" w:history="1">
         <w:r>
           <w:rPr>
             <w:rStyle w:val="Hyperlink"/>
@@ -2800,7 +2733,7 @@
             <w:noProof/>
             <w:webHidden/>
           </w:rPr>
-          <w:instrText xml:space="preserve"> PAGEREF _Toc240406112 \h </w:instrText>
+          <w:instrText xml:space="preserve"> PAGEREF _Toc240543496 \h </w:instrText>
         </w:r>
         <w:r>
           <w:rPr>
@@ -2842,7 +2775,7 @@
           <w:noProof/>
         </w:rPr>
       </w:pPr>
-      <w:hyperlink w:anchor="_Toc240406113" w:history="1">
+      <w:hyperlink w:anchor="_Toc240543497" w:history="1">
         <w:r>
           <w:rPr>
             <w:rStyle w:val="Hyperlink"/>
@@ -2869,7 +2802,7 @@
             <w:noProof/>
             <w:webHidden/>
           </w:rPr>
-          <w:instrText xml:space="preserve"> PAGEREF _Toc240406113 \h </w:instrText>
+          <w:instrText xml:space="preserve"> PAGEREF _Toc240543497 \h </w:instrText>
         </w:r>
         <w:r>
           <w:rPr>
@@ -2911,7 +2844,7 @@
           <w:noProof/>
         </w:rPr>
       </w:pPr>
-      <w:hyperlink w:anchor="_Toc240406114" w:history="1">
+      <w:hyperlink w:anchor="_Toc240543498" w:history="1">
         <w:r>
           <w:rPr>
             <w:rStyle w:val="Hyperlink"/>
@@ -2938,7 +2871,7 @@
             <w:noProof/>
             <w:webHidden/>
           </w:rPr>
-          <w:instrText xml:space="preserve"> PAGEREF _Toc240406114 \h </w:instrText>
+          <w:instrText xml:space="preserve"> PAGEREF _Toc240543498 \h </w:instrText>
         </w:r>
         <w:r>
           <w:rPr>
@@ -2958,7 +2891,7 @@
             <w:noProof/>
             <w:webHidden/>
           </w:rPr>
-          <w:t>22</w:t>
+          <w:t>21</w:t>
         </w:r>
         <w:r>
           <w:rPr>
@@ -2980,7 +2913,7 @@
           <w:noProof/>
         </w:rPr>
       </w:pPr>
-      <w:hyperlink w:anchor="_Toc240406115" w:history="1">
+      <w:hyperlink w:anchor="_Toc240543499" w:history="1">
         <w:r>
           <w:rPr>
             <w:rStyle w:val="Hyperlink"/>
@@ -3007,7 +2940,7 @@
             <w:noProof/>
             <w:webHidden/>
           </w:rPr>
-          <w:instrText xml:space="preserve"> PAGEREF _Toc240406115 \h </w:instrText>
+          <w:instrText xml:space="preserve"> PAGEREF _Toc240543499 \h </w:instrText>
         </w:r>
         <w:r>
           <w:rPr>
@@ -3049,7 +2982,7 @@
           <w:noProof/>
         </w:rPr>
       </w:pPr>
-      <w:hyperlink w:anchor="_Toc240406116" w:history="1">
+      <w:hyperlink w:anchor="_Toc240543500" w:history="1">
         <w:r>
           <w:rPr>
             <w:rStyle w:val="Hyperlink"/>
@@ -3076,7 +3009,7 @@
             <w:noProof/>
             <w:webHidden/>
           </w:rPr>
-          <w:instrText xml:space="preserve"> PAGEREF _Toc240406116 \h </w:instrText>
+          <w:instrText xml:space="preserve"> PAGEREF _Toc240543500 \h </w:instrText>
         </w:r>
         <w:r>
           <w:rPr>
@@ -3118,7 +3051,7 @@
           <w:noProof/>
         </w:rPr>
       </w:pPr>
-      <w:hyperlink w:anchor="_Toc240406117" w:history="1">
+      <w:hyperlink w:anchor="_Toc240543501" w:history="1">
         <w:r>
           <w:rPr>
             <w:rStyle w:val="Hyperlink"/>
@@ -3145,7 +3078,7 @@
             <w:noProof/>
             <w:webHidden/>
           </w:rPr>
-          <w:instrText xml:space="preserve"> PAGEREF _Toc240406117 \h </w:instrText>
+          <w:instrText xml:space="preserve"> PAGEREF _Toc240543501 \h </w:instrText>
         </w:r>
         <w:r>
           <w:rPr>
@@ -3187,7 +3120,7 @@
           <w:noProof/>
         </w:rPr>
       </w:pPr>
-      <w:hyperlink w:anchor="_Toc240406118" w:history="1">
+      <w:hyperlink w:anchor="_Toc240543502" w:history="1">
         <w:r>
           <w:rPr>
             <w:rStyle w:val="Hyperlink"/>
@@ -3214,7 +3147,7 @@
             <w:noProof/>
             <w:webHidden/>
           </w:rPr>
-          <w:instrText xml:space="preserve"> PAGEREF _Toc240406118 \h </w:instrText>
+          <w:instrText xml:space="preserve"> PAGEREF _Toc240543502 \h </w:instrText>
         </w:r>
         <w:r>
           <w:rPr>
@@ -3256,7 +3189,7 @@
           <w:noProof/>
         </w:rPr>
       </w:pPr>
-      <w:hyperlink w:anchor="_Toc240406119" w:history="1">
+      <w:hyperlink w:anchor="_Toc240543503" w:history="1">
         <w:r>
           <w:rPr>
             <w:rStyle w:val="Hyperlink"/>
@@ -3283,7 +3216,7 @@
             <w:noProof/>
             <w:webHidden/>
           </w:rPr>
-          <w:instrText xml:space="preserve"> PAGEREF _Toc240406119 \h </w:instrText>
+          <w:instrText xml:space="preserve"> PAGEREF _Toc240543503 \h </w:instrText>
         </w:r>
         <w:r>
           <w:rPr>
@@ -3325,7 +3258,7 @@
           <w:noProof/>
         </w:rPr>
       </w:pPr>
-      <w:hyperlink w:anchor="_Toc240406120" w:history="1">
+      <w:hyperlink w:anchor="_Toc240543504" w:history="1">
         <w:r>
           <w:rPr>
             <w:rStyle w:val="Hyperlink"/>
@@ -3352,7 +3285,7 @@
             <w:noProof/>
             <w:webHidden/>
           </w:rPr>
-          <w:instrText xml:space="preserve"> PAGEREF _Toc240406120 \h </w:instrText>
+          <w:instrText xml:space="preserve"> PAGEREF _Toc240543504 \h </w:instrText>
         </w:r>
         <w:r>
           <w:rPr>
@@ -3394,7 +3327,7 @@
           <w:noProof/>
         </w:rPr>
       </w:pPr>
-      <w:hyperlink w:anchor="_Toc240406121" w:history="1">
+      <w:hyperlink w:anchor="_Toc240543505" w:history="1">
         <w:r>
           <w:rPr>
             <w:rStyle w:val="Hyperlink"/>
@@ -3421,7 +3354,7 @@
             <w:noProof/>
             <w:webHidden/>
           </w:rPr>
-          <w:instrText xml:space="preserve"> PAGEREF _Toc240406121 \h </w:instrText>
+          <w:instrText xml:space="preserve"> PAGEREF _Toc240543505 \h </w:instrText>
         </w:r>
         <w:r>
           <w:rPr>
@@ -3463,7 +3396,7 @@
           <w:noProof/>
         </w:rPr>
       </w:pPr>
-      <w:hyperlink w:anchor="_Toc240406122" w:history="1">
+      <w:hyperlink w:anchor="_Toc240543506" w:history="1">
         <w:r>
           <w:rPr>
             <w:rStyle w:val="Hyperlink"/>
@@ -3490,7 +3423,7 @@
             <w:noProof/>
             <w:webHidden/>
           </w:rPr>
-          <w:instrText xml:space="preserve"> PAGEREF _Toc240406122 \h </w:instrText>
+          <w:instrText xml:space="preserve"> PAGEREF _Toc240543506 \h </w:instrText>
         </w:r>
         <w:r>
           <w:rPr>
@@ -3532,7 +3465,7 @@
           <w:noProof/>
         </w:rPr>
       </w:pPr>
-      <w:hyperlink w:anchor="_Toc240406123" w:history="1">
+      <w:hyperlink w:anchor="_Toc240543507" w:history="1">
         <w:r>
           <w:rPr>
             <w:rStyle w:val="Hyperlink"/>
@@ -3559,7 +3492,7 @@
             <w:noProof/>
             <w:webHidden/>
           </w:rPr>
-          <w:instrText xml:space="preserve"> PAGEREF _Toc240406123 \h </w:instrText>
+          <w:instrText xml:space="preserve"> PAGEREF _Toc240543507 \h </w:instrText>
         </w:r>
         <w:r>
           <w:rPr>
@@ -3601,7 +3534,7 @@
           <w:noProof/>
         </w:rPr>
       </w:pPr>
-      <w:hyperlink w:anchor="_Toc240406124" w:history="1">
+      <w:hyperlink w:anchor="_Toc240543508" w:history="1">
         <w:r>
           <w:rPr>
             <w:rStyle w:val="Hyperlink"/>
@@ -3628,7 +3561,7 @@
             <w:noProof/>
             <w:webHidden/>
           </w:rPr>
-          <w:instrText xml:space="preserve"> PAGEREF _Toc240406124 \h </w:instrText>
+          <w:instrText xml:space="preserve"> PAGEREF _Toc240543508 \h </w:instrText>
         </w:r>
         <w:r>
           <w:rPr>
@@ -3670,7 +3603,7 @@
           <w:noProof/>
         </w:rPr>
       </w:pPr>
-      <w:hyperlink w:anchor="_Toc240406125" w:history="1">
+      <w:hyperlink w:anchor="_Toc240543509" w:history="1">
         <w:r>
           <w:rPr>
             <w:rStyle w:val="Hyperlink"/>
@@ -3697,7 +3630,7 @@
             <w:noProof/>
             <w:webHidden/>
           </w:rPr>
-          <w:instrText xml:space="preserve"> PAGEREF _Toc240406125 \h </w:instrText>
+          <w:instrText xml:space="preserve"> PAGEREF _Toc240543509 \h </w:instrText>
         </w:r>
         <w:r>
           <w:rPr>
@@ -3739,7 +3672,7 @@
           <w:noProof/>
         </w:rPr>
       </w:pPr>
-      <w:hyperlink w:anchor="_Toc240406126" w:history="1">
+      <w:hyperlink w:anchor="_Toc240543510" w:history="1">
         <w:r>
           <w:rPr>
             <w:rStyle w:val="Hyperlink"/>
@@ -3766,7 +3699,7 @@
             <w:noProof/>
             <w:webHidden/>
           </w:rPr>
-          <w:instrText xml:space="preserve"> PAGEREF _Toc240406126 \h </w:instrText>
+          <w:instrText xml:space="preserve"> PAGEREF _Toc240543510 \h </w:instrText>
         </w:r>
         <w:r>
           <w:rPr>
@@ -3808,7 +3741,7 @@
           <w:noProof/>
         </w:rPr>
       </w:pPr>
-      <w:hyperlink w:anchor="_Toc240406127" w:history="1">
+      <w:hyperlink w:anchor="_Toc240543511" w:history="1">
         <w:r>
           <w:rPr>
             <w:rStyle w:val="Hyperlink"/>
@@ -3835,7 +3768,7 @@
             <w:noProof/>
             <w:webHidden/>
           </w:rPr>
-          <w:instrText xml:space="preserve"> PAGEREF _Toc240406127 \h </w:instrText>
+          <w:instrText xml:space="preserve"> PAGEREF _Toc240543511 \h </w:instrText>
         </w:r>
         <w:r>
           <w:rPr>
@@ -3877,7 +3810,7 @@
           <w:noProof/>
         </w:rPr>
       </w:pPr>
-      <w:hyperlink w:anchor="_Toc240406128" w:history="1">
+      <w:hyperlink w:anchor="_Toc240543512" w:history="1">
         <w:r>
           <w:rPr>
             <w:rStyle w:val="Hyperlink"/>
@@ -3904,7 +3837,7 @@
             <w:noProof/>
             <w:webHidden/>
           </w:rPr>
-          <w:instrText xml:space="preserve"> PAGEREF _Toc240406128 \h </w:instrText>
+          <w:instrText xml:space="preserve"> PAGEREF _Toc240543512 \h </w:instrText>
         </w:r>
         <w:r>
           <w:rPr>
@@ -3946,7 +3879,7 @@
           <w:noProof/>
         </w:rPr>
       </w:pPr>
-      <w:hyperlink w:anchor="_Toc240406129" w:history="1">
+      <w:hyperlink w:anchor="_Toc240543513" w:history="1">
         <w:r>
           <w:rPr>
             <w:rStyle w:val="Hyperlink"/>
@@ -3973,7 +3906,7 @@
             <w:noProof/>
             <w:webHidden/>
           </w:rPr>
-          <w:instrText xml:space="preserve"> PAGEREF _Toc240406129 \h </w:instrText>
+          <w:instrText xml:space="preserve"> PAGEREF _Toc240543513 \h </w:instrText>
         </w:r>
         <w:r>
           <w:rPr>
@@ -4015,7 +3948,7 @@
           <w:noProof/>
         </w:rPr>
       </w:pPr>
-      <w:hyperlink w:anchor="_Toc240406130" w:history="1">
+      <w:hyperlink w:anchor="_Toc240543514" w:history="1">
         <w:r>
           <w:rPr>
             <w:rStyle w:val="Hyperlink"/>
@@ -4042,7 +3975,7 @@
             <w:noProof/>
             <w:webHidden/>
           </w:rPr>
-          <w:instrText xml:space="preserve"> PAGEREF _Toc240406130 \h </w:instrText>
+          <w:instrText xml:space="preserve"> PAGEREF _Toc240543514 \h </w:instrText>
         </w:r>
         <w:r>
           <w:rPr>
@@ -4062,7 +3995,7 @@
             <w:noProof/>
             <w:webHidden/>
           </w:rPr>
-          <w:t>30</w:t>
+          <w:t>29</w:t>
         </w:r>
         <w:r>
           <w:rPr>
@@ -4084,7 +4017,7 @@
           <w:noProof/>
         </w:rPr>
       </w:pPr>
-      <w:hyperlink w:anchor="_Toc240406131" w:history="1">
+      <w:hyperlink w:anchor="_Toc240543515" w:history="1">
         <w:r>
           <w:rPr>
             <w:rStyle w:val="Hyperlink"/>
@@ -4111,7 +4044,7 @@
             <w:noProof/>
             <w:webHidden/>
           </w:rPr>
-          <w:instrText xml:space="preserve"> PAGEREF _Toc240406131 \h </w:instrText>
+          <w:instrText xml:space="preserve"> PAGEREF _Toc240543515 \h </w:instrText>
         </w:r>
         <w:r>
           <w:rPr>
@@ -4153,7 +4086,7 @@
           <w:noProof/>
         </w:rPr>
       </w:pPr>
-      <w:hyperlink w:anchor="_Toc240406132" w:history="1">
+      <w:hyperlink w:anchor="_Toc240543516" w:history="1">
         <w:r>
           <w:rPr>
             <w:rStyle w:val="Hyperlink"/>
@@ -4180,7 +4113,7 @@
             <w:noProof/>
             <w:webHidden/>
           </w:rPr>
-          <w:instrText xml:space="preserve"> PAGEREF _Toc240406132 \h </w:instrText>
+          <w:instrText xml:space="preserve"> PAGEREF _Toc240543516 \h </w:instrText>
         </w:r>
         <w:r>
           <w:rPr>
@@ -4200,7 +4133,7 @@
             <w:noProof/>
             <w:webHidden/>
           </w:rPr>
-          <w:t>31</w:t>
+          <w:t>30</w:t>
         </w:r>
         <w:r>
           <w:rPr>
@@ -4222,7 +4155,7 @@
           <w:noProof/>
         </w:rPr>
       </w:pPr>
-      <w:hyperlink w:anchor="_Toc240406133" w:history="1">
+      <w:hyperlink w:anchor="_Toc240543517" w:history="1">
         <w:r>
           <w:rPr>
             <w:rStyle w:val="Hyperlink"/>
@@ -4249,7 +4182,7 @@
             <w:noProof/>
             <w:webHidden/>
           </w:rPr>
-          <w:instrText xml:space="preserve"> PAGEREF _Toc240406133 \h </w:instrText>
+          <w:instrText xml:space="preserve"> PAGEREF _Toc240543517 \h </w:instrText>
         </w:r>
         <w:r>
           <w:rPr>
@@ -4291,7 +4224,7 @@
           <w:noProof/>
         </w:rPr>
       </w:pPr>
-      <w:hyperlink w:anchor="_Toc240406134" w:history="1">
+      <w:hyperlink w:anchor="_Toc240543518" w:history="1">
         <w:r>
           <w:rPr>
             <w:rStyle w:val="Hyperlink"/>
@@ -4318,7 +4251,7 @@
             <w:noProof/>
             <w:webHidden/>
           </w:rPr>
-          <w:instrText xml:space="preserve"> PAGEREF _Toc240406134 \h </w:instrText>
+          <w:instrText xml:space="preserve"> PAGEREF _Toc240543518 \h </w:instrText>
         </w:r>
         <w:r>
           <w:rPr>
@@ -4360,7 +4293,7 @@
           <w:noProof/>
         </w:rPr>
       </w:pPr>
-      <w:hyperlink w:anchor="_Toc240406135" w:history="1">
+      <w:hyperlink w:anchor="_Toc240543519" w:history="1">
         <w:r>
           <w:rPr>
             <w:rStyle w:val="Hyperlink"/>
@@ -4387,7 +4320,7 @@
             <w:noProof/>
             <w:webHidden/>
           </w:rPr>
-          <w:instrText xml:space="preserve"> PAGEREF _Toc240406135 \h </w:instrText>
+          <w:instrText xml:space="preserve"> PAGEREF _Toc240543519 \h </w:instrText>
         </w:r>
         <w:r>
           <w:rPr>
@@ -4429,7 +4362,7 @@
           <w:noProof/>
         </w:rPr>
       </w:pPr>
-      <w:hyperlink w:anchor="_Toc240406136" w:history="1">
+      <w:hyperlink w:anchor="_Toc240543520" w:history="1">
         <w:r>
           <w:rPr>
             <w:rStyle w:val="Hyperlink"/>
@@ -4456,7 +4389,7 @@
             <w:noProof/>
             <w:webHidden/>
           </w:rPr>
-          <w:instrText xml:space="preserve"> PAGEREF _Toc240406136 \h </w:instrText>
+          <w:instrText xml:space="preserve"> PAGEREF _Toc240543520 \h </w:instrText>
         </w:r>
         <w:r>
           <w:rPr>
@@ -4498,7 +4431,7 @@
           <w:noProof/>
         </w:rPr>
       </w:pPr>
-      <w:hyperlink w:anchor="_Toc240406137" w:history="1">
+      <w:hyperlink w:anchor="_Toc240543521" w:history="1">
         <w:r>
           <w:rPr>
             <w:rStyle w:val="Hyperlink"/>
@@ -4525,7 +4458,7 @@
             <w:noProof/>
             <w:webHidden/>
           </w:rPr>
-          <w:instrText xml:space="preserve"> PAGEREF _Toc240406137 \h </w:instrText>
+          <w:instrText xml:space="preserve"> PAGEREF _Toc240543521 \h </w:instrText>
         </w:r>
         <w:r>
           <w:rPr>
@@ -4567,7 +4500,7 @@
           <w:noProof/>
         </w:rPr>
       </w:pPr>
-      <w:hyperlink w:anchor="_Toc240406138" w:history="1">
+      <w:hyperlink w:anchor="_Toc240543522" w:history="1">
         <w:r>
           <w:rPr>
             <w:rStyle w:val="Hyperlink"/>
@@ -4594,7 +4527,7 @@
             <w:noProof/>
             <w:webHidden/>
           </w:rPr>
-          <w:instrText xml:space="preserve"> PAGEREF _Toc240406138 \h </w:instrText>
+          <w:instrText xml:space="preserve"> PAGEREF _Toc240543522 \h </w:instrText>
         </w:r>
         <w:r>
           <w:rPr>
@@ -4636,7 +4569,7 @@
           <w:noProof/>
         </w:rPr>
       </w:pPr>
-      <w:hyperlink w:anchor="_Toc240406139" w:history="1">
+      <w:hyperlink w:anchor="_Toc240543523" w:history="1">
         <w:r>
           <w:rPr>
             <w:rStyle w:val="Hyperlink"/>
@@ -4663,7 +4596,7 @@
             <w:noProof/>
             <w:webHidden/>
           </w:rPr>
-          <w:instrText xml:space="preserve"> PAGEREF _Toc240406139 \h </w:instrText>
+          <w:instrText xml:space="preserve"> PAGEREF _Toc240543523 \h </w:instrText>
         </w:r>
         <w:r>
           <w:rPr>
@@ -4705,7 +4638,7 @@
           <w:noProof/>
         </w:rPr>
       </w:pPr>
-      <w:hyperlink w:anchor="_Toc240406140" w:history="1">
+      <w:hyperlink w:anchor="_Toc240543524" w:history="1">
         <w:r>
           <w:rPr>
             <w:rStyle w:val="Hyperlink"/>
@@ -4732,7 +4665,7 @@
             <w:noProof/>
             <w:webHidden/>
           </w:rPr>
-          <w:instrText xml:space="preserve"> PAGEREF _Toc240406140 \h </w:instrText>
+          <w:instrText xml:space="preserve"> PAGEREF _Toc240543524 \h </w:instrText>
         </w:r>
         <w:r>
           <w:rPr>
@@ -4774,7 +4707,7 @@
           <w:noProof/>
         </w:rPr>
       </w:pPr>
-      <w:hyperlink w:anchor="_Toc240406141" w:history="1">
+      <w:hyperlink w:anchor="_Toc240543525" w:history="1">
         <w:r>
           <w:rPr>
             <w:rStyle w:val="Hyperlink"/>
@@ -4801,7 +4734,7 @@
             <w:noProof/>
             <w:webHidden/>
           </w:rPr>
-          <w:instrText xml:space="preserve"> PAGEREF _Toc240406141 \h </w:instrText>
+          <w:instrText xml:space="preserve"> PAGEREF _Toc240543525 \h </w:instrText>
         </w:r>
         <w:r>
           <w:rPr>
@@ -4843,7 +4776,7 @@
           <w:noProof/>
         </w:rPr>
       </w:pPr>
-      <w:hyperlink w:anchor="_Toc240406142" w:history="1">
+      <w:hyperlink w:anchor="_Toc240543526" w:history="1">
         <w:r>
           <w:rPr>
             <w:rStyle w:val="Hyperlink"/>
@@ -4870,7 +4803,7 @@
             <w:noProof/>
             <w:webHidden/>
           </w:rPr>
-          <w:instrText xml:space="preserve"> PAGEREF _Toc240406142 \h </w:instrText>
+          <w:instrText xml:space="preserve"> PAGEREF _Toc240543526 \h </w:instrText>
         </w:r>
         <w:r>
           <w:rPr>
@@ -4912,7 +4845,7 @@
           <w:noProof/>
         </w:rPr>
       </w:pPr>
-      <w:hyperlink w:anchor="_Toc240406143" w:history="1">
+      <w:hyperlink w:anchor="_Toc240543527" w:history="1">
         <w:r>
           <w:rPr>
             <w:rStyle w:val="Hyperlink"/>
@@ -4939,7 +4872,7 @@
             <w:noProof/>
             <w:webHidden/>
           </w:rPr>
-          <w:instrText xml:space="preserve"> PAGEREF _Toc240406143 \h </w:instrText>
+          <w:instrText xml:space="preserve"> PAGEREF _Toc240543527 \h </w:instrText>
         </w:r>
         <w:r>
           <w:rPr>
@@ -4981,7 +4914,7 @@
           <w:noProof/>
         </w:rPr>
       </w:pPr>
-      <w:hyperlink w:anchor="_Toc240406144" w:history="1">
+      <w:hyperlink w:anchor="_Toc240543528" w:history="1">
         <w:r>
           <w:rPr>
             <w:rStyle w:val="Hyperlink"/>
@@ -5008,7 +4941,7 @@
             <w:noProof/>
             <w:webHidden/>
           </w:rPr>
-          <w:instrText xml:space="preserve"> PAGEREF _Toc240406144 \h </w:instrText>
+          <w:instrText xml:space="preserve"> PAGEREF _Toc240543528 \h </w:instrText>
         </w:r>
         <w:r>
           <w:rPr>
@@ -5050,7 +4983,7 @@
           <w:noProof/>
         </w:rPr>
       </w:pPr>
-      <w:hyperlink w:anchor="_Toc240406145" w:history="1">
+      <w:hyperlink w:anchor="_Toc240543529" w:history="1">
         <w:r>
           <w:rPr>
             <w:rStyle w:val="Hyperlink"/>
@@ -5077,7 +5010,7 @@
             <w:noProof/>
             <w:webHidden/>
           </w:rPr>
-          <w:instrText xml:space="preserve"> PAGEREF _Toc240406145 \h </w:instrText>
+          <w:instrText xml:space="preserve"> PAGEREF _Toc240543529 \h </w:instrText>
         </w:r>
         <w:r>
           <w:rPr>
@@ -5122,7 +5055,7 @@
       <w:pPr>
         <w:pStyle w:val="Heading1"/>
       </w:pPr>
-      <w:bookmarkStart w:id="4" w:name="_Toc240406082"/>
+      <w:bookmarkStart w:id="4" w:name="_Toc240543466"/>
       <w:r>
         <w:rPr>
           <w:sz w:val="28"/>
@@ -5137,10 +5070,7 @@
         <w:spacing w:after="80"/>
       </w:pPr>
       <w:r>
-        <w:t>Table 2-1: Comparison of Existing Bloo</w:t>
-      </w:r>
-      <w:r>
-        <w:t>d Donor Management Systems</w:t>
+        <w:t>Table 2-1: Comparison of Existing Blood Donor Management Systems</w:t>
       </w:r>
     </w:p>
     <w:p>
@@ -5180,10 +5110,7 @@
         <w:spacing w:after="80"/>
       </w:pPr>
       <w:r>
-        <w:t xml:space="preserve">Table 4-1: </w:t>
-      </w:r>
-      <w:r>
-        <w:t>Frontend Build Phases and Outcomes</w:t>
+        <w:t>Table 4-1: Frontend Build Phases and Outcomes</w:t>
       </w:r>
     </w:p>
     <w:p>
@@ -5227,19 +5154,13 @@
       <w:pPr>
         <w:pStyle w:val="Heading1"/>
       </w:pPr>
-      <w:bookmarkStart w:id="5" w:name="_Toc240406083"/>
+      <w:bookmarkStart w:id="5" w:name="_Toc240543467"/>
       <w:r>
         <w:rPr>
           <w:sz w:val="28"/>
         </w:rPr>
         <w:lastRenderedPageBreak/>
-        <w:t>LIST OF</w:t>
-      </w:r>
-      <w:r>
-        <w:rPr>
-          <w:sz w:val="28"/>
-        </w:rPr>
-        <w:t xml:space="preserve"> FIGURES</w:t>
+        <w:t>LIST OF FIGURES</w:t>
       </w:r>
       <w:bookmarkEnd w:id="5"/>
     </w:p>
@@ -5328,10 +5249,7 @@
         <w:spacing w:after="80"/>
       </w:pPr>
       <w:r>
-        <w:t>Figure 4-5: Administrator Dashboard with Ag</w:t>
-      </w:r>
-      <w:r>
-        <w:t>gregate Analytics</w:t>
+        <w:t>Figure 4-5: Administrator Dashboard with Aggregate Analytics</w:t>
       </w:r>
     </w:p>
     <w:p>
@@ -5359,7 +5277,7 @@
       <w:pPr>
         <w:pStyle w:val="Heading1"/>
       </w:pPr>
-      <w:bookmarkStart w:id="6" w:name="_Toc240406084"/>
+      <w:bookmarkStart w:id="6" w:name="_Toc240543468"/>
       <w:r>
         <w:rPr>
           <w:sz w:val="28"/>
@@ -5471,13 +5389,7 @@
               <w:rPr>
                 <w:sz w:val="20"/>
               </w:rPr>
-              <w:t xml:space="preserve">Bachelor of Information and Communication </w:t>
-            </w:r>
-            <w:r>
-              <w:rPr>
-                <w:sz w:val="20"/>
-              </w:rPr>
-              <w:t>Technology</w:t>
+              <w:t>Bachelor of Information and Communication Technology</w:t>
             </w:r>
           </w:p>
         </w:tc>
@@ -6132,7 +6044,7 @@
       <w:pPr>
         <w:pStyle w:val="Heading1"/>
       </w:pPr>
-      <w:bookmarkStart w:id="7" w:name="_Toc240406085"/>
+      <w:bookmarkStart w:id="7" w:name="_Toc240543469"/>
       <w:r>
         <w:lastRenderedPageBreak/>
         <w:t>CHAPTER 1: INTRODUCTION</w:t>
@@ -6143,7 +6055,7 @@
       <w:pPr>
         <w:pStyle w:val="Heading2"/>
       </w:pPr>
-      <w:bookmarkStart w:id="8" w:name="_Toc240406086"/>
+      <w:bookmarkStart w:id="8" w:name="_Toc240543470"/>
       <w:r>
         <w:t>1.1 Overview</w:t>
       </w:r>
@@ -6154,16 +6066,7 @@
         <w:jc w:val="both"/>
       </w:pPr>
       <w:r>
-        <w:t xml:space="preserve">BloodBuddy is a web-based blood donor management system for the Nepali </w:t>
-      </w:r>
-      <w:r>
-        <w:t>context, proposed in the CPP400 phase and developed for this module as a full-stack web application. The system serves four user roles. Donors register with their blood group, district, and contact details, manage their profile, and toggle their availabili</w:t>
-      </w:r>
-      <w:r>
-        <w:t>ty. Requesters search the donor registry by blood group and location, submit blood requests, and track each request through a status lifecycle. Hospital staff manage their institution's blood bank inventory and fulfil incoming requests from a dedicated por</w:t>
-      </w:r>
-      <w:r>
-        <w:t>tal. Administrators moderate requests, manage users, and monitor platform analytics through an administrative dashboard.</w:t>
+        <w:t>BloodBuddy is a web-based blood donor management system for the Nepali context, proposed in the CPP400 phase and developed for this module as a full-stack web application. The system serves four user roles. Donors register with their blood group, district, and contact details, manage their profile, and toggle their availability. Requesters search the donor registry by blood group and location, submit blood requests, and track each request through a status lifecycle. Hospital staff manage their institution's blood bank inventory and fulfil incoming requests from a dedicated portal. Administrators moderate requests, manage users, and monitor platform analytics through an administrative dashboard.</w:t>
       </w:r>
     </w:p>
     <w:p>
@@ -6171,19 +6074,7 @@
         <w:jc w:val="both"/>
       </w:pPr>
       <w:r>
-        <w:t>The platform supports Nepal's five partner hospitals — Tribhuvan University Teaching Hospital (TUTH), Bir Hospital, Patan Hospital, Man</w:t>
-      </w:r>
-      <w:r>
-        <w:t>mohan Memorial Community Hospital, and Nepal Medical College Teaching Hospital (NMCTH) — as administrator-managed database records rather than hardcoded content, and the design provisions each with a dedicated, hospital-scoped API layer following the patte</w:t>
-      </w:r>
-      <w:r>
-        <w:t>rn /api/hospitals/{hospitalId}/... so that inventory and request data remain isolated per institution. The system's defining clinical rule — a donor may only be matched to recipients whose compatible donor groups include the donor's group — is derived from</w:t>
-      </w:r>
-      <w:r>
-        <w:t xml:space="preserve"> the blood group compatibility chart in Appendix A and is applied strictly in the recipient-to-donor direction; the frontend implements it as a single shared module so that every matching surface (request forms, donor dashboard, search) agrees, and the aut</w:t>
-      </w:r>
-      <w:r>
-        <w:t>horitative enforcement point is the backend service layer.</w:t>
+        <w:t>The platform supports Nepal's five partner hospitals — Tribhuvan University Teaching Hospital (TUTH), Bir Hospital, Patan Hospital, Manmohan Memorial Community Hospital, and Nepal Medical College Teaching Hospital (NMCTH) — as administrator-managed database records rather than hardcoded content, and the design provisions each with a dedicated, hospital-scoped API layer following the pattern /api/hospitals/{hospitalId}/... so that inventory and request data remain isolated per institution. The system's defining clinical rule — a donor may only be matched to recipients whose compatible donor groups include the donor's group — is derived from the blood group compatibility chart in Appendix A and is applied strictly in the recipient-to-donor direction; the frontend implements it as a single shared module so that every matching surface (request forms, donor dashboard, search) agrees, and the authoritative enforcement point is the backend service layer.</w:t>
       </w:r>
     </w:p>
     <w:p>
@@ -6191,17 +6082,14 @@
         <w:jc w:val="both"/>
       </w:pPr>
       <w:r>
-        <w:t>The front end is built with HTML, CSS, and vanilla JavaScript — no frameworks and no build step — and consumes the backend exclusively through AJAX/Fetch calls to REST endpoints via a single API fa</w:t>
-      </w:r>
-      <w:r>
-        <w:t>cade, with shared client-side validation. The backend is a Spring MVC application organised into strict layers, with Hibernate/JPA persisting to MySQL and SMTP email for registration confirmations and urgent-request alerts.</w:t>
+        <w:t>The front end is built with HTML, CSS, and vanilla JavaScript — no frameworks and no build step — and consumes the backend exclusively through AJAX/Fetch calls to REST endpoints via a single API facade, with shared client-side validation. The backend is a Spring MVC application organised into strict layers, with Hibernate/JPA persisting to MySQL and SMTP email for registration confirmations and urgent-request alerts.</w:t>
       </w:r>
     </w:p>
     <w:p>
       <w:pPr>
         <w:pStyle w:val="Heading2"/>
       </w:pPr>
-      <w:bookmarkStart w:id="9" w:name="_Toc240406087"/>
+      <w:bookmarkStart w:id="9" w:name="_Toc240543471"/>
       <w:r>
         <w:t>1.2 Problem Statement</w:t>
       </w:r>
@@ -6212,13 +6100,7 @@
         <w:jc w:val="both"/>
       </w:pPr>
       <w:r>
-        <w:t>Nepal curr</w:t>
-      </w:r>
-      <w:r>
-        <w:t xml:space="preserve">ently lacks a dedicated, reliable digital platform for blood donor discovery and management. Blood is a resource that cannot be manufactured and must come from voluntary donors, and the World Health Organisation notes that developing nations face the most </w:t>
-      </w:r>
-      <w:r>
-        <w:t>severe shortages, largely due to the absence of organised donation management (WHO, 2023). In Nepal the existing approach is fragmented and informal, characterised by five persistent gaps:</w:t>
+        <w:t>Nepal currently lacks a dedicated, reliable digital platform for blood donor discovery and management. Blood is a resource that cannot be manufactured and must come from voluntary donors, and the World Health Organisation notes that developing nations face the most severe shortages, largely due to the absence of organised donation management (WHO, 2023). In Nepal the existing approach is fragmented and informal, characterised by five persistent gaps:</w:t>
       </w:r>
     </w:p>
     <w:p>
@@ -6227,10 +6109,7 @@
         <w:spacing w:after="60"/>
       </w:pPr>
       <w:r>
-        <w:t>Blood requests are posted on Facebook and other social media platfo</w:t>
-      </w:r>
-      <w:r>
-        <w:t>rms in an unstructured manner, with no guarantee of reaching compatible or available donors.</w:t>
+        <w:t>Blood requests are posted on Facebook and other social media platforms in an unstructured manner, with no guarantee of reaching compatible or available donors.</w:t>
       </w:r>
     </w:p>
     <w:p>
@@ -6248,10 +6127,7 @@
         <w:spacing w:after="60"/>
       </w:pPr>
       <w:r>
-        <w:t xml:space="preserve">Hospitals maintain manual blood bank records with no </w:t>
-      </w:r>
-      <w:r>
-        <w:t>digital integration or real-time inventory visibility.</w:t>
+        <w:t>Hospitals maintain manual blood bank records with no digital integration or real-time inventory visibility.</w:t>
       </w:r>
     </w:p>
     <w:p>
@@ -6269,10 +6145,7 @@
         <w:spacing w:after="60"/>
       </w:pPr>
       <w:r>
-        <w:t xml:space="preserve">The absence of a centralised platform means that duplicate, fraudulent, or outdated requests cannot be </w:t>
-      </w:r>
-      <w:r>
-        <w:t>moderated.</w:t>
+        <w:t>The absence of a centralised platform means that duplicate, fraudulent, or outdated requests cannot be moderated.</w:t>
       </w:r>
     </w:p>
     <w:p>
@@ -6281,17 +6154,14 @@
       </w:pPr>
       <w:r>
         <w:lastRenderedPageBreak/>
-        <w:t>These gaps result in delayed responses during emergencies, wasted donor effort, and preventable loss of life. BloodBuddy exists to close these gaps with a structured, database-backed system whose critical logic — donor matching, request lifecycl</w:t>
-      </w:r>
-      <w:r>
-        <w:t>e, inventory integrity, and authorisation — lives in the backend.</w:t>
+        <w:t>These gaps result in delayed responses during emergencies, wasted donor effort, and preventable loss of life. BloodBuddy exists to close these gaps with a structured, database-backed system whose critical logic — donor matching, request lifecycle, inventory integrity, and authorisation — lives in the backend.</w:t>
       </w:r>
     </w:p>
     <w:p>
       <w:pPr>
         <w:pStyle w:val="Heading2"/>
       </w:pPr>
-      <w:bookmarkStart w:id="10" w:name="_Toc240406088"/>
+      <w:bookmarkStart w:id="10" w:name="_Toc240543472"/>
       <w:r>
         <w:t>1.3 Objectives</w:t>
       </w:r>
@@ -6302,10 +6172,7 @@
         <w:jc w:val="both"/>
       </w:pPr>
       <w:r>
-        <w:t>The general objective of this project was to design, implement, and test a secure web-based blood donor management system for Nepal using Spring MVC, Hibernate/JPA, and MySQL,</w:t>
-      </w:r>
-      <w:r>
-        <w:t xml:space="preserve"> satisfying the mandatory requirements of the CPJ119 assignment brief. The specific objectives were:</w:t>
+        <w:t>The general objective of this project was to design, implement, and test a secure web-based blood donor management system for Nepal using Spring MVC, Hibernate/JPA, and MySQL, satisfying the mandatory requirements of the CPJ119 assignment brief. The specific objectives were:</w:t>
       </w:r>
     </w:p>
     <w:p>
@@ -6323,10 +6190,7 @@
         <w:spacing w:after="60"/>
       </w:pPr>
       <w:r>
-        <w:t xml:space="preserve">To implement an </w:t>
-      </w:r>
-      <w:r>
-        <w:t>automated email notification system that alerts nearby registered donors when an urgent blood request is submitted.</w:t>
+        <w:t>To implement an automated email notification system that alerts nearby registered donors when an urgent blood request is submitted.</w:t>
       </w:r>
     </w:p>
     <w:p>
@@ -6344,10 +6208,7 @@
         <w:spacing w:after="60"/>
       </w:pPr>
       <w:r>
-        <w:t>To develop and integrate dedicated local REST APIs for</w:t>
-      </w:r>
-      <w:r>
-        <w:t xml:space="preserve"> a minimum of five partner hospitals (TUTH, Bir Hospital, Patan Hospital, Manmohan Memorial Community Hospital, and NMCTH), enabling each institution to expose and consume blood inventory data through standardised, hospital-specific endpoints.</w:t>
+        <w:t>To develop and integrate dedicated local REST APIs for a minimum of five partner hospitals (TUTH, Bir Hospital, Patan Hospital, Manmohan Memorial Community Hospital, and NMCTH), enabling each institution to expose and consume blood inventory data through standardised, hospital-specific endpoints.</w:t>
       </w:r>
     </w:p>
     <w:p>
@@ -6356,10 +6217,7 @@
         <w:spacing w:after="60"/>
       </w:pPr>
       <w:r>
-        <w:t>To implement</w:t>
-      </w:r>
-      <w:r>
-        <w:t xml:space="preserve"> role-based access control distinguishing between Donors, Requesters, Hospital Staff, and Administrators.</w:t>
+        <w:t>To implement role-based access control distinguishing between Donors, Requesters, Hospital Staff, and Administrators.</w:t>
       </w:r>
     </w:p>
     <w:p>
@@ -6377,10 +6235,7 @@
         <w:spacing w:after="60"/>
       </w:pPr>
       <w:r>
-        <w:t xml:space="preserve">To deliver a fully responsive frontend </w:t>
-      </w:r>
-      <w:r>
-        <w:t>with client-side form validation, dynamic UI updates, and AJAX/Fetch communication with backend REST endpoints.</w:t>
+        <w:t>To deliver a fully responsive frontend with client-side form validation, dynamic UI updates, and AJAX/Fetch communication with backend REST endpoints.</w:t>
       </w:r>
     </w:p>
     <w:p>
@@ -6396,7 +6251,7 @@
       <w:pPr>
         <w:pStyle w:val="Heading2"/>
       </w:pPr>
-      <w:bookmarkStart w:id="11" w:name="_Toc240406089"/>
+      <w:bookmarkStart w:id="11" w:name="_Toc240543473"/>
       <w:r>
         <w:t>1.4 Scope</w:t>
       </w:r>
@@ -6416,10 +6271,7 @@
         <w:spacing w:after="60"/>
       </w:pPr>
       <w:r>
-        <w:t xml:space="preserve">A </w:t>
-      </w:r>
-      <w:r>
-        <w:t>web-based application accessible via desktop and mobile browsers, targeting the Nepali population.</w:t>
+        <w:t>A web-based application accessible via desktop and mobile browsers, targeting the Nepali population.</w:t>
       </w:r>
     </w:p>
     <w:p>
@@ -6437,10 +6289,7 @@
         <w:spacing w:after="60"/>
       </w:pPr>
       <w:r>
-        <w:t>Blood request submission, tracking, and management by requesters, including a public emerg</w:t>
-      </w:r>
-      <w:r>
-        <w:t>ency request flow for guests without an account.</w:t>
+        <w:t>Blood request submission, tracking, and management by requesters, including a public emergency request flow for guests without an account.</w:t>
       </w:r>
     </w:p>
     <w:p>
@@ -6467,10 +6316,7 @@
         <w:spacing w:after="60"/>
       </w:pPr>
       <w:r>
-        <w:t>Local REST API integration with five partner hospitals (TU</w:t>
-      </w:r>
-      <w:r>
-        <w:t>TH, Bir Hospital, Patan Hospital, Manmohan Memorial Community Hospital, and NMCTH), each with dedicated endpoints for inventory retrieval, stock updates, and blood request forwarding.</w:t>
+        <w:t>Local REST API integration with five partner hospitals (TUTH, Bir Hospital, Patan Hospital, Manmohan Memorial Community Hospital, and NMCTH), each with dedicated endpoints for inventory retrieval, stock updates, and blood request forwarding.</w:t>
       </w:r>
     </w:p>
     <w:p>
@@ -6479,10 +6325,7 @@
         <w:spacing w:after="60"/>
       </w:pPr>
       <w:r>
-        <w:t>Administrative controls for user management, request moderation, and sys</w:t>
-      </w:r>
-      <w:r>
-        <w:t>tem analytics.</w:t>
+        <w:t>Administrative controls for user management, request moderation, and system analytics.</w:t>
       </w:r>
     </w:p>
     <w:p>
@@ -6509,10 +6352,7 @@
         <w:spacing w:after="60"/>
       </w:pPr>
       <w:r>
-        <w:t>Pagination for large resu</w:t>
-      </w:r>
-      <w:r>
-        <w:t>lt sets, including donor search results and administrative user and request listings.</w:t>
+        <w:t>Pagination for large result sets, including donor search results and administrative user and request listings.</w:t>
       </w:r>
     </w:p>
     <w:p>
@@ -6539,10 +6379,7 @@
         <w:spacing w:after="60"/>
       </w:pPr>
       <w:r>
-        <w:t>Live in</w:t>
-      </w:r>
-      <w:r>
-        <w:t>tegration with hospital information systems; hospital and inventory data is admin-managed and seeded, and the local hospital APIs are designed but not yet connected to live institutional feeds.</w:t>
+        <w:t>Live integration with hospital information systems; hospital and inventory data is admin-managed and seeded, and the local hospital APIs are designed but not yet connected to live institutional feeds.</w:t>
       </w:r>
     </w:p>
     <w:p>
@@ -6551,17 +6388,14 @@
         <w:spacing w:after="60"/>
       </w:pPr>
       <w:r>
-        <w:t>Clinical decision support of any kind; the compatibility chart</w:t>
-      </w:r>
-      <w:r>
-        <w:t xml:space="preserve"> is a matching filter, not medical advice.</w:t>
+        <w:t>Clinical decision support of any kind; the compatibility chart is a matching filter, not medical advice.</w:t>
       </w:r>
     </w:p>
     <w:p>
       <w:pPr>
         <w:pStyle w:val="Heading2"/>
       </w:pPr>
-      <w:bookmarkStart w:id="12" w:name="_Toc240406090"/>
+      <w:bookmarkStart w:id="12" w:name="_Toc240543474"/>
       <w:r>
         <w:t>1.5 Justification and Significance of the Study</w:t>
       </w:r>
@@ -6572,13 +6406,7 @@
         <w:jc w:val="both"/>
       </w:pPr>
       <w:r>
-        <w:t xml:space="preserve">Humanitarian contribution. An organised blood management system directly reduces the time between an urgent request and a successful donor match — the </w:t>
-      </w:r>
-      <w:r>
-        <w:t>interval in which preventable deaths occur. Nepal's informal, social-media-based approach to blood requests is a documented public health concern, and a verified, searchable registry with automated alerts and hospital inventory visibility has clear, immedi</w:t>
-      </w:r>
-      <w:r>
-        <w:t>ate social value.</w:t>
+        <w:t>Humanitarian contribution. An organised blood management system directly reduces the time between an urgent request and a successful donor match — the interval in which preventable deaths occur. Nepal's informal, social-media-based approach to blood requests is a documented public health concern, and a verified, searchable registry with automated alerts and hospital inventory visibility has clear, immediate social value.</w:t>
       </w:r>
     </w:p>
     <w:p>
@@ -6586,13 +6414,7 @@
         <w:jc w:val="both"/>
       </w:pPr>
       <w:r>
-        <w:t>Contribution to knowledge. The project demonstrates a hospital-scoped API isolation pattern (/api/hospitals/{hospitalId}/...) that lets multiple institutions share one platform without sharing each other's data — a pattern directly reusab</w:t>
-      </w:r>
-      <w:r>
-        <w:t xml:space="preserve">le in any multi-tenant health records system. It also demonstrates how a clinical rule set (blood group compatibility) can be centralised in one authoritative module so that several UI surfaces cannot drift into contradictory, unsafe matches, and how that </w:t>
-      </w:r>
-      <w:r>
-        <w:t>rule must ultimately live in the server layer where requesters cannot influence it.</w:t>
+        <w:t>Contribution to knowledge. The project demonstrates a hospital-scoped API isolation pattern (/api/hospitals/{hospitalId}/...) that lets multiple institutions share one platform without sharing each other's data — a pattern directly reusable in any multi-tenant health records system. It also demonstrates how a clinical rule set (blood group compatibility) can be centralised in one authoritative module so that several UI surfaces cannot drift into contradictory, unsafe matches, and how that rule must ultimately live in the server layer where requesters cannot influence it.</w:t>
       </w:r>
     </w:p>
     <w:p>
@@ -6600,13 +6422,7 @@
         <w:jc w:val="both"/>
       </w:pPr>
       <w:r>
-        <w:t>Contribution to methodology. The project traces every major feature from a documented pain point in Nepal's blood request workflow through formal requirement analysis, laye</w:t>
-      </w:r>
-      <w:r>
-        <w:t>red design, phased implementation, and evidence-based automated testing — a complete software development lifecycle within one academic module. It also aligns with Nepal's broader digital transformation goals: research by the Nepal Economic Forum indicates</w:t>
-      </w:r>
-      <w:r>
-        <w:t xml:space="preserve"> that 48% of Nepali firms lack any digital presence, and the country's healthcare and emergency response systems remain largely undigitised.</w:t>
+        <w:t>Contribution to methodology. The project traces every major feature from a documented pain point in Nepal's blood request workflow through formal requirement analysis, layered design, phased implementation, and evidence-based automated testing — a complete software development lifecycle within one academic module. It also aligns with Nepal's broader digital transformation goals: research by the Nepal Economic Forum indicates that 48% of Nepali firms lack any digital presence, and the country's healthcare and emergency response systems remain largely undigitised.</w:t>
       </w:r>
     </w:p>
     <w:p>
@@ -6618,7 +6434,7 @@
       <w:pPr>
         <w:pStyle w:val="Heading1"/>
       </w:pPr>
-      <w:bookmarkStart w:id="13" w:name="_Toc240406091"/>
+      <w:bookmarkStart w:id="13" w:name="_Toc240543475"/>
       <w:r>
         <w:lastRenderedPageBreak/>
         <w:t>CHAPTER 2: LITERATURE REVIEW</w:t>
@@ -6629,7 +6445,7 @@
       <w:pPr>
         <w:pStyle w:val="Heading2"/>
       </w:pPr>
-      <w:bookmarkStart w:id="14" w:name="_Toc240406092"/>
+      <w:bookmarkStart w:id="14" w:name="_Toc240543476"/>
       <w:r>
         <w:t>2.1 Introduction</w:t>
       </w:r>
@@ -6640,20 +6456,14 @@
         <w:jc w:val="both"/>
       </w:pPr>
       <w:r>
-        <w:t>This chapter reviews the concepts underlying BloodBuddy and evaluat</w:t>
-      </w:r>
-      <w:r>
-        <w:t>es existing systems in the same problem space, establishing the design decisions taken in Chapter 3. The review draws from academic sources, World Health Organisation publications, Nepal-focused digital economy reports, and publicly available analyses of e</w:t>
-      </w:r>
-      <w:r>
-        <w:t>xisting donor platforms.</w:t>
+        <w:t>This chapter reviews the concepts underlying BloodBuddy and evaluates existing systems in the same problem space, establishing the design decisions taken in Chapter 3. The review draws from academic sources, World Health Organisation publications, Nepal-focused digital economy reports, and publicly available analyses of existing donor platforms.</w:t>
       </w:r>
     </w:p>
     <w:p>
       <w:pPr>
         <w:pStyle w:val="Heading2"/>
       </w:pPr>
-      <w:bookmarkStart w:id="15" w:name="_Toc240406093"/>
+      <w:bookmarkStart w:id="15" w:name="_Toc240543477"/>
       <w:r>
         <w:t>2.2 Related Concepts</w:t>
       </w:r>
@@ -6663,7 +6473,7 @@
       <w:pPr>
         <w:pStyle w:val="Heading3"/>
       </w:pPr>
-      <w:bookmarkStart w:id="16" w:name="_Toc240406094"/>
+      <w:bookmarkStart w:id="16" w:name="_Toc240543478"/>
       <w:r>
         <w:t>2.2.1 Blood Donation Management</w:t>
       </w:r>
@@ -6674,25 +6484,16 @@
         <w:jc w:val="both"/>
       </w:pPr>
       <w:r>
-        <w:t>Blood donation management is the systematic process of recruiting, registering, screening, and coordinating blood donors to ensure an adequate supply for medical needs. The World</w:t>
-      </w:r>
-      <w:r>
-        <w:t xml:space="preserve"> Health Organisation defines an effective system as one that maintains a voluntary, non-remunerated donor base, ensures safe collection and storage, and enables rapid matching of donors to recipients (WHO, 2023). Traditional blood management in developing </w:t>
-      </w:r>
-      <w:r>
-        <w:t>countries relies heavily on replacement donation — patients' families must provide donor substitutes — which is less reliable and more prone to safety risks than voluntary community donation supported by a searchable registry.</w:t>
+        <w:t>Blood donation management is the systematic process of recruiting, registering, screening, and coordinating blood donors to ensure an adequate supply for medical needs. The World Health Organisation defines an effective system as one that maintains a voluntary, non-remunerated donor base, ensures safe collection and storage, and enables rapid matching of donors to recipients (WHO, 2023). Traditional blood management in developing countries relies heavily on replacement donation — patients' families must provide donor substitutes — which is less reliable and more prone to safety risks than voluntary community donation supported by a searchable registry.</w:t>
       </w:r>
     </w:p>
     <w:p>
       <w:pPr>
         <w:pStyle w:val="Heading3"/>
       </w:pPr>
-      <w:bookmarkStart w:id="17" w:name="_Toc240406095"/>
-      <w:r>
-        <w:t>2.2.2 Web-Based Information S</w:t>
-      </w:r>
-      <w:r>
-        <w:t>ystems and Spring MVC</w:t>
+      <w:bookmarkStart w:id="17" w:name="_Toc240543479"/>
+      <w:r>
+        <w:t>2.2.2 Web-Based Information Systems and Spring MVC</w:t>
       </w:r>
       <w:bookmarkEnd w:id="17"/>
     </w:p>
@@ -6701,20 +6502,14 @@
         <w:jc w:val="both"/>
       </w:pPr>
       <w:r>
-        <w:t>A web-based information system is hosted on a server and accessed through a browser, which suits healthcare and emergency contexts because it requires no installation, works across devices, and updates centrally. Spring MVC implements</w:t>
-      </w:r>
-      <w:r>
-        <w:t xml:space="preserve"> the Model-View-Controller pattern through a central DispatcherServlet that routes HTTP requests to annotated controllers (Spring, 2024), and its layered structure is widely adopted in enterprise-grade Java web development due to its modularity and scalabi</w:t>
-      </w:r>
-      <w:r>
-        <w:t>lity.</w:t>
+        <w:t>A web-based information system is hosted on a server and accessed through a browser, which suits healthcare and emergency contexts because it requires no installation, works across devices, and updates centrally. Spring MVC implements the Model-View-Controller pattern through a central DispatcherServlet that routes HTTP requests to annotated controllers (Spring, 2024), and its layered structure is widely adopted in enterprise-grade Java web development due to its modularity and scalability.</w:t>
       </w:r>
     </w:p>
     <w:p>
       <w:pPr>
         <w:pStyle w:val="Heading3"/>
       </w:pPr>
-      <w:bookmarkStart w:id="18" w:name="_Toc240406096"/>
+      <w:bookmarkStart w:id="18" w:name="_Toc240543480"/>
       <w:r>
         <w:t>2.2.3 Hibernate ORM and Entity Relationships</w:t>
       </w:r>
@@ -6725,22 +6520,16 @@
         <w:jc w:val="both"/>
       </w:pPr>
       <w:r>
-        <w:t>Hibernate maps Java entity classes to relational tables without hand-written SQL, with JPA annotations expressing associations (@OneToOne, @OneToMany, @ManyToMany) (Bauer &amp; King, 2015). For a donor managem</w:t>
-      </w:r>
-      <w:r>
-        <w:t>ent system, correctly modelled relationships are not cosmetic: foreign keys, cascade behaviour, and unique constraints are the foundation on which request ownership, inventory integrity, and per-hospital data isolation are enforced.</w:t>
+        <w:t>Hibernate maps Java entity classes to relational tables without hand-written SQL, with JPA annotations expressing associations (@OneToOne, @OneToMany, @ManyToMany) (Bauer &amp; King, 2015). For a donor management system, correctly modelled relationships are not cosmetic: foreign keys, cascade behaviour, and unique constraints are the foundation on which request ownership, inventory integrity, and per-hospital data isolation are enforced.</w:t>
       </w:r>
     </w:p>
     <w:p>
       <w:pPr>
         <w:pStyle w:val="Heading3"/>
       </w:pPr>
-      <w:bookmarkStart w:id="19" w:name="_Toc240406097"/>
-      <w:r>
-        <w:t xml:space="preserve">2.2.4 RESTful APIs and </w:t>
-      </w:r>
-      <w:r>
-        <w:t>AJAX/Fetch Front Ends</w:t>
+      <w:bookmarkStart w:id="19" w:name="_Toc240543481"/>
+      <w:r>
+        <w:t>2.2.4 RESTful APIs and AJAX/Fetch Front Ends</w:t>
       </w:r>
       <w:bookmarkEnd w:id="19"/>
     </w:p>
@@ -6749,17 +6538,14 @@
         <w:jc w:val="both"/>
       </w:pPr>
       <w:r>
-        <w:t xml:space="preserve">RESTful design — stateless interactions over HTTP with resources addressed by URL and manipulated by methods (Fielding, 2000) — allows a decoupled JavaScript front end to consume the backend exclusively through Fetch calls, with JSON </w:t>
-      </w:r>
-      <w:r>
-        <w:t>request/response bodies and consistent error shapes. Concentrating every call in one client-side API module keeps transport, error handling, and endpoint structure testable and swappable.</w:t>
+        <w:t>RESTful design — stateless interactions over HTTP with resources addressed by URL and manipulated by methods (Fielding, 2000) — allows a decoupled JavaScript front end to consume the backend exclusively through Fetch calls, with JSON request/response bodies and consistent error shapes. Concentrating every call in one client-side API module keeps transport, error handling, and endpoint structure testable and swappable.</w:t>
       </w:r>
     </w:p>
     <w:p>
       <w:pPr>
         <w:pStyle w:val="Heading3"/>
       </w:pPr>
-      <w:bookmarkStart w:id="20" w:name="_Toc240406098"/>
+      <w:bookmarkStart w:id="20" w:name="_Toc240543482"/>
       <w:r>
         <w:t>2.2.5 Web Security: Role-Based Access Control</w:t>
       </w:r>
@@ -6770,27 +6556,18 @@
         <w:jc w:val="both"/>
       </w:pPr>
       <w:r>
-        <w:t>Role-Based Access Cont</w:t>
-      </w:r>
-      <w:r>
-        <w:t>rol assigns permissions to roles rather than individuals, which is both scalable and aligned with enterprise security practice (Sandhu &amp; Samarati, 1994). In BloodBuddy, RBAC ensures donors can only manage their own profiles, requesters only their own reque</w:t>
-      </w:r>
-      <w:r>
-        <w:t xml:space="preserve">sts, hospital staff only their institution's inventory, and administrators the whole platform. Hiding UI elements is never mistaken for security: the authorisation decisions are </w:t>
+        <w:t xml:space="preserve">Role-Based Access Control assigns permissions to roles rather than individuals, which is both scalable and aligned with enterprise security practice (Sandhu &amp; Samarati, 1994). In BloodBuddy, RBAC ensures donors can only manage their own profiles, requesters only their own requests, hospital staff only their institution's inventory, and administrators the whole platform. Hiding UI elements is never mistaken for security: the authorisation decisions are </w:t>
       </w:r>
       <w:r>
         <w:lastRenderedPageBreak/>
-        <w:t>enforced server-side against the authenticated role, and secrets belong in env</w:t>
-      </w:r>
-      <w:r>
-        <w:t>ironment variables, never in source code.</w:t>
+        <w:t>enforced server-side against the authenticated role, and secrets belong in environment variables, never in source code.</w:t>
       </w:r>
     </w:p>
     <w:p>
       <w:pPr>
         <w:pStyle w:val="Heading3"/>
       </w:pPr>
-      <w:bookmarkStart w:id="21" w:name="_Toc240406099"/>
+      <w:bookmarkStart w:id="21" w:name="_Toc240543483"/>
       <w:r>
         <w:t>2.2.6 Image Storage Strategies</w:t>
       </w:r>
@@ -6801,20 +6578,14 @@
         <w:jc w:val="both"/>
       </w:pPr>
       <w:r>
-        <w:t>Three options exist: static files on disk (inflexible, lost on redeploy), external object storage/CDN (scalable, but stores nothing in the application database), and database BLOB/Bas</w:t>
-      </w:r>
-      <w:r>
-        <w:t>e64 columns (data travels with the database; suited to small, fixed, low-volume images). The assignment brief mandates database-stored images (CPJ119 §2.5); BloodBuddy therefore stores profile photographs as Base64/BLOB with upload and retrieval managed th</w:t>
-      </w:r>
-      <w:r>
-        <w:t>rough backend API endpoints.</w:t>
+        <w:t>Three options exist: static files on disk (inflexible, lost on redeploy), external object storage/CDN (scalable, but stores nothing in the application database), and database BLOB/Base64 columns (data travels with the database; suited to small, fixed, low-volume images). The assignment brief mandates database-stored images (CPJ119 §2.5); BloodBuddy therefore stores profile photographs as Base64/BLOB with upload and retrieval managed through backend API endpoints.</w:t>
       </w:r>
     </w:p>
     <w:p>
       <w:pPr>
         <w:pStyle w:val="Heading2"/>
       </w:pPr>
-      <w:bookmarkStart w:id="22" w:name="_Toc240406100"/>
+      <w:bookmarkStart w:id="22" w:name="_Toc240543484"/>
       <w:r>
         <w:t>2.3 Review of Existing Systems</w:t>
       </w:r>
@@ -6824,7 +6595,7 @@
       <w:pPr>
         <w:pStyle w:val="Heading3"/>
       </w:pPr>
-      <w:bookmarkStart w:id="23" w:name="_Toc240406101"/>
+      <w:bookmarkStart w:id="23" w:name="_Toc240543485"/>
       <w:r>
         <w:t>2.3.1 Hamro Donor (Nepal)</w:t>
       </w:r>
@@ -6835,10 +6606,7 @@
         <w:jc w:val="both"/>
       </w:pPr>
       <w:r>
-        <w:t>Methodology/model used. Hamro Donor is one of the few existing attempts at a digital blood donor platform in Nepal. It operates as a mobile-first directory where donors r</w:t>
-      </w:r>
-      <w:r>
-        <w:t>egister their blood group and contact information, backed by a basic cloud-hosted backend with no documented API layer.</w:t>
+        <w:t>Methodology/model used. Hamro Donor is one of the few existing attempts at a digital blood donor platform in Nepal. It operates as a mobile-first directory where donors register their blood group and contact information, backed by a basic cloud-hosted backend with no documented API layer.</w:t>
       </w:r>
     </w:p>
     <w:p>
@@ -6846,20 +6614,14 @@
         <w:jc w:val="both"/>
       </w:pPr>
       <w:r>
-        <w:t xml:space="preserve">Issues and limitations (for this project's context). The platform lacks a request management system — it provides donor contact </w:t>
-      </w:r>
-      <w:r>
-        <w:t>details and leaves all coordination to the requester; there is no automated notification when a matching request is submitted; there is no administrative moderation, so outdated and unverified donor profiles accumulate; and hospital blood bank inventory is</w:t>
-      </w:r>
-      <w:r>
-        <w:t xml:space="preserve"> not integrated at all.</w:t>
+        <w:t>Issues and limitations (for this project's context). The platform lacks a request management system — it provides donor contact details and leaves all coordination to the requester; there is no automated notification when a matching request is submitted; there is no administrative moderation, so outdated and unverified donor profiles accumulate; and hospital blood bank inventory is not integrated at all.</w:t>
       </w:r>
     </w:p>
     <w:p>
       <w:pPr>
         <w:pStyle w:val="Heading3"/>
       </w:pPr>
-      <w:bookmarkStart w:id="24" w:name="_Toc240406102"/>
+      <w:bookmarkStart w:id="24" w:name="_Toc240543486"/>
       <w:r>
         <w:t>2.3.2 Sankalp India (Comparative Reference)</w:t>
       </w:r>
@@ -6870,10 +6632,7 @@
         <w:jc w:val="both"/>
       </w:pPr>
       <w:r>
-        <w:t>Methodology/model used. Sankalp is a well-established voluntary blood donation platform operating across India, with a structured backend, donor database, and request tracking. Automated S</w:t>
-      </w:r>
-      <w:r>
-        <w:t>MS and email notifications and geolocation- and compatibility-based donor matching make it a useful benchmark for what a mature system can achieve.</w:t>
+        <w:t>Methodology/model used. Sankalp is a well-established voluntary blood donation platform operating across India, with a structured backend, donor database, and request tracking. Automated SMS and email notifications and geolocation- and compatibility-based donor matching make it a useful benchmark for what a mature system can achieve.</w:t>
       </w:r>
     </w:p>
     <w:p>
@@ -6881,22 +6640,16 @@
         <w:jc w:val="both"/>
       </w:pPr>
       <w:r>
-        <w:t>Issues and limitations. The system is designed for the Indian context and does not address Nepali administra</w:t>
-      </w:r>
-      <w:r>
-        <w:t>tive divisions (districts, municipalities); it is not open source and cannot be adapted for local deployment in Nepal; and it does not provide a hospital-facing inventory management module.</w:t>
+        <w:t>Issues and limitations. The system is designed for the Indian context and does not address Nepali administrative divisions (districts, municipalities); it is not open source and cannot be adapted for local deployment in Nepal; and it does not provide a hospital-facing inventory management module.</w:t>
       </w:r>
     </w:p>
     <w:p>
       <w:pPr>
         <w:pStyle w:val="Heading3"/>
       </w:pPr>
-      <w:bookmarkStart w:id="25" w:name="_Toc240406103"/>
-      <w:r>
-        <w:t xml:space="preserve">2.3.3 The Manual Social-Media Workflow (Current Practice in </w:t>
-      </w:r>
-      <w:r>
-        <w:t>Nepal)</w:t>
+      <w:bookmarkStart w:id="25" w:name="_Toc240543487"/>
+      <w:r>
+        <w:t>2.3.3 The Manual Social-Media Workflow (Current Practice in Nepal)</w:t>
       </w:r>
       <w:bookmarkEnd w:id="25"/>
     </w:p>
@@ -6905,10 +6658,7 @@
         <w:jc w:val="both"/>
       </w:pPr>
       <w:r>
-        <w:t>Issues and limitations. Requests circulate as Facebook and WhatsApp posts with no structured matching or notification mechanism; hospitals keep blood bank records manually with no real-time visibility; requesters cannot confirm a donor's availabilit</w:t>
-      </w:r>
-      <w:r>
-        <w:t>y, compatibility, or location before making contact; and nobody can moderate duplicate, fraudulent, or outdated appeals (see Table 2-2).</w:t>
+        <w:t>Issues and limitations. Requests circulate as Facebook and WhatsApp posts with no structured matching or notification mechanism; hospitals keep blood bank records manually with no real-time visibility; requesters cannot confirm a donor's availability, compatibility, or location before making contact; and nobody can moderate duplicate, fraudulent, or outdated appeals (see Table 2-2).</w:t>
       </w:r>
     </w:p>
     <w:p>
@@ -7005,14 +6755,7 @@
                 <w:b/>
                 <w:sz w:val="19"/>
               </w:rPr>
-              <w:t xml:space="preserve">Manual Social-Media </w:t>
-            </w:r>
-            <w:r>
-              <w:rPr>
-                <w:b/>
-                <w:sz w:val="19"/>
-              </w:rPr>
-              <w:t>Workflow</w:t>
+              <w:t>Manual Social-Media Workflow</w:t>
             </w:r>
           </w:p>
         </w:tc>
@@ -7184,13 +6927,7 @@
               <w:rPr>
                 <w:sz w:val="19"/>
               </w:rPr>
-              <w:t xml:space="preserve">None </w:t>
-            </w:r>
-            <w:r>
-              <w:rPr>
-                <w:sz w:val="19"/>
-              </w:rPr>
-              <w:t>(Facebook/WhatsApp posts)</w:t>
+              <w:t>None (Facebook/WhatsApp posts)</w:t>
             </w:r>
           </w:p>
         </w:tc>
@@ -7547,13 +7284,7 @@
               <w:rPr>
                 <w:sz w:val="19"/>
               </w:rPr>
-              <w:t xml:space="preserve">Admin moderation, user </w:t>
-            </w:r>
-            <w:r>
-              <w:rPr>
-                <w:sz w:val="19"/>
-              </w:rPr>
-              <w:t>management, request forwarding, analytics</w:t>
+              <w:t>Admin moderation, user management, request forwarding, analytics</w:t>
             </w:r>
           </w:p>
         </w:tc>
@@ -7723,13 +7454,7 @@
               <w:rPr>
                 <w:sz w:val="19"/>
               </w:rPr>
-              <w:t xml:space="preserve">Yes — districts, Nepali partner </w:t>
-            </w:r>
-            <w:r>
-              <w:rPr>
-                <w:sz w:val="19"/>
-              </w:rPr>
-              <w:t>hospitals, mobile-first responsive web</w:t>
+              <w:t>Yes — districts, Nepali partner hospitals, mobile-first responsive web</w:t>
             </w:r>
           </w:p>
         </w:tc>
@@ -7869,13 +7594,7 @@
               <w:rPr>
                 <w:sz w:val="19"/>
               </w:rPr>
-              <w:t>Request entity with status transitions (Pending → Matched → Fulfilled; Cancelled/Rejected terminal), t</w:t>
-            </w:r>
-            <w:r>
-              <w:rPr>
-                <w:sz w:val="19"/>
-              </w:rPr>
-              <w:t>imeline entries, and per-requester tracking</w:t>
+              <w:t>Request entity with status transitions (Pending → Matched → Fulfilled; Cancelled/Rejected terminal), timeline entries, and per-requester tracking</w:t>
             </w:r>
           </w:p>
         </w:tc>
@@ -7949,13 +7668,7 @@
               <w:rPr>
                 <w:sz w:val="19"/>
               </w:rPr>
-              <w:t>BLOOD_INVENTORY per hosp</w:t>
-            </w:r>
-            <w:r>
-              <w:rPr>
-                <w:sz w:val="19"/>
-              </w:rPr>
-              <w:t>ital with staff-managed stock levels, fulfilment-driven decrement, and request queues</w:t>
+              <w:t>BLOOD_INVENTORY per hospital with staff-managed stock levels, fulfilment-driven decrement, and request queues</w:t>
             </w:r>
           </w:p>
         </w:tc>
@@ -8029,13 +7742,7 @@
               <w:rPr>
                 <w:sz w:val="19"/>
               </w:rPr>
-              <w:t>Av</w:t>
-            </w:r>
-            <w:r>
-              <w:rPr>
-                <w:sz w:val="19"/>
-              </w:rPr>
-              <w:t>ailability toggling, admin suspension of inactive accounts, and moderation of outdated profiles</w:t>
+              <w:t>Availability toggling, admin suspension of inactive accounts, and moderation of outdated profiles</w:t>
             </w:r>
           </w:p>
         </w:tc>
@@ -8050,7 +7757,7 @@
       <w:pPr>
         <w:pStyle w:val="Heading2"/>
       </w:pPr>
-      <w:bookmarkStart w:id="26" w:name="_Toc240406104"/>
+      <w:bookmarkStart w:id="26" w:name="_Toc240543488"/>
       <w:r>
         <w:t>2.4 The Market Gap and BloodBuddy's Position</w:t>
       </w:r>
@@ -8061,16 +7768,7 @@
         <w:jc w:val="both"/>
       </w:pPr>
       <w:r>
-        <w:t xml:space="preserve">The evidence establishes a gap narrower than “Nepal lacks blood donor software”: the missing piece is an </w:t>
-      </w:r>
-      <w:r>
-        <w:t xml:space="preserve">affordable, locally relevant platform that reliably registers donors, matches requests by compatibility and location, notifies donors automatically, gives hospitals real-time inventory control, and moderates abuse — without requiring infrastructure that a </w:t>
-      </w:r>
-      <w:r>
-        <w:t>Nepali institution cannot sustain. Hamro Donor shows the cost of a directory without a request lifecycle; Sankalp shows the value of one but does not transfer to Nepal. BloodBuddy combines the verified registry, automated notifications, request management,</w:t>
-      </w:r>
-      <w:r>
-        <w:t xml:space="preserve"> and hospital inventory integration in a single system purpose-built for Nepal's districts and institutions, consistent with evidence that the country's digital gap is most acute in public service domains (NIPoRe, 2023).</w:t>
+        <w:t>The evidence establishes a gap narrower than “Nepal lacks blood donor software”: the missing piece is an affordable, locally relevant platform that reliably registers donors, matches requests by compatibility and location, notifies donors automatically, gives hospitals real-time inventory control, and moderates abuse — without requiring infrastructure that a Nepali institution cannot sustain. Hamro Donor shows the cost of a directory without a request lifecycle; Sankalp shows the value of one but does not transfer to Nepal. BloodBuddy combines the verified registry, automated notifications, request management, and hospital inventory integration in a single system purpose-built for Nepal's districts and institutions, consistent with evidence that the country's digital gap is most acute in public service domains (NIPoRe, 2023).</w:t>
       </w:r>
     </w:p>
     <w:p>
@@ -8082,13 +7780,10 @@
       <w:pPr>
         <w:pStyle w:val="Heading1"/>
       </w:pPr>
-      <w:bookmarkStart w:id="27" w:name="_Toc240406105"/>
+      <w:bookmarkStart w:id="27" w:name="_Toc240543489"/>
       <w:r>
         <w:lastRenderedPageBreak/>
-        <w:t>CHAPTER 3: SYSTEM ANALYSIS AND DE</w:t>
-      </w:r>
-      <w:r>
-        <w:t>SIGN</w:t>
+        <w:t>CHAPTER 3: SYSTEM ANALYSIS AND DESIGN</w:t>
       </w:r>
       <w:bookmarkEnd w:id="27"/>
     </w:p>
@@ -8096,7 +7791,7 @@
       <w:pPr>
         <w:pStyle w:val="Heading2"/>
       </w:pPr>
-      <w:bookmarkStart w:id="28" w:name="_Toc240406106"/>
+      <w:bookmarkStart w:id="28" w:name="_Toc240543490"/>
       <w:r>
         <w:t>3.1 Requirements Summary</w:t>
       </w:r>
@@ -8107,31 +7802,16 @@
         <w:jc w:val="both"/>
       </w:pPr>
       <w:r>
-        <w:t>The functional requirements finalised in the proposal are carried forward as the contract this implementation must satisfy, numbered FR-01 to FR-14 for traceability; Section 5.4 traces each to its implementation and test evide</w:t>
-      </w:r>
-      <w:r>
-        <w:t>nce. The core functions are: user registration and authentication (FR-01); role-based access control across four roles (FR-02); the donor registry with availability toggling (FR-03); donor search and filtering with pagination (FR-04); blood request submiss</w:t>
-      </w:r>
-      <w:r>
-        <w:t>ion and tracking (FR-05); compatibility-based donor matching (FR-06); a public emergency flow with guest status lookup (FR-07); hospital inventory management (FR-08); hospital request queues and fulfilment (FR-09); hospital-scoped local APIs for five partn</w:t>
-      </w:r>
-      <w:r>
-        <w:t>er hospitals (FR-10); administration and moderation (FR-11); SMTP notifications (FR-12); database-stored images (FR-13); and AJAX/Fetch communication with a responsive, validated frontend (FR-14). Non-functional requirements NFR-01 to NFR-06 cover usabilit</w:t>
-      </w:r>
-      <w:r>
-        <w:t>y, security, reliability, maintainability, performance, and auditability. Two requirements deserve design emphasis: FR-06 (compatibility-based matching, the system's most safety-critical rule) and FR-10 (per-hospital data isolation).</w:t>
+        <w:t>The functional requirements finalised in the proposal are carried forward as the contract this implementation must satisfy, numbered FR-01 to FR-14 for traceability; Section 5.4 traces each to its implementation and test evidence. The core functions are: user registration and authentication (FR-01); role-based access control across four roles (FR-02); the donor registry with availability toggling (FR-03); donor search and filtering with pagination (FR-04); blood request submission and tracking (FR-05); compatibility-based donor matching (FR-06); a public emergency flow with guest status lookup (FR-07); hospital inventory management (FR-08); hospital request queues and fulfilment (FR-09); hospital-scoped local APIs for five partner hospitals (FR-10); administration and moderation (FR-11); SMTP notifications (FR-12); database-stored images (FR-13); and AJAX/Fetch communication with a responsive, validated frontend (FR-14). Non-functional requirements NFR-01 to NFR-06 cover usability, security, reliability, maintainability, performance, and auditability. Two requirements deserve design emphasis: FR-06 (compatibility-based matching, the system's most safety-critical rule) and FR-10 (per-hospital data isolation).</w:t>
       </w:r>
     </w:p>
     <w:p>
       <w:pPr>
         <w:pStyle w:val="Heading2"/>
       </w:pPr>
-      <w:bookmarkStart w:id="29" w:name="_Toc240406107"/>
-      <w:r>
-        <w:t>3.2 System Architectur</w:t>
-      </w:r>
-      <w:r>
-        <w:t>e</w:t>
+      <w:bookmarkStart w:id="29" w:name="_Toc240543491"/>
+      <w:r>
+        <w:t>3.2 System Architecture</w:t>
       </w:r>
       <w:bookmarkEnd w:id="29"/>
     </w:p>
@@ -8140,10 +7820,7 @@
         <w:jc w:val="both"/>
       </w:pPr>
       <w:r>
-        <w:t>BloodBuddy's backend is organised into the mandatory N-Tier layers. No layer skips its neighbour: controllers never touch repositories, and repositories contain no business logic. Donor matching, request status transitions, and inventory decrements are s</w:t>
-      </w:r>
-      <w:r>
-        <w:t>ervice-layer responsibilities; the frontend handles presentation and basic input validation only.</w:t>
+        <w:t>BloodBuddy's backend is organised into the mandatory N-Tier layers. No layer skips its neighbour: controllers never touch repositories, and repositories contain no business logic. Donor matching, request status transitions, and inventory decrements are service-layer responsibilities; the frontend handles presentation and basic input validation only.</w:t>
       </w:r>
     </w:p>
     <w:p>
@@ -8158,7 +7835,7 @@
         </w:rPr>
         <w:lastRenderedPageBreak/>
         <w:drawing>
-          <wp:inline distT="0" distB="0" distL="0" distR="0" wp14:anchorId="18205453" wp14:editId="2B4FBA83">
+          <wp:inline distT="0" distB="0" distL="0" distR="0" wp14:anchorId="1030527A" wp14:editId="28D8C653">
             <wp:extent cx="5040000" cy="4222400"/>
             <wp:effectExtent l="0" t="0" r="0" b="0"/>
             <wp:docPr id="2" name="Picture 2"/>
@@ -8250,14 +7927,7 @@
           <w:rFonts w:ascii="Courier New" w:hAnsi="Courier New"/>
           <w:sz w:val="18"/>
         </w:rPr>
-        <w:t xml:space="preserve">AuthController, </w:t>
-      </w:r>
-      <w:r>
-        <w:rPr>
-          <w:rFonts w:ascii="Courier New" w:hAnsi="Courier New"/>
-          <w:sz w:val="18"/>
-        </w:rPr>
-        <w:t>DonorController, RequestController, HospitalController, InventoryController, AdminController, ProfileController — one hospital-scoped controller module per partner hospital</w:t>
+        <w:t>AuthController, DonorController, RequestController, HospitalController, InventoryController, AdminController, ProfileController — one hospital-scoped controller module per partner hospital</w:t>
       </w:r>
     </w:p>
     <w:p>
@@ -8278,14 +7948,7 @@
           <w:rFonts w:ascii="Courier New" w:hAnsi="Courier New"/>
           <w:sz w:val="18"/>
         </w:rPr>
-        <w:t>matching *Service / *ServiceImpl per domain: DonorSearchService, BloodRe</w:t>
-      </w:r>
-      <w:r>
-        <w:rPr>
-          <w:rFonts w:ascii="Courier New" w:hAnsi="Courier New"/>
-          <w:sz w:val="18"/>
-        </w:rPr>
-        <w:t>questService, InventoryService, NotificationService, AdminService</w:t>
+        <w:t>matching *Service / *ServiceImpl per domain: DonorSearchService, BloodRequestService, InventoryService, NotificationService, AdminService</w:t>
       </w:r>
     </w:p>
     <w:p>
@@ -8348,14 +8011,7 @@
           <w:rFonts w:ascii="Courier New" w:hAnsi="Courier New"/>
           <w:sz w:val="18"/>
         </w:rPr>
-        <w:t>request/response bodies (entities never</w:t>
-      </w:r>
-      <w:r>
-        <w:rPr>
-          <w:rFonts w:ascii="Courier New" w:hAnsi="Courier New"/>
-          <w:sz w:val="18"/>
-        </w:rPr>
-        <w:t xml:space="preserve"> exposed directly)</w:t>
+        <w:t>request/response bodies (entities never exposed directly)</w:t>
       </w:r>
     </w:p>
     <w:p>
@@ -8405,13 +8061,7 @@
         <w:jc w:val="both"/>
       </w:pPr>
       <w:r>
-        <w:t>The presentation layer as built is a framework-free HTML/CSS</w:t>
-      </w:r>
-      <w:r>
-        <w:t>/JavaScript application of 23 pages organised into public pages (landing, about, contact, legal, 404), authentication pages, and four role portals, with five shared JavaScript modules: a session-aware navigation and role-guard module (nav.js), a validation</w:t>
-      </w:r>
-      <w:r>
-        <w:t xml:space="preserve"> module (bb-validate.js), the API facade (bb-api.js), a reusable pagination component (bb-paginate.js), a shared demo store (bb-store.js), and the compatibility module (bb-compat.js).</w:t>
+        <w:t>The presentation layer as built is a framework-free HTML/CSS/JavaScript application of 23 pages organised into public pages (landing, about, contact, legal, 404), authentication pages, and four role portals, with five shared JavaScript modules: a session-aware navigation and role-guard module (nav.js), a validation module (bb-validate.js), the API facade (bb-api.js), a reusable pagination component (bb-paginate.js), a shared demo store (bb-store.js), and the compatibility module (bb-compat.js).</w:t>
       </w:r>
     </w:p>
     <w:p>
@@ -8425,14 +8075,7 @@
           <w:i/>
           <w:sz w:val="19"/>
         </w:rPr>
-        <w:t>[INSERT SCREENSHOT: Figure 4-1 — VS Code explorer showing CODE/HTML, COD</w:t>
-      </w:r>
-      <w:r>
-        <w:rPr>
-          <w:i/>
-          <w:sz w:val="19"/>
-        </w:rPr>
-        <w:t>E/js (nav.js,</w:t>
+        <w:t>[INSERT SCREENSHOT: Figure 4-1 — VS Code explorer showing CODE/HTML, CODE/js (nav.js,</w:t>
       </w:r>
     </w:p>
     <w:p>
@@ -8462,7 +8105,7 @@
       <w:pPr>
         <w:pStyle w:val="Heading2"/>
       </w:pPr>
-      <w:bookmarkStart w:id="30" w:name="_Toc240406108"/>
+      <w:bookmarkStart w:id="30" w:name="_Toc240543492"/>
       <w:r>
         <w:lastRenderedPageBreak/>
         <w:t>3.3 Use Case Model</w:t>
@@ -8480,14 +8123,7 @@
           <w:i/>
           <w:sz w:val="19"/>
         </w:rPr>
-        <w:t xml:space="preserve">[INSERT DIAGRAM: Figure 3-2 — use case diagram: Donor (register, manage </w:t>
-      </w:r>
-      <w:r>
-        <w:rPr>
-          <w:i/>
-          <w:sz w:val="19"/>
-        </w:rPr>
-        <w:t>profile and availability,</w:t>
+        <w:t>[INSERT DIAGRAM: Figure 3-2 — use case diagram: Donor (register, manage profile and availability,</w:t>
       </w:r>
     </w:p>
     <w:p>
@@ -8529,14 +8165,7 @@
           <w:i/>
           <w:sz w:val="19"/>
         </w:rPr>
-        <w:t>(login, manage inventory, review que</w:t>
-      </w:r>
-      <w:r>
-        <w:rPr>
-          <w:i/>
-          <w:sz w:val="19"/>
-        </w:rPr>
-        <w:t>ue, accept/fulfil requests, update stock); Administrator (manage</w:t>
+        <w:t>(login, manage inventory, review queue, accept/fulfil requests, update stock); Administrator (manage</w:t>
       </w:r>
     </w:p>
     <w:p>
@@ -8580,12 +8209,9 @@
       <w:pPr>
         <w:pStyle w:val="Heading2"/>
       </w:pPr>
-      <w:bookmarkStart w:id="31" w:name="_Toc240406109"/>
-      <w:r>
-        <w:t>3.4 Entity Relationship Desig</w:t>
-      </w:r>
-      <w:r>
-        <w:t>n</w:t>
+      <w:bookmarkStart w:id="31" w:name="_Toc240543493"/>
+      <w:r>
+        <w:t>3.4 Entity Relationship Design</w:t>
       </w:r>
       <w:bookmarkEnd w:id="31"/>
     </w:p>
@@ -8600,7 +8226,7 @@
           <w:noProof/>
         </w:rPr>
         <w:drawing>
-          <wp:inline distT="0" distB="0" distL="0" distR="0" wp14:anchorId="2CB2FC92" wp14:editId="699043BB">
+          <wp:inline distT="0" distB="0" distL="0" distR="0" wp14:anchorId="1F3D13E1" wp14:editId="05305B49">
             <wp:extent cx="5040000" cy="4838400"/>
             <wp:effectExtent l="0" t="0" r="0" b="0"/>
             <wp:docPr id="3" name="Picture 3"/>
@@ -8825,13 +8451,7 @@
               <w:rPr>
                 <w:sz w:val="19"/>
               </w:rPr>
-              <w:t xml:space="preserve">A requester owns many </w:t>
-            </w:r>
-            <w:r>
-              <w:rPr>
-                <w:sz w:val="19"/>
-              </w:rPr>
-              <w:t>requests</w:t>
+              <w:t>A requester owns many requests</w:t>
             </w:r>
           </w:p>
         </w:tc>
@@ -8884,14 +8504,14 @@
               <w:rPr>
                 <w:sz w:val="19"/>
               </w:rPr>
-              <w:t xml:space="preserve">A donor may serve multiple requests; each request is served </w:t>
+              <w:t xml:space="preserve">A donor may serve multiple requests; each request is served by at most one donor (matched at </w:t>
             </w:r>
             <w:r>
               <w:rPr>
                 <w:sz w:val="19"/>
               </w:rPr>
               <w:lastRenderedPageBreak/>
-              <w:t>by at most one donor (matched at accept)</w:t>
+              <w:t>accept)</w:t>
             </w:r>
           </w:p>
         </w:tc>
@@ -9065,6 +8685,44 @@
             <w:tcW w:w="3061" w:type="dxa"/>
           </w:tcPr>
           <w:p>
+            <w:r>
+              <w:t xml:space="preserve">Donor ↔ Hospital </w:t>
+            </w:r>
+            <w:r>
+              <w:t>(affiliation)</w:t>
+            </w:r>
+          </w:p>
+        </w:tc>
+        <w:tc>
+          <w:tcPr>
+            <w:tcW w:w="3061" w:type="dxa"/>
+          </w:tcPr>
+          <w:p>
+            <w:r>
+              <w:t>M:N</w:t>
+            </w:r>
+          </w:p>
+        </w:tc>
+        <w:tc>
+          <w:tcPr>
+            <w:tcW w:w="3061" w:type="dxa"/>
+          </w:tcPr>
+          <w:p>
+            <w:r>
+              <w:t>A donor is registered with the partner hospitals in their own district — "the blood banks near you". Realised as the donor_hospital_affiliation join table (CPJ119 §2.3)</w:t>
+            </w:r>
+          </w:p>
+        </w:tc>
+      </w:tr>
+      <w:tr>
+        <w:trPr>
+          <w:jc w:val="center"/>
+        </w:trPr>
+        <w:tc>
+          <w:tcPr>
+            <w:tcW w:w="3061" w:type="dxa"/>
+          </w:tcPr>
+          <w:p>
             <w:pPr>
               <w:spacing w:after="40"/>
             </w:pPr>
@@ -9097,20 +8755,11 @@
             <w:tcW w:w="3061" w:type="dxa"/>
           </w:tcPr>
           <w:p>
-            <w:pPr>
-              <w:spacing w:after="40"/>
-            </w:pPr>
-            <w:r>
-              <w:rPr>
-                <w:sz w:val="19"/>
-              </w:rPr>
-              <w:t>Realised through the Appendix A compatibility chart; drives donor ma</w:t>
-            </w:r>
-            <w:r>
-              <w:rPr>
-                <w:sz w:val="19"/>
-              </w:rPr>
-              <w:t>tching</w:t>
+            <w:r>
+              <w:t>Realised through the Appendi</w:t>
+            </w:r>
+            <w:r>
+              <w:t>x A compatibility chart; drives donor matching. A compatibility rule, not a physical join table</w:t>
             </w:r>
           </w:p>
         </w:tc>
@@ -9301,13 +8950,7 @@
               <w:rPr>
                 <w:sz w:val="19"/>
               </w:rPr>
-              <w:t xml:space="preserve">Unique user identifier; name, email, phone, role enum </w:t>
-            </w:r>
-            <w:r>
-              <w:rPr>
-                <w:sz w:val="19"/>
-              </w:rPr>
-              <w:t>(DONOR/REQUESTER/HOSPITAL/ADMIN), status (ACTIVE/SUSPENDED)</w:t>
+              <w:t>Unique user identifier; name, email, phone, role enum (DONOR/REQUESTER/HOSPITAL/ADMIN), status (ACTIVE/SUSPENDED)</w:t>
             </w:r>
           </w:p>
         </w:tc>
@@ -9413,13 +9056,7 @@
               <w:rPr>
                 <w:sz w:val="19"/>
               </w:rPr>
-              <w:t>Unique request; blood group, units, needed-by date,</w:t>
-            </w:r>
-            <w:r>
-              <w:rPr>
-                <w:sz w:val="19"/>
-              </w:rPr>
-              <w:t xml:space="preserve"> urgency, district, hospital, contact; status (PENDING/MATCHED/FULFILLED/CANCELLED/REJECTED); timeline entries; guest requests carry an EM- public identifier</w:t>
+              <w:t>Unique request; blood group, units, needed-by date, urgency, district, hospital, contact; status (PENDING/MATCHED/FULFILLED/CANCELLED/REJECTED); timeline entries; guest requests carry an EM- public identifier</w:t>
             </w:r>
           </w:p>
         </w:tc>
@@ -9593,7 +9230,7 @@
       <w:pPr>
         <w:pStyle w:val="Heading2"/>
       </w:pPr>
-      <w:bookmarkStart w:id="32" w:name="_Toc240406110"/>
+      <w:bookmarkStart w:id="32" w:name="_Toc240543494"/>
       <w:r>
         <w:t>3.5 Class Design</w:t>
       </w:r>
@@ -9604,13 +9241,7 @@
         <w:jc w:val="both"/>
       </w:pPr>
       <w:r>
-        <w:t xml:space="preserve">The class structure inherits </w:t>
-      </w:r>
-      <w:r>
-        <w:t>from an abstract User base class specialised by role, with the request, inventory, and notification classes associated to it, and service interfaces encapsulating the business operations (DonorSearchService, BloodRequestService, InventoryService, Notificat</w:t>
-      </w:r>
-      <w:r>
-        <w:t>ionService).</w:t>
+        <w:t>The class structure inherits from an abstract User base class specialised by role, with the request, inventory, and notification classes associated to it, and service interfaces encapsulating the business operations (DonorSearchService, BloodRequestService, InventoryService, NotificationService).</w:t>
       </w:r>
     </w:p>
     <w:p>
@@ -9625,7 +9256,7 @@
         </w:rPr>
         <w:lastRenderedPageBreak/>
         <w:drawing>
-          <wp:inline distT="0" distB="0" distL="0" distR="0" wp14:anchorId="5E833CD7" wp14:editId="6BC1F120">
+          <wp:inline distT="0" distB="0" distL="0" distR="0" wp14:anchorId="2B2AAA01" wp14:editId="1EC8C1D4">
             <wp:extent cx="5040000" cy="5062400"/>
             <wp:effectExtent l="0" t="0" r="0" b="0"/>
             <wp:docPr id="4" name="Picture 4"/>
@@ -9674,7 +9305,7 @@
       <w:pPr>
         <w:pStyle w:val="Heading2"/>
       </w:pPr>
-      <w:bookmarkStart w:id="33" w:name="_Toc240406111"/>
+      <w:bookmarkStart w:id="33" w:name="_Toc240543495"/>
       <w:r>
         <w:t>3.6 Data Flow</w:t>
       </w:r>
@@ -9705,14 +9336,7 @@
           <w:i/>
           <w:sz w:val="19"/>
         </w:rPr>
-        <w:t xml:space="preserve">Search, 3 Blood Request Management, 4 Inventory Management, 5 </w:t>
-      </w:r>
-      <w:r>
-        <w:rPr>
-          <w:i/>
-          <w:sz w:val="19"/>
-        </w:rPr>
-        <w:t>Notification Management,</w:t>
+        <w:t>Search, 3 Blood Request Management, 4 Inventory Management, 5 Notification Management,</w:t>
       </w:r>
     </w:p>
     <w:p>
@@ -9756,7 +9380,7 @@
       <w:pPr>
         <w:pStyle w:val="Heading2"/>
       </w:pPr>
-      <w:bookmarkStart w:id="34" w:name="_Toc240406112"/>
+      <w:bookmarkStart w:id="34" w:name="_Toc240543496"/>
       <w:r>
         <w:t>3.7 Business Rules</w:t>
       </w:r>
@@ -9926,20 +9550,14 @@
               <w:rPr>
                 <w:sz w:val="19"/>
               </w:rPr>
-              <w:t>A request f</w:t>
-            </w:r>
-            <w:r>
-              <w:rPr>
-                <w:sz w:val="19"/>
-              </w:rPr>
-              <w:t xml:space="preserve">ollows Pending → Matched → Fulfilled; Cancelled </w:t>
+              <w:t xml:space="preserve">A request follows Pending → Matched → Fulfilled; Cancelled and Rejected are terminal and </w:t>
             </w:r>
             <w:r>
               <w:rPr>
                 <w:sz w:val="19"/>
               </w:rPr>
               <w:lastRenderedPageBreak/>
-              <w:t>and Rejected are terminal and cannot change</w:t>
+              <w:t>cannot change</w:t>
             </w:r>
           </w:p>
         </w:tc>
@@ -9956,14 +9574,7 @@
                 <w:sz w:val="19"/>
               </w:rPr>
               <w:lastRenderedPageBreak/>
-              <w:t xml:space="preserve">Status transition guard in the </w:t>
-            </w:r>
-            <w:r>
-              <w:rPr>
-                <w:sz w:val="19"/>
-              </w:rPr>
-              <w:lastRenderedPageBreak/>
-              <w:t>request service</w:t>
+              <w:t>Status transition guard in the request service</w:t>
             </w:r>
           </w:p>
         </w:tc>
@@ -9984,7 +9595,6 @@
               <w:rPr>
                 <w:sz w:val="19"/>
               </w:rPr>
-              <w:lastRenderedPageBreak/>
               <w:t>BR-3</w:t>
             </w:r>
           </w:p>
@@ -10017,13 +9627,7 @@
               <w:rPr>
                 <w:sz w:val="19"/>
               </w:rPr>
-              <w:t>Single donor stamp on accept; subsequent accepts rejected (unique</w:t>
-            </w:r>
-            <w:r>
-              <w:rPr>
-                <w:sz w:val="19"/>
-              </w:rPr>
-              <w:t xml:space="preserve"> match)</w:t>
+              <w:t>Single donor stamp on accept; subsequent accepts rejected (unique match)</w:t>
             </w:r>
           </w:p>
         </w:tc>
@@ -10219,13 +9823,7 @@
               <w:rPr>
                 <w:sz w:val="19"/>
               </w:rPr>
-              <w:t>Donors see only open requests they ca</w:t>
-            </w:r>
-            <w:r>
-              <w:rPr>
-                <w:sz w:val="19"/>
-              </w:rPr>
-              <w:t>n serve; a decline hides the request for that donor only and never mutates the request</w:t>
+              <w:t>Donors see only open requests they can serve; a decline hides the request for that donor only and never mutates the request</w:t>
             </w:r>
           </w:p>
         </w:tc>
@@ -10315,13 +9913,7 @@
               <w:rPr>
                 <w:sz w:val="19"/>
               </w:rPr>
-              <w:t>BR-</w:t>
-            </w:r>
-            <w:r>
-              <w:rPr>
-                <w:sz w:val="19"/>
-              </w:rPr>
-              <w:t>9</w:t>
+              <w:t>BR-9</w:t>
             </w:r>
           </w:p>
         </w:tc>
@@ -10368,7 +9960,7 @@
       <w:pPr>
         <w:pStyle w:val="Heading2"/>
       </w:pPr>
-      <w:bookmarkStart w:id="35" w:name="_Toc240406113"/>
+      <w:bookmarkStart w:id="35" w:name="_Toc240543497"/>
       <w:r>
         <w:t>3.8 Design Refinements from Proposal to Implementation</w:t>
       </w:r>
@@ -10379,10 +9971,7 @@
         <w:jc w:val="both"/>
       </w:pPr>
       <w:r>
-        <w:t xml:space="preserve">Four design details were refined between the proposal-stage design and </w:t>
-      </w:r>
-      <w:r>
-        <w:t>the implemented system, in the normal course of testing and hardening — recorded here for transparency:</w:t>
+        <w:t>Four design details were refined between the proposal-stage design and the implemented system, in the normal course of testing and hardening — recorded here for transparency:</w:t>
       </w:r>
     </w:p>
     <w:p>
@@ -10391,10 +9980,7 @@
         <w:spacing w:after="60"/>
       </w:pPr>
       <w:r>
-        <w:t>Single API facade. The proposal specified AJAX/Fetch calls to REST endpoints; implementation concentrated every call in one shared module (bb-api.js) th</w:t>
-      </w:r>
-      <w:r>
-        <w:t>at mirrors the proposal's Appendix B endpoints, so pages never touch the transport directly and the swap from the demonstration store to the real Spring backend is a single configuration flag.</w:t>
+        <w:t>Single API facade. The proposal specified AJAX/Fetch calls to REST endpoints; implementation concentrated every call in one shared module (bb-api.js) that mirrors the proposal's Appendix B endpoints, so pages never touch the transport directly and the swap from the demonstration store to the real Spring backend is a single configuration flag.</w:t>
       </w:r>
     </w:p>
     <w:p>
@@ -10403,13 +9989,7 @@
         <w:spacing w:after="60"/>
       </w:pPr>
       <w:r>
-        <w:t>Compatibility rule centralised. The Appendix A chart was initia</w:t>
-      </w:r>
-      <w:r>
-        <w:t>lly duplicated in the two request forms; donor matching would have required a third copy, so it was extracted into one shared module (bb-compat.js) with the matching direction documented — recipient → compatible donor groups — after testing showed that rea</w:t>
-      </w:r>
-      <w:r>
-        <w:t>ding the chart backwards would offer a donor a patient they must not give blood to.</w:t>
+        <w:t>Compatibility rule centralised. The Appendix A chart was initially duplicated in the two request forms; donor matching would have required a third copy, so it was extracted into one shared module (bb-compat.js) with the matching direction documented — recipient → compatible donor groups — after testing showed that reading the chart backwards would offer a donor a patient they must not give blood to.</w:t>
       </w:r>
     </w:p>
     <w:p>
@@ -10418,10 +9998,7 @@
         <w:spacing w:after="60"/>
       </w:pPr>
       <w:r>
-        <w:t>Hospital name normalisation. The five partner hospitals are referred to by several natural variants (abbreviations and full names) across the interface; an alias table norm</w:t>
-      </w:r>
-      <w:r>
-        <w:t>alises every submitted request to canonical hospital labels so that requests forwarded or submitted under variant names land in the correct hospital queue's equality filter.</w:t>
+        <w:t>Hospital name normalisation. The five partner hospitals are referred to by several natural variants (abbreviations and full names) across the interface; an alias table normalises every submitted request to canonical hospital labels so that requests forwarded or submitted under variant names land in the correct hospital queue's equality filter.</w:t>
       </w:r>
     </w:p>
     <w:p>
@@ -10430,22 +10007,15 @@
         <w:spacing w:after="60"/>
       </w:pPr>
       <w:r>
-        <w:t xml:space="preserve">Status vocabulary finalised. Request statuses were finalised as Pending → Matched </w:t>
-      </w:r>
-      <w:r>
-        <w:t>→ Fulfilled, with Cancelled and Rejected as terminal outcomes, each status change recorded as a timeline entry on the request — replacing the proposal's informal “open/closed” wording and aligning the tracker, hospital queue, and moderation views on one vo</w:t>
-      </w:r>
-      <w:r>
-        <w:t>cabulary.</w:t>
+        <w:t>Status vocabulary finalised. Request statuses were finalised as Pending → Matched → Fulfilled, with Cancelled and Rejected as terminal outcomes, each status change recorded as a timeline entry on the request — replacing the proposal's informal “open/closed” wording and aligning the tracker, hospital queue, and moderation views on one vocabulary.</w:t>
       </w:r>
     </w:p>
     <w:p>
       <w:pPr>
         <w:pStyle w:val="Heading2"/>
       </w:pPr>
-      <w:bookmarkStart w:id="36" w:name="_Toc240406114"/>
-      <w:r>
-        <w:lastRenderedPageBreak/>
+      <w:bookmarkStart w:id="36" w:name="_Toc240543498"/>
+      <w:r>
         <w:t>3.9 Security Design</w:t>
       </w:r>
       <w:bookmarkEnd w:id="36"/>
@@ -10456,10 +10026,11 @@
         <w:spacing w:after="60"/>
       </w:pPr>
       <w:r>
-        <w:t>Role-based access control across four roles. In the demonstration build, role-private pages are guarded client-side: logged-out visitors are bounced to the login page and wrong-role users to their own dashboard, with the block</w:t>
-      </w:r>
-      <w:r>
-        <w:t>ed URL stashed so login can continue to the original target — but only if the role selected at login may actually access it.</w:t>
+        <w:t xml:space="preserve">Role-based access control across four roles. In the demonstration build, role-private pages are guarded client-side: logged-out visitors are bounced to the login page and wrong-role </w:t>
+      </w:r>
+      <w:r>
+        <w:lastRenderedPageBreak/>
+        <w:t>users to their own dashboard, with the blocked URL stashed so login can continue to the original target — but only if the role selected at login may actually access it.</w:t>
       </w:r>
     </w:p>
     <w:p>
@@ -10468,10 +10039,7 @@
         <w:spacing w:after="60"/>
       </w:pPr>
       <w:r>
-        <w:t>Server-side enforcement by design. The authoritative gate is Spring Security in the service layer: route rules make /api/auth/** pu</w:t>
-      </w:r>
-      <w:r>
-        <w:t>blic, /api/admin/** administrator-only, and /api/hospitals/{hospitalId}/** accessible only to that hospital's staff, so hiding frontend elements is never mistaken for security.</w:t>
+        <w:t>Server-side enforcement by design. The authoritative gate is Spring Security in the service layer: route rules make /api/auth/** public, /api/admin/** administrator-only, and /api/hospitals/{hospitalId}/** accessible only to that hospital's staff, so hiding frontend elements is never mistaken for security.</w:t>
       </w:r>
     </w:p>
     <w:p>
@@ -10480,10 +10048,7 @@
         <w:spacing w:after="60"/>
       </w:pPr>
       <w:r>
-        <w:t xml:space="preserve">Hospital data isolation. Every hospital-scoped endpoint is keyed by hospitalId </w:t>
-      </w:r>
-      <w:r>
-        <w:t>and scoped to that institution's inventory and queue only, per requirement FR-10.</w:t>
+        <w:t>Hospital data isolation. Every hospital-scoped endpoint is keyed by hospitalId and scoped to that institution's inventory and queue only, per requirement FR-10.</w:t>
       </w:r>
     </w:p>
     <w:p>
@@ -10492,10 +10057,7 @@
         <w:spacing w:after="60"/>
       </w:pPr>
       <w:r>
-        <w:t>Validation on both ends. Shared client-side validation covers email, phone, blood group format, password strength, future dates, units, and required consent; corresponding se</w:t>
-      </w:r>
-      <w:r>
-        <w:t>rver-side validation is part of the scheduled backend, per the assignment's requirement that input validation is required on both the frontend and backend.</w:t>
+        <w:t>Validation on both ends. Shared client-side validation covers email, phone, blood group format, password strength, future dates, units, and required consent; corresponding server-side validation is part of the scheduled backend, per the assignment's requirement that input validation is required on both the frontend and backend.</w:t>
       </w:r>
     </w:p>
     <w:p>
@@ -10504,10 +10066,7 @@
         <w:spacing w:after="60"/>
       </w:pPr>
       <w:r>
-        <w:t>Guest privacy guard. The public emergency status lookup answers guest request IDs (EM-…) but explici</w:t>
-      </w:r>
-      <w:r>
-        <w:t>tly rejects member request IDs (BB-…), so the public endpoint cannot be used to read members' requests.</w:t>
+        <w:t>Guest privacy guard. The public emergency status lookup answers guest request IDs (EM-…) but explicitly rejects member request IDs (BB-…), so the public endpoint cannot be used to read members' requests.</w:t>
       </w:r>
     </w:p>
     <w:p>
@@ -10528,7 +10087,7 @@
       <w:pPr>
         <w:pStyle w:val="Heading1"/>
       </w:pPr>
-      <w:bookmarkStart w:id="37" w:name="_Toc240406115"/>
+      <w:bookmarkStart w:id="37" w:name="_Toc240543499"/>
       <w:r>
         <w:lastRenderedPageBreak/>
         <w:t>CHAPTER 4: IMPLEMENTATION</w:t>
@@ -10539,12 +10098,9 @@
       <w:pPr>
         <w:pStyle w:val="Heading2"/>
       </w:pPr>
-      <w:bookmarkStart w:id="38" w:name="_Toc240406116"/>
-      <w:r>
-        <w:t>4.</w:t>
-      </w:r>
-      <w:r>
-        <w:t>1 Development Environment and Approach</w:t>
+      <w:bookmarkStart w:id="38" w:name="_Toc240543500"/>
+      <w:r>
+        <w:t>4.1 Development Environment and Approach</w:t>
       </w:r>
       <w:bookmarkEnd w:id="38"/>
     </w:p>
@@ -10553,13 +10109,7 @@
         <w:jc w:val="both"/>
       </w:pPr>
       <w:r>
-        <w:t>Frontend: HTML, CSS, and vanilla JavaScript in VS Code — no frameworks and no build step — with quality verification driven by headless Chrome automation. Backend (scheduled implementation phase): Java + Spring Boot (</w:t>
-      </w:r>
-      <w:r>
-        <w:t>Spring MVC, Spring Security, Spring Data JPA, Spring Mail, Validation, Lombok), MySQL, IntelliJ IDEA. API testing: Postman. A Python test stub serves the static site and an Appendix B REST stub on one port so the AJAX/Fetch layer can be exercised over real</w:t>
-      </w:r>
-      <w:r>
-        <w:t xml:space="preserve"> HTTP before the Spring backend exists.</w:t>
+        <w:t>Frontend: HTML, CSS, and vanilla JavaScript in VS Code — no frameworks and no build step — with quality verification driven by headless Chrome automation. Backend (scheduled implementation phase): Java + Spring Boot (Spring MVC, Spring Security, Spring Data JPA, Spring Mail, Validation, Lombok), MySQL, IntelliJ IDEA. API testing: Postman. A Python test stub serves the static site and an Appendix B REST stub on one port so the AJAX/Fetch layer can be exercised over real HTTP before the Spring backend exists.</w:t>
       </w:r>
     </w:p>
     <w:p>
@@ -10567,10 +10117,7 @@
         <w:jc w:val="both"/>
       </w:pPr>
       <w:r>
-        <w:t>Implementation followed a dependency-ordered roadmap (Table 4-1), with the automated QA harness run at the end of every session before proceeding — most consequentially after the request lifecycle and after the real-</w:t>
-      </w:r>
-      <w:r>
-        <w:t>mode transport work.</w:t>
+        <w:t>Implementation followed a dependency-ordered roadmap (Table 4-1), with the automated QA harness run at the end of every session before proceeding — most consequentially after the request lifecycle and after the real-mode transport work.</w:t>
       </w:r>
     </w:p>
     <w:p>
@@ -10737,13 +10284,7 @@
               <w:rPr>
                 <w:sz w:val="19"/>
               </w:rPr>
-              <w:t xml:space="preserve">Shared modules: </w:t>
-            </w:r>
-            <w:r>
-              <w:rPr>
-                <w:sz w:val="19"/>
-              </w:rPr>
-              <w:t>bb-validate.js, bb-api.js, bb-paginate.js, bb-compat.js, demo store</w:t>
+              <w:t>Shared modules: bb-validate.js, bb-api.js, bb-paginate.js, bb-compat.js, demo store</w:t>
             </w:r>
           </w:p>
         </w:tc>
@@ -10812,13 +10353,7 @@
               <w:rPr>
                 <w:sz w:val="19"/>
               </w:rPr>
-              <w:t>Role-aware nav on every page; private pages bounce c</w:t>
-            </w:r>
-            <w:r>
-              <w:rPr>
-                <w:sz w:val="19"/>
-              </w:rPr>
-              <w:t>orrectly; return-URL continuation</w:t>
+              <w:t>Role-aware nav on every page; private pages bounce correctly; return-URL continuation</w:t>
             </w:r>
           </w:p>
         </w:tc>
@@ -10908,13 +10443,7 @@
               <w:rPr>
                 <w:sz w:val="19"/>
               </w:rPr>
-              <w:t xml:space="preserve">Request forms (member + public emergency) with inline </w:t>
-            </w:r>
-            <w:r>
-              <w:rPr>
-                <w:sz w:val="19"/>
-              </w:rPr>
-              <w:t>validation</w:t>
+              <w:t>Request forms (member + public emergency) with inline validation</w:t>
             </w:r>
           </w:p>
         </w:tc>
@@ -11020,13 +10549,7 @@
               <w:rPr>
                 <w:sz w:val="19"/>
               </w:rPr>
-              <w:t>H</w:t>
-            </w:r>
-            <w:r>
-              <w:rPr>
-                <w:sz w:val="19"/>
-              </w:rPr>
-              <w:t>ospital portal: inventory management + request queue</w:t>
+              <w:t>Hospital portal: inventory management + request queue</w:t>
             </w:r>
           </w:p>
         </w:tc>
@@ -11095,13 +10618,7 @@
               <w:rPr>
                 <w:sz w:val="19"/>
               </w:rPr>
-              <w:t xml:space="preserve">Live KPI counts; suspend; forward flow; Emergency </w:t>
-            </w:r>
-            <w:r>
-              <w:rPr>
-                <w:sz w:val="19"/>
-              </w:rPr>
-              <w:t>badges; demo reset</w:t>
+              <w:t>Live KPI counts; suspend; forward flow; Emergency badges; demo reset</w:t>
             </w:r>
           </w:p>
         </w:tc>
@@ -11207,13 +10724,7 @@
               <w:rPr>
                 <w:sz w:val="19"/>
               </w:rPr>
-              <w:t>Legal pages site-wide; branded 404 made responsiv</w:t>
-            </w:r>
-            <w:r>
-              <w:rPr>
-                <w:sz w:val="19"/>
-              </w:rPr>
-              <w:t>e</w:t>
+              <w:t>Legal pages site-wide; branded 404 made responsive</w:t>
             </w:r>
           </w:p>
         </w:tc>
@@ -11356,13 +10867,7 @@
               <w:rPr>
                 <w:sz w:val="19"/>
               </w:rPr>
-              <w:t xml:space="preserve">Real-mode transport </w:t>
-            </w:r>
-            <w:r>
-              <w:rPr>
-                <w:sz w:val="19"/>
-              </w:rPr>
-              <w:t>verification over HTTP</w:t>
+              <w:t>Real-mode transport verification over HTTP</w:t>
             </w:r>
           </w:p>
         </w:tc>
@@ -11378,14 +10883,7 @@
               <w:rPr>
                 <w:sz w:val="19"/>
               </w:rPr>
-              <w:t xml:space="preserve">16/16 checks against REST stub; /api/api regression caught, fixed, </w:t>
-            </w:r>
-            <w:r>
-              <w:rPr>
-                <w:sz w:val="19"/>
-              </w:rPr>
-              <w:lastRenderedPageBreak/>
-              <w:t>negative-tested</w:t>
+              <w:t>16/16 checks against REST stub; /api/api regression caught, fixed, negative-tested</w:t>
             </w:r>
           </w:p>
         </w:tc>
@@ -11400,8 +10898,9 @@
       <w:pPr>
         <w:pStyle w:val="Heading2"/>
       </w:pPr>
-      <w:bookmarkStart w:id="39" w:name="_Toc240406117"/>
-      <w:r>
+      <w:bookmarkStart w:id="39" w:name="_Toc240543501"/>
+      <w:r>
+        <w:lastRenderedPageBreak/>
         <w:t>4.2 Main System Flows</w:t>
       </w:r>
       <w:bookmarkEnd w:id="39"/>
@@ -11411,13 +10910,7 @@
         <w:jc w:val="both"/>
       </w:pPr>
       <w:r>
-        <w:t>The request lifecycle (Figure 1-1) is the system's backbone: a requester searches donors, submits a request (or a guest uses t</w:t>
-      </w:r>
-      <w:r>
-        <w:t>he public emergency form), the request enters the administrator's moderation queue and is forwarded to a partner hospital, compatible donors see and accept it (status Matched), and the hospital marks it fulfilled — closing the request and decrementing that</w:t>
-      </w:r>
-      <w:r>
-        <w:t xml:space="preserve"> hospital's stock for the blood group. Every state change is appended to the request's timeline and visible to the requester in the tracking view.</w:t>
+        <w:t>The request lifecycle (Figure 1-1) is the system's backbone: a requester searches donors, submits a request (or a guest uses the public emergency form), the request enters the administrator's moderation queue and is forwarded to a partner hospital, compatible donors see and accept it (status Matched), and the hospital marks it fulfilled — closing the request and decrementing that hospital's stock for the blood group. Every state change is appended to the request's timeline and visible to the requester in the tracking view.</w:t>
       </w:r>
     </w:p>
     <w:p>
@@ -11445,14 +10938,7 @@
           <w:i/>
           <w:sz w:val="19"/>
         </w:rPr>
-        <w:t>Donor accepts (</w:t>
-      </w:r>
-      <w:r>
-        <w:rPr>
-          <w:i/>
-          <w:sz w:val="19"/>
-        </w:rPr>
-        <w:t>Matched) → Hospital fulfils (Fulfilled, stock decremented); Cancelled/Rejected</w:t>
+        <w:t>Donor accepts (Matched) → Hospital fulfils (Fulfilled, stock decremented); Cancelled/Rejected</w:t>
       </w:r>
     </w:p>
     <w:p>
@@ -11483,13 +10969,7 @@
         <w:jc w:val="both"/>
       </w:pPr>
       <w:r>
-        <w:t>The donor discovery flow (landing → search → donor cards → request modal → tracking) preserve</w:t>
-      </w:r>
-      <w:r>
-        <w:t>s the built page sequence: search calls the donor search endpoint with blood group, district, and availability filters; results are paginated; the request modal creates the request through the API facade and redirects to tracking. The public emergency flow</w:t>
-      </w:r>
-      <w:r>
-        <w:t xml:space="preserve"> mirrors it for guests, issuing an EM- identifier and a status-lookup card.</w:t>
+        <w:t>The donor discovery flow (landing → search → donor cards → request modal → tracking) preserves the built page sequence: search calls the donor search endpoint with blood group, district, and availability filters; results are paginated; the request modal creates the request through the API facade and redirects to tracking. The public emergency flow mirrors it for guests, issuing an EM- identifier and a status-lookup card.</w:t>
       </w:r>
     </w:p>
     <w:p>
@@ -11526,14 +11006,7 @@
           <w:i/>
           <w:sz w:val="19"/>
         </w:rPr>
-        <w:t xml:space="preserve">[INSERT SCREENSHOT: </w:t>
-      </w:r>
-      <w:r>
-        <w:rPr>
-          <w:i/>
-          <w:sz w:val="19"/>
-        </w:rPr>
-        <w:t>requester-request.html — compatibility chips, future-date field, inline errors]</w:t>
+        <w:t>[INSERT SCREENSHOT: requester-request.html — compatibility chips, future-date field, inline errors]</w:t>
       </w:r>
     </w:p>
     <w:p>
@@ -11563,7 +11036,7 @@
       <w:pPr>
         <w:pStyle w:val="Heading2"/>
       </w:pPr>
-      <w:bookmarkStart w:id="40" w:name="_Toc240406118"/>
+      <w:bookmarkStart w:id="40" w:name="_Toc240543502"/>
       <w:r>
         <w:t>4.3 Key Implementations</w:t>
       </w:r>
@@ -11573,7 +11046,7 @@
       <w:pPr>
         <w:pStyle w:val="Heading3"/>
       </w:pPr>
-      <w:bookmarkStart w:id="41" w:name="_Toc240406119"/>
+      <w:bookmarkStart w:id="41" w:name="_Toc240543503"/>
       <w:r>
         <w:t>4.3.1 Compatibility-Based Donor Matching (FR-06 — safety-critical)</w:t>
       </w:r>
@@ -11584,13 +11057,7 @@
         <w:jc w:val="both"/>
       </w:pPr>
       <w:r>
-        <w:t>The Appendix A compatibility chart is implemented once, in bb-compat.js, and read in the correct clinical direction — recipient → compatible donor groups. To decide whether a donor may serv</w:t>
-      </w:r>
-      <w:r>
-        <w:t xml:space="preserve">e a request, the code asks isCompatible(donorGroup, recipientGroup), never whether the recipient's group appears in donorsFor(donorGroup); reading the chart backwards would offer a donor a patient they must not give blood to. The donor dashboard therefore </w:t>
-      </w:r>
-      <w:r>
-        <w:t>lists only open requests the logged-in donor can actually serve:</w:t>
+        <w:t>The Appendix A compatibility chart is implemented once, in bb-compat.js, and read in the correct clinical direction — recipient → compatible donor groups. To decide whether a donor may serve a request, the code asks isCompatible(donorGroup, recipientGroup), never whether the recipient's group appears in donorsFor(donorGroup); reading the chart backwards would offer a donor a patient they must not give blood to. The donor dashboard therefore lists only open requests the logged-in donor can actually serve:</w:t>
       </w:r>
     </w:p>
     <w:p>
@@ -11632,14 +11099,7 @@
           <w:rFonts w:ascii="Courier New" w:eastAsia="Courier New" w:hAnsi="Courier New"/>
           <w:sz w:val="17"/>
         </w:rPr>
-        <w:t xml:space="preserve">     </w:t>
-      </w:r>
-      <w:r>
-        <w:rPr>
-          <w:rFonts w:ascii="Courier New" w:eastAsia="Courier New" w:hAnsi="Courier New"/>
-          <w:sz w:val="17"/>
-        </w:rPr>
-        <w:t xml:space="preserve">          'B-': ['B-','O-'], 'AB+': ['AB+','AB-','A+','A-','B+','B-','O+','O-'],</w:t>
+        <w:t xml:space="preserve">               'B-': ['B-','O-'], 'AB+': ['AB+','AB-','A+','A-','B+','B-','O+','O-'],</w:t>
       </w:r>
     </w:p>
     <w:p>
@@ -11681,14 +11141,7 @@
           <w:rFonts w:ascii="Courier New" w:eastAsia="Courier New" w:hAnsi="Courier New"/>
           <w:sz w:val="17"/>
         </w:rPr>
-        <w:t>BloodBuddyCompat</w:t>
-      </w:r>
-      <w:r>
-        <w:rPr>
-          <w:rFonts w:ascii="Courier New" w:eastAsia="Courier New" w:hAnsi="Courier New"/>
-          <w:sz w:val="17"/>
-        </w:rPr>
-        <w:t>.isCompatible(donorGroup, recipientGroup);</w:t>
+        <w:t>BloodBuddyCompat.isCompatible(donorGroup, recipientGroup);</w:t>
       </w:r>
     </w:p>
     <w:p>
@@ -11715,18 +11168,18 @@
         <w:jc w:val="both"/>
       </w:pPr>
       <w:r>
+        <w:t xml:space="preserve">The same rule is verified by the automated suite (Section 5.2, TC-09): a B+ donor is offered B+ and AB+ recipients and never an A+ one. The module's header records that the </w:t>
+      </w:r>
+      <w:r>
         <w:lastRenderedPageBreak/>
-        <w:t>The same rule is verified by the automated suite (Section 5.2, TC-09): a B+ donor is offered B+ and AB+ recipients and never an A+</w:t>
-      </w:r>
-      <w:r>
-        <w:t xml:space="preserve"> one. The module's header records that the authoritative compatibility rule belongs in the Spring service layer, so a requester can never talk the frontend into an unsafe match.</w:t>
+        <w:t>authoritative compatibility rule belongs in the Spring service layer, so a requester can never talk the frontend into an unsafe match.</w:t>
       </w:r>
     </w:p>
     <w:p>
       <w:pPr>
         <w:pStyle w:val="Heading3"/>
       </w:pPr>
-      <w:bookmarkStart w:id="42" w:name="_Toc240406120"/>
+      <w:bookmarkStart w:id="42" w:name="_Toc240543504"/>
       <w:r>
         <w:t>4.3.2 Session Handling and Role-Based Access Control (FR-02)</w:t>
       </w:r>
@@ -11737,16 +11190,7 @@
         <w:jc w:val="both"/>
       </w:pPr>
       <w:r>
-        <w:t xml:space="preserve">The </w:t>
-      </w:r>
-      <w:r>
-        <w:t>demonstration build implements RBAC end-to-end at the page level: a session record ({role, name}) set at login/register drives a role-aware navigation rebuilt on every page; a guard map declares each private page's permitted role; logged-out visitors bounc</w:t>
-      </w:r>
-      <w:r>
-        <w:t>e to the login page and wrong-role users to their own dashboard; the blocked URL is stashed in session storage and the login page continues to it only if the selected role may access it; and in-page calls-to-action are swapped per role, so a donor is never</w:t>
-      </w:r>
-      <w:r>
-        <w:t xml:space="preserve"> offered a requester action such as “Request blood”:</w:t>
+        <w:t>The demonstration build implements RBAC end-to-end at the page level: a session record ({role, name}) set at login/register drives a role-aware navigation rebuilt on every page; a guard map declares each private page's permitted role; logged-out visitors bounce to the login page and wrong-role users to their own dashboard; the blocked URL is stashed in session storage and the login page continues to it only if the selected role may access it; and in-page calls-to-action are swapped per role, so a donor is never offered a requester action such as “Request blood”:</w:t>
       </w:r>
     </w:p>
     <w:p>
@@ -11788,14 +11232,7 @@
           <w:rFonts w:ascii="Courier New" w:eastAsia="Courier New" w:hAnsi="Courier New"/>
           <w:sz w:val="17"/>
         </w:rPr>
-        <w:t xml:space="preserve">              'admin-dashboard.html': ['admin'], 'requester-search.html': </w:t>
-      </w:r>
-      <w:r>
-        <w:rPr>
-          <w:rFonts w:ascii="Courier New" w:eastAsia="Courier New" w:hAnsi="Courier New"/>
-          <w:sz w:val="17"/>
-        </w:rPr>
-        <w:t>['requester'], ... }</w:t>
+        <w:t xml:space="preserve">              'admin-dashboard.html': ['admin'], 'requester-search.html': ['requester'], ... }</w:t>
       </w:r>
     </w:p>
     <w:p>
@@ -11836,17 +11273,14 @@
         <w:jc w:val="both"/>
       </w:pPr>
       <w:r>
-        <w:t xml:space="preserve">The corresponding server-side enforcement — Spring </w:t>
-      </w:r>
-      <w:r>
-        <w:t>Security route rules and role checks on every write endpoint — is specified in Section 3.9 and scheduled with the backend.</w:t>
+        <w:t>The corresponding server-side enforcement — Spring Security route rules and role checks on every write endpoint — is specified in Section 3.9 and scheduled with the backend.</w:t>
       </w:r>
     </w:p>
     <w:p>
       <w:pPr>
         <w:pStyle w:val="Heading3"/>
       </w:pPr>
-      <w:bookmarkStart w:id="43" w:name="_Toc240406121"/>
+      <w:bookmarkStart w:id="43" w:name="_Toc240543505"/>
       <w:r>
         <w:t>4.3.3 AJAX/Fetch API Facade with Mock/Real Transport (FR-14, CPJ119 §2.6)</w:t>
       </w:r>
@@ -11857,13 +11291,7 @@
         <w:jc w:val="both"/>
       </w:pPr>
       <w:r>
-        <w:t>Every page reaches the backend through one facade (bb-api.j</w:t>
-      </w:r>
-      <w:r>
-        <w:t>s) that mirrors the proposal's Appendix B endpoints. In mock mode it serves calls from the shared demonstration store with simulated latency; flipping one flag (MOCK = false) routes the identical calls through real fetch() to the Spring endpoints, so pages</w:t>
-      </w:r>
-      <w:r>
-        <w:t xml:space="preserve"> keep working unchanged:</w:t>
+        <w:t>Every page reaches the backend through one facade (bb-api.js) that mirrors the proposal's Appendix B endpoints. In mock mode it serves calls from the shared demonstration store with simulated latency; flipping one flag (MOCK = false) routes the identical calls through real fetch() to the Spring endpoints, so pages keep working unchanged:</w:t>
       </w:r>
     </w:p>
     <w:p>
@@ -11933,14 +11361,7 @@
           <w:rFonts w:ascii="Courier New" w:eastAsia="Courier New" w:hAnsi="Courier New"/>
           <w:sz w:val="17"/>
         </w:rPr>
-        <w:t xml:space="preserve">    headers: body ? { 'Content-Type': 'application/json' }</w:t>
-      </w:r>
-      <w:r>
-        <w:rPr>
-          <w:rFonts w:ascii="Courier New" w:eastAsia="Courier New" w:hAnsi="Courier New"/>
-          <w:sz w:val="17"/>
-        </w:rPr>
-        <w:t xml:space="preserve"> : undefined,</w:t>
+        <w:t xml:space="preserve">    headers: body ? { 'Content-Type': 'application/json' } : undefined,</w:t>
       </w:r>
     </w:p>
     <w:p>
@@ -12024,14 +11445,7 @@
           <w:rFonts w:ascii="Courier New" w:eastAsia="Courier New" w:hAnsi="Courier New"/>
           <w:sz w:val="17"/>
         </w:rPr>
-        <w:t>// would compose /api/api/do</w:t>
-      </w:r>
-      <w:r>
-        <w:rPr>
-          <w:rFonts w:ascii="Courier New" w:eastAsia="Courier New" w:hAnsi="Courier New"/>
-          <w:sz w:val="17"/>
-        </w:rPr>
-        <w:t>nors/search and 404 every call</w:t>
+        <w:t>// would compose /api/api/donors/search and 404 every call</w:t>
       </w:r>
     </w:p>
     <w:p>
@@ -12044,22 +11458,16 @@
         <w:jc w:val="both"/>
       </w:pPr>
       <w:r>
-        <w:t>The commented rule above is not decorative: the first real-mode run composed /api/api/... and 404'd every endpoint with no JavaScript error — the failure was invisible in mock mode because mock mode never reaches the concate</w:t>
-      </w:r>
-      <w:r>
-        <w:t>nation. It was found by running the fetch path against the REST stub (Section 5.2, TC-20), fixed, and then guarded by a dedicated automated check that was negative-tested (re-injecting the bad prefix demonstrably fails the suite).</w:t>
+        <w:t>The commented rule above is not decorative: the first real-mode run composed /api/api/... and 404'd every endpoint with no JavaScript error — the failure was invisible in mock mode because mock mode never reaches the concatenation. It was found by running the fetch path against the REST stub (Section 5.2, TC-20), fixed, and then guarded by a dedicated automated check that was negative-tested (re-injecting the bad prefix demonstrably fails the suite).</w:t>
       </w:r>
     </w:p>
     <w:p>
       <w:pPr>
         <w:pStyle w:val="Heading3"/>
       </w:pPr>
-      <w:bookmarkStart w:id="44" w:name="_Toc240406122"/>
-      <w:r>
-        <w:t>4.3.4 Image Handling — Da</w:t>
-      </w:r>
-      <w:r>
-        <w:t>tabase-Stored Photographs (FR-13, CPJ119 §2.5)</w:t>
+      <w:bookmarkStart w:id="44" w:name="_Toc240543506"/>
+      <w:r>
+        <w:t>4.3.4 Image Handling — Database-Stored Photographs (FR-13, CPJ119 §2.5)</w:t>
       </w:r>
       <w:bookmarkEnd w:id="44"/>
     </w:p>
@@ -12068,17 +11476,11 @@
         <w:jc w:val="both"/>
       </w:pPr>
       <w:r>
-        <w:t>All four role profile editors implement secure photo upload exactly as the assignment's database-image requirement anticipates: a file input restricted to JPG/PNG, read client-side via FileReader into a Base64</w:t>
-      </w:r>
-      <w:r>
-        <w:t xml:space="preserve"> data URL, rendered as a live preview with a remove action, and </w:t>
+        <w:t xml:space="preserve">All four role profile editors implement secure photo upload exactly as the assignment's database-image requirement anticipates: a file input restricted to JPG/PNG, read client-side via FileReader into a Base64 data URL, rendered as a live preview with a remove action, and carried as the photo field of the profile payload saved through the API facade — never written to the project directory as a static file. The scheduled backend stores the image as a BLOB </w:t>
       </w:r>
       <w:r>
         <w:lastRenderedPageBreak/>
-        <w:t>carried as the photo field of the profile payload saved through the API facade — never written to the project directory as a static file. The scheduled backend stores the image as a BLOB colum</w:t>
-      </w:r>
-      <w:r>
-        <w:t>n (or the equivalent Base64 string) and serves retrieval through an authenticated API endpoint, satisfying the brief's “stored within the database” constraint end-to-end.</w:t>
+        <w:t>column (or the equivalent Base64 string) and serves retrieval through an authenticated API endpoint, satisfying the brief's “stored within the database” constraint end-to-end.</w:t>
       </w:r>
     </w:p>
     <w:p>
@@ -12100,10 +11502,7 @@
         <w:pStyle w:val="BBCaption"/>
       </w:pPr>
       <w:r>
-        <w:t>Fig</w:t>
-      </w:r>
-      <w:r>
-        <w:t>ure 4-4: Profile Photo Upload (Base64 Preview Round-Trip)</w:t>
+        <w:t>Figure 4-4: Profile Photo Upload (Base64 Preview Round-Trip)</w:t>
       </w:r>
     </w:p>
     <w:p/>
@@ -12111,7 +11510,7 @@
       <w:pPr>
         <w:pStyle w:val="Heading3"/>
       </w:pPr>
-      <w:bookmarkStart w:id="45" w:name="_Toc240406123"/>
+      <w:bookmarkStart w:id="45" w:name="_Toc240543507"/>
       <w:r>
         <w:t>4.3.5 Pagination and Reusable Presentation Components (FR-04)</w:t>
       </w:r>
@@ -12122,20 +11521,14 @@
         <w:jc w:val="both"/>
       </w:pPr>
       <w:r>
-        <w:t>A single reusable pager component (bb-paginate.js) serves every listing surface — donor search results, the admin user table, the admin</w:t>
-      </w:r>
-      <w:r>
-        <w:t xml:space="preserve"> moderation queue, and the hospital queue — with previous/next controls, a page-size selector (5/10/20), and automatic hiding when a list is empty. Pages call setTotal(filtered) and slice(items) in their render path; when the backend arrives, the client-si</w:t>
-      </w:r>
-      <w:r>
-        <w:t>de slice is replaced by ?page=&amp;size= query parameters without touching the pages.</w:t>
+        <w:t>A single reusable pager component (bb-paginate.js) serves every listing surface — donor search results, the admin user table, the admin moderation queue, and the hospital queue — with previous/next controls, a page-size selector (5/10/20), and automatic hiding when a list is empty. Pages call setTotal(filtered) and slice(items) in their render path; when the backend arrives, the client-side slice is replaced by ?page=&amp;size= query parameters without touching the pages.</w:t>
       </w:r>
     </w:p>
     <w:p>
       <w:pPr>
         <w:pStyle w:val="Heading3"/>
       </w:pPr>
-      <w:bookmarkStart w:id="46" w:name="_Toc240406124"/>
+      <w:bookmarkStart w:id="46" w:name="_Toc240543508"/>
       <w:r>
         <w:t>4.3.6 Shared Client-Side Validation (FR-14, CPJ119 §2.1/§4)</w:t>
       </w:r>
@@ -12146,20 +11539,14 @@
         <w:jc w:val="both"/>
       </w:pPr>
       <w:r>
-        <w:t xml:space="preserve">Validation previously existed as nine copies of ad-hoc alert-based checks; it is now one shared module </w:t>
-      </w:r>
-      <w:r>
-        <w:t>(bb-validate.js) providing email, phone, blood group format, password strength, future-date, units, and consent rules, rendered as inline field-level errors under each control. A computed-style pass verified that every error renders visibly (6.03:1 contras</w:t>
-      </w:r>
-      <w:r>
-        <w:t>t against its background, passing WCAG AA) and that the error ring styling wins the cascade on every form — evidence in Section 5.2 (TC-01) and Appendix E.</w:t>
+        <w:t>Validation previously existed as nine copies of ad-hoc alert-based checks; it is now one shared module (bb-validate.js) providing email, phone, blood group format, password strength, future-date, units, and consent rules, rendered as inline field-level errors under each control. A computed-style pass verified that every error renders visibly (6.03:1 contrast against its background, passing WCAG AA) and that the error ring styling wins the cascade on every form — evidence in Section 5.2 (TC-01) and Appendix E.</w:t>
       </w:r>
     </w:p>
     <w:p>
       <w:pPr>
         <w:pStyle w:val="Heading2"/>
       </w:pPr>
-      <w:bookmarkStart w:id="47" w:name="_Toc240406125"/>
+      <w:bookmarkStart w:id="47" w:name="_Toc240543509"/>
       <w:r>
         <w:t>4.4 Administrative and Management Panels</w:t>
       </w:r>
@@ -12170,16 +11557,7 @@
         <w:jc w:val="both"/>
       </w:pPr>
       <w:r>
-        <w:t>The build comprises 23 pages: public pages (landing, about,</w:t>
-      </w:r>
-      <w:r>
-        <w:t xml:space="preserve"> contact, terms, privacy, branded 404), authentication pages (login, register, forgot password), and a portal per role. All four portals follow a consistent pattern — hero with role imagery, role-aware navigation, cards for primary data, and status badges </w:t>
-      </w:r>
-      <w:r>
-        <w:t>(Pending/Matched/Fulfilled; Emergency for guest requests). The administrator portal provides KPI tiles with live counts, user management with suspension and a demo-data reset control, and request moderation with status tabs, a hospital filter (including “n</w:t>
-      </w:r>
-      <w:r>
-        <w:t>ot routed yet”), and forwarding to partner hospitals. The hospital portal provides inventory management with stock adjustment and a request queue with accept/fulfil actions; the requester portal adds tracking tabs per status with a live open-request count.</w:t>
+        <w:t>The build comprises 23 pages: public pages (landing, about, contact, terms, privacy, branded 404), authentication pages (login, register, forgot password), and a portal per role. All four portals follow a consistent pattern — hero with role imagery, role-aware navigation, cards for primary data, and status badges (Pending/Matched/Fulfilled; Emergency for guest requests). The administrator portal provides KPI tiles with live counts, user management with suspension and a demo-data reset control, and request moderation with status tabs, a hospital filter (including “not routed yet”), and forwarding to partner hospitals. The hospital portal provides inventory management with stock adjustment and a request queue with accept/fulfil actions; the requester portal adds tracking tabs per status with a live open-request count.</w:t>
       </w:r>
     </w:p>
     <w:p>
@@ -12221,14 +11599,7 @@
           <w:i/>
           <w:sz w:val="19"/>
         </w:rPr>
-        <w:t>[INSERT SCREENSHOT: hospital-dashboard.html — inventory table wi</w:t>
-      </w:r>
-      <w:r>
-        <w:rPr>
-          <w:i/>
-          <w:sz w:val="19"/>
-        </w:rPr>
-        <w:t>th stock adjustment]</w:t>
+        <w:t>[INSERT SCREENSHOT: hospital-dashboard.html — inventory table with stock adjustment]</w:t>
       </w:r>
     </w:p>
     <w:p>
@@ -12258,7 +11629,7 @@
       <w:pPr>
         <w:pStyle w:val="Heading2"/>
       </w:pPr>
-      <w:bookmarkStart w:id="48" w:name="_Toc240406126"/>
+      <w:bookmarkStart w:id="48" w:name="_Toc240543510"/>
       <w:r>
         <w:t>4.5 API Surface</w:t>
       </w:r>
@@ -12320,14 +11691,7 @@
                 <w:b/>
                 <w:sz w:val="19"/>
               </w:rPr>
-              <w:t>Representativ</w:t>
-            </w:r>
-            <w:r>
-              <w:rPr>
-                <w:b/>
-                <w:sz w:val="19"/>
-              </w:rPr>
-              <w:t>e Endpoints</w:t>
+              <w:t>Representative Endpoints</w:t>
             </w:r>
           </w:p>
         </w:tc>
@@ -12419,7 +11783,6 @@
               <w:rPr>
                 <w:sz w:val="19"/>
               </w:rPr>
-              <w:lastRenderedPageBreak/>
               <w:t>Donors</w:t>
             </w:r>
           </w:p>
@@ -12495,6 +11858,7 @@
               <w:rPr>
                 <w:sz w:val="19"/>
               </w:rPr>
+              <w:lastRenderedPageBreak/>
               <w:t>(?requester=&amp;donor=&amp;hospital=&amp;guest=), POST /api/requests, GET /api/requests/{id}, PATCH /api/requests/{id} (status / moderation / fulfilment)</w:t>
             </w:r>
           </w:p>
@@ -12511,6 +11875,7 @@
               <w:rPr>
                 <w:sz w:val="19"/>
               </w:rPr>
+              <w:lastRenderedPageBreak/>
               <w:t>Auth (role-scoped)</w:t>
             </w:r>
           </w:p>
@@ -12564,13 +11929,7 @@
               <w:rPr>
                 <w:sz w:val="19"/>
               </w:rPr>
-              <w:t>Ho</w:t>
-            </w:r>
-            <w:r>
-              <w:rPr>
-                <w:sz w:val="19"/>
-              </w:rPr>
-              <w:t>spital staff</w:t>
+              <w:t>Hospital staff</w:t>
             </w:r>
           </w:p>
         </w:tc>
@@ -12623,13 +11982,7 @@
               <w:rPr>
                 <w:sz w:val="19"/>
               </w:rPr>
-              <w:t>T</w:t>
-            </w:r>
-            <w:r>
-              <w:rPr>
-                <w:sz w:val="19"/>
-              </w:rPr>
-              <w:t>hat hospital only</w:t>
+              <w:t>That hospital only</w:t>
             </w:r>
           </w:p>
         </w:tc>
@@ -12719,13 +12072,7 @@
               <w:rPr>
                 <w:sz w:val="19"/>
               </w:rPr>
-              <w:t>GET /api/profile/{role}, PUT /api/profile/{role} (→ GET /api/auth/me + role-scoped PUT in final back</w:t>
-            </w:r>
-            <w:r>
-              <w:rPr>
-                <w:sz w:val="19"/>
-              </w:rPr>
-              <w:t>end)</w:t>
+              <w:t>GET /api/profile/{role}, PUT /api/profile/{role} (→ GET /api/auth/me + role-scoped PUT in final backend)</w:t>
             </w:r>
           </w:p>
         </w:tc>
@@ -12757,10 +12104,7 @@
         <w:jc w:val="both"/>
       </w:pPr>
       <w:r>
-        <w:t xml:space="preserve">Every page consumes exactly these endpoints through the facade; the demonstration store implements them in mock mode, and the scheduled Spring controllers implement the same contract. (Full request/response listing in </w:t>
-      </w:r>
-      <w:r>
-        <w:t>Appendix B; the exported Postman collection is submitted with the backend phase.)</w:t>
+        <w:t>Every page consumes exactly these endpoints through the facade; the demonstration store implements them in mock mode, and the scheduled Spring controllers implement the same contract. (Full request/response listing in Appendix B; the exported Postman collection is submitted with the backend phase.)</w:t>
       </w:r>
     </w:p>
     <w:p>
@@ -12772,7 +12116,7 @@
       <w:pPr>
         <w:pStyle w:val="Heading1"/>
       </w:pPr>
-      <w:bookmarkStart w:id="49" w:name="_Toc240406127"/>
+      <w:bookmarkStart w:id="49" w:name="_Toc240543511"/>
       <w:r>
         <w:lastRenderedPageBreak/>
         <w:t>CHAPTER 5: TESTING AND RESULTS</w:t>
@@ -12783,7 +12127,7 @@
       <w:pPr>
         <w:pStyle w:val="Heading2"/>
       </w:pPr>
-      <w:bookmarkStart w:id="50" w:name="_Toc240406128"/>
+      <w:bookmarkStart w:id="50" w:name="_Toc240543512"/>
       <w:r>
         <w:t>5.1 Testing Strategy</w:t>
       </w:r>
@@ -12794,10 +12138,7 @@
         <w:jc w:val="both"/>
       </w:pPr>
       <w:r>
-        <w:t xml:space="preserve">Testing was continuous and checkpoint-based: the automated QA harness was run at the end of every build session, and no </w:t>
-      </w:r>
-      <w:r>
-        <w:t>session's work was accepted while a check failed. The verification approach has three layers, each covering what the others structurally cannot:</w:t>
+        <w:t>Testing was continuous and checkpoint-based: the automated QA harness was run at the end of every build session, and no session's work was accepted while a check failed. The verification approach has three layers, each covering what the others structurally cannot:</w:t>
       </w:r>
     </w:p>
     <w:p>
@@ -12806,10 +12147,7 @@
         <w:spacing w:after="60"/>
       </w:pPr>
       <w:r>
-        <w:t>Functional harness (resptest/qa-harness.html): a self-driving test page that loads every page in isolated frame</w:t>
-      </w:r>
-      <w:r>
-        <w:t>s with cleared storage, seeds controlled data, exercises the interactions of all four roles, and reports per-check results — 266 checks.</w:t>
+        <w:t>Functional harness (resptest/qa-harness.html): a self-driving test page that loads every page in isolated frames with cleared storage, seeds controlled data, exercises the interactions of all four roles, and reports per-check results — 266 checks.</w:t>
       </w:r>
     </w:p>
     <w:p>
@@ -12818,10 +12156,7 @@
         <w:spacing w:after="60"/>
       </w:pPr>
       <w:r>
-        <w:t>Responsive layout check (resptest/responsive-check.html): loads all pages at 360, 430, 768, and 1280 px viewports and f</w:t>
-      </w:r>
-      <w:r>
-        <w:t>ails any page whose content overflows horizontally — 92 page×width combinations.</w:t>
+        <w:t>Responsive layout check (resptest/responsive-check.html): loads all pages at 360, 430, 768, and 1280 px viewports and fails any page whose content overflows horizontally — 92 page×width combinations.</w:t>
       </w:r>
     </w:p>
     <w:p>
@@ -12830,10 +12165,7 @@
         <w:spacing w:after="60"/>
       </w:pPr>
       <w:r>
-        <w:t>Real-mode transport check (resptest/real-mode-check.html + tools/mock_api_server.py): with the facade's mock mode switched off and the data store pinned empty, five representa</w:t>
-      </w:r>
-      <w:r>
-        <w:t>tive pages must render their rows purely from HTTP responses served by a REST stub — proving the AJAX/Fetch layer actually performs network calls rather than merely containing them — 16 checks.</w:t>
+        <w:t>Real-mode transport check (resptest/real-mode-check.html + tools/mock_api_server.py): with the facade's mock mode switched off and the data store pinned empty, five representative pages must render their rows purely from HTTP responses served by a REST stub — proving the AJAX/Fetch layer actually performs network calls rather than merely containing them — 16 checks.</w:t>
       </w:r>
     </w:p>
     <w:p>
@@ -12841,20 +12173,14 @@
         <w:jc w:val="both"/>
       </w:pPr>
       <w:r>
-        <w:t>The suite is deliberately adversarial towards itself: guards w</w:t>
-      </w:r>
-      <w:r>
-        <w:t>ere negative-tested (deliberately re-injecting a known-bad configuration must fail the suite), and the harness seeds its own data rather than depending on other pages' leftovers. Backend API testing in Postman — success and failure cases per module, with t</w:t>
-      </w:r>
-      <w:r>
-        <w:t>he collection exported as JSON — is part of the scheduled backend phase; no backend test is reported as passed here.</w:t>
+        <w:t>The suite is deliberately adversarial towards itself: guards were negative-tested (deliberately re-injecting a known-bad configuration must fail the suite), and the harness seeds its own data rather than depending on other pages' leftovers. Backend API testing in Postman — success and failure cases per module, with the collection exported as JSON — is part of the scheduled backend phase; no backend test is reported as passed here.</w:t>
       </w:r>
     </w:p>
     <w:p>
       <w:pPr>
         <w:pStyle w:val="Heading2"/>
       </w:pPr>
-      <w:bookmarkStart w:id="51" w:name="_Toc240406129"/>
+      <w:bookmarkStart w:id="51" w:name="_Toc240543513"/>
       <w:r>
         <w:t>5.2 Key Test Cases</w:t>
       </w:r>
@@ -13006,13 +12332,7 @@
               <w:rPr>
                 <w:sz w:val="19"/>
               </w:rPr>
-              <w:t xml:space="preserve">Inline field </w:t>
-            </w:r>
-            <w:r>
-              <w:rPr>
-                <w:sz w:val="19"/>
-              </w:rPr>
-              <w:t>errors, submit blocked, no session created</w:t>
+              <w:t>Inline field errors, submit blocked, no session created</w:t>
             </w:r>
           </w:p>
         </w:tc>
@@ -13341,13 +12661,7 @@
               <w:rPr>
                 <w:sz w:val="19"/>
               </w:rPr>
-              <w:t xml:space="preserve">Member request submit → </w:t>
-            </w:r>
-            <w:r>
-              <w:rPr>
-                <w:sz w:val="19"/>
-              </w:rPr>
-              <w:t>tracking → cancel</w:t>
+              <w:t>Member request submit → tracking → cancel</w:t>
             </w:r>
           </w:p>
         </w:tc>
@@ -13432,14 +12746,7 @@
               <w:rPr>
                 <w:sz w:val="19"/>
               </w:rPr>
-              <w:t xml:space="preserve">EM- ID issued and displayed; lookup returns status; member </w:t>
-            </w:r>
-            <w:r>
-              <w:rPr>
-                <w:sz w:val="19"/>
-              </w:rPr>
-              <w:lastRenderedPageBreak/>
-              <w:t>(BB-) IDs rejected</w:t>
+              <w:t>EM- ID issued and displayed; lookup returns status; member (BB-) IDs rejected</w:t>
             </w:r>
           </w:p>
         </w:tc>
@@ -13455,7 +12762,6 @@
               <w:rPr>
                 <w:sz w:val="19"/>
               </w:rPr>
-              <w:lastRenderedPageBreak/>
               <w:t>PASS</w:t>
             </w:r>
           </w:p>
@@ -13493,13 +12799,7 @@
               <w:rPr>
                 <w:sz w:val="19"/>
               </w:rPr>
-              <w:t>Compatibility direction (</w:t>
-            </w:r>
-            <w:r>
-              <w:rPr>
-                <w:sz w:val="19"/>
-              </w:rPr>
-              <w:t>B+ donor)</w:t>
+              <w:t>Compatibility direction (B+ donor)</w:t>
             </w:r>
           </w:p>
         </w:tc>
@@ -13552,6 +12852,7 @@
               <w:rPr>
                 <w:sz w:val="19"/>
               </w:rPr>
+              <w:lastRenderedPageBreak/>
               <w:t>TC-09</w:t>
             </w:r>
           </w:p>
@@ -13653,13 +12954,7 @@
               <w:rPr>
                 <w:sz w:val="19"/>
               </w:rPr>
-              <w:t xml:space="preserve">Request Fulfilled; hospital inventory </w:t>
-            </w:r>
-            <w:r>
-              <w:rPr>
-                <w:sz w:val="19"/>
-              </w:rPr>
-              <w:t>decremented for that group</w:t>
+              <w:t>Request Fulfilled; hospital inventory decremented for that group</w:t>
             </w:r>
           </w:p>
         </w:tc>
@@ -13850,13 +13145,7 @@
               <w:rPr>
                 <w:sz w:val="19"/>
               </w:rPr>
-              <w:t>Inventory stock</w:t>
-            </w:r>
-            <w:r>
-              <w:rPr>
-                <w:sz w:val="19"/>
-              </w:rPr>
-              <w:t xml:space="preserve"> adjustment</w:t>
+              <w:t>Inventory stock adjustment</w:t>
             </w:r>
           </w:p>
         </w:tc>
@@ -14217,13 +13506,7 @@
               <w:rPr>
                 <w:sz w:val="19"/>
               </w:rPr>
-              <w:t>Pages render data purely from</w:t>
-            </w:r>
-            <w:r>
-              <w:rPr>
-                <w:sz w:val="19"/>
-              </w:rPr>
-              <w:t xml:space="preserve"> HTTP responses; endpoints 200 in stub log</w:t>
+              <w:t>Pages render data purely from HTTP responses; endpoints 200 in stub log</w:t>
             </w:r>
           </w:p>
         </w:tc>
@@ -14361,13 +13644,7 @@
               <w:rPr>
                 <w:sz w:val="19"/>
               </w:rPr>
-              <w:t xml:space="preserve">One 200, </w:t>
-            </w:r>
-            <w:r>
-              <w:rPr>
-                <w:sz w:val="19"/>
-              </w:rPr>
-              <w:t>one conflict per TC-03 analog; collection exported</w:t>
+              <w:t>One 200, one conflict per TC-03 analog; collection exported</w:t>
             </w:r>
           </w:p>
         </w:tc>
@@ -14474,15 +13751,7 @@
           <w:i/>
           <w:sz w:val="19"/>
         </w:rPr>
-        <w:lastRenderedPageBreak/>
-        <w:t>[INSERT SCREENSHOT: resptest/qa-harness.html — per-check</w:t>
-      </w:r>
-      <w:r>
-        <w:rPr>
-          <w:i/>
-          <w:sz w:val="19"/>
-        </w:rPr>
-        <w:t xml:space="preserve"> PASS report in headless Chrome]</w:t>
+        <w:t>[INSERT SCREENSHOT: resptest/qa-harness.html — per-check PASS report in headless Chrome]</w:t>
       </w:r>
     </w:p>
     <w:p>
@@ -14518,10 +13787,7 @@
         <w:pStyle w:val="BBCaption"/>
       </w:pPr>
       <w:r>
-        <w:t>Figure 5-1: Automated QA Harness Report (266/</w:t>
-      </w:r>
-      <w:r>
-        <w:t>266 Passing)</w:t>
+        <w:t>Figure 5-1: Automated QA Harness Report (266/266 Passing)</w:t>
       </w:r>
     </w:p>
     <w:p/>
@@ -14529,7 +13795,7 @@
       <w:pPr>
         <w:pStyle w:val="Heading2"/>
       </w:pPr>
-      <w:bookmarkStart w:id="52" w:name="_Toc240406130"/>
+      <w:bookmarkStart w:id="52" w:name="_Toc240543514"/>
       <w:r>
         <w:t>5.3 Testing Evidence and Tools</w:t>
       </w:r>
@@ -14540,23 +13806,18 @@
         <w:jc w:val="both"/>
       </w:pPr>
       <w:r>
-        <w:t xml:space="preserve">The harness runs headlessly in Chrome with a fresh profile and cache buster, dumps its results to the DOM, and exits non-zero on failure, making it repeatable from the command line (the exact commands are </w:t>
-      </w:r>
-      <w:r>
-        <w:t xml:space="preserve">recorded in Appendix E). The visual validation pass used a computed-style probe rather than screenshots alone: every inline error on both request forms was measured for display, box size, colour contrast (6.03:1, WCAG AA), and ring styling, with the probe </w:t>
-      </w:r>
-      <w:r>
-        <w:t>and its screenshots kept as re-runnable artefacts. Five genuine defects the suite caught — a dead search route, a status-crash on unlabelled states, a transport prefix that would have 404'd every real call, a botched page edit, and a non-responsive 404 pag</w:t>
-      </w:r>
-      <w:r>
-        <w:t>e — are recorded with their fixes in Section 7.2's context and Appendix E.</w:t>
+        <w:t xml:space="preserve">The harness runs headlessly in Chrome with a fresh profile and cache buster, dumps its results to the DOM, and exits non-zero on failure, making it repeatable from the command line (the exact commands are recorded in Appendix E). The visual validation pass used a computed-style probe rather than screenshots alone: every inline error on both request forms was measured for display, box size, colour contrast (6.03:1, WCAG AA), and ring styling, with </w:t>
+      </w:r>
+      <w:r>
+        <w:lastRenderedPageBreak/>
+        <w:t>the probe and its screenshots kept as re-runnable artefacts. Five genuine defects the suite caught — a dead search route, a status-crash on unlabelled states, a transport prefix that would have 404'd every real call, a botched page edit, and a non-responsive 404 page — are recorded with their fixes in Section 7.2's context and Appendix E.</w:t>
       </w:r>
     </w:p>
     <w:p>
       <w:pPr>
         <w:pStyle w:val="Heading2"/>
       </w:pPr>
-      <w:bookmarkStart w:id="53" w:name="_Toc240406131"/>
+      <w:bookmarkStart w:id="53" w:name="_Toc240543515"/>
       <w:r>
         <w:t>5.4 Requirements Traceability</w:t>
       </w:r>
@@ -14673,13 +13934,7 @@
               <w:rPr>
                 <w:sz w:val="19"/>
               </w:rPr>
-              <w:t xml:space="preserve">Auth pages </w:t>
-            </w:r>
-            <w:r>
-              <w:rPr>
-                <w:sz w:val="19"/>
-              </w:rPr>
-              <w:t>through API facade; server-side auth scheduled</w:t>
+              <w:t>Auth pages through API facade; server-side auth scheduled</w:t>
             </w:r>
           </w:p>
         </w:tc>
@@ -14785,13 +14040,7 @@
               <w:rPr>
                 <w:sz w:val="19"/>
               </w:rPr>
-              <w:t xml:space="preserve">Donor profiles, availability toggle, admin </w:t>
-            </w:r>
-            <w:r>
-              <w:rPr>
-                <w:sz w:val="19"/>
-              </w:rPr>
-              <w:t>suspension</w:t>
+              <w:t>Donor profiles, availability toggle, admin suspension</w:t>
             </w:r>
           </w:p>
         </w:tc>
@@ -14950,13 +14199,7 @@
               <w:rPr>
                 <w:sz w:val="19"/>
               </w:rPr>
-              <w:t>bb-comp</w:t>
-            </w:r>
-            <w:r>
-              <w:rPr>
-                <w:sz w:val="19"/>
-              </w:rPr>
-              <w:t>at.js (recipient→donor direction); service-layer rule specified</w:t>
+              <w:t>bb-compat.js (recipient→donor direction); service-layer rule specified</w:t>
             </w:r>
           </w:p>
         </w:tc>
@@ -15062,13 +14305,7 @@
               <w:rPr>
                 <w:sz w:val="19"/>
               </w:rPr>
-              <w:t>Inventory table, stock adjustment, open/closed</w:t>
-            </w:r>
-            <w:r>
-              <w:rPr>
-                <w:sz w:val="19"/>
-              </w:rPr>
-              <w:t xml:space="preserve"> pill</w:t>
+              <w:t>Inventory table, stock adjustment, open/closed pill</w:t>
             </w:r>
           </w:p>
         </w:tc>
@@ -15211,13 +14448,7 @@
               <w:rPr>
                 <w:sz w:val="19"/>
               </w:rPr>
-              <w:t xml:space="preserve">FR-11 Administration + </w:t>
-            </w:r>
-            <w:r>
-              <w:rPr>
-                <w:sz w:val="19"/>
-              </w:rPr>
-              <w:t>moderation</w:t>
+              <w:t>FR-11 Administration + moderation</w:t>
             </w:r>
           </w:p>
         </w:tc>
@@ -15339,13 +14570,7 @@
               <w:rPr>
                 <w:sz w:val="19"/>
               </w:rPr>
-              <w:t xml:space="preserve">Base64 upload + preview via facade; </w:t>
-            </w:r>
-            <w:r>
-              <w:rPr>
-                <w:sz w:val="19"/>
-              </w:rPr>
-              <w:t>BLOB storage scheduled</w:t>
+              <w:t>Base64 upload + preview via facade; BLOB storage scheduled</w:t>
             </w:r>
           </w:p>
         </w:tc>
@@ -15382,14 +14607,7 @@
               <w:rPr>
                 <w:sz w:val="19"/>
               </w:rPr>
-              <w:t xml:space="preserve">FR-14 AJAX/Fetch + validation + </w:t>
-            </w:r>
-            <w:r>
-              <w:rPr>
-                <w:sz w:val="19"/>
-              </w:rPr>
-              <w:lastRenderedPageBreak/>
-              <w:t>responsive</w:t>
+              <w:t>FR-14 AJAX/Fetch + validation + responsive</w:t>
             </w:r>
           </w:p>
         </w:tc>
@@ -15405,15 +14623,7 @@
               <w:rPr>
                 <w:sz w:val="19"/>
               </w:rPr>
-              <w:lastRenderedPageBreak/>
-              <w:t xml:space="preserve">API facade; shared validation; </w:t>
-            </w:r>
-            <w:r>
-              <w:rPr>
-                <w:sz w:val="19"/>
-              </w:rPr>
-              <w:lastRenderedPageBreak/>
-              <w:t>responsive CSS</w:t>
+              <w:t>API facade; shared validation; responsive CSS</w:t>
             </w:r>
           </w:p>
         </w:tc>
@@ -15429,7 +14639,6 @@
               <w:rPr>
                 <w:sz w:val="19"/>
               </w:rPr>
-              <w:lastRenderedPageBreak/>
               <w:t>TC-01, TC-17, TC-18</w:t>
             </w:r>
           </w:p>
@@ -15467,13 +14676,7 @@
               <w:rPr>
                 <w:sz w:val="19"/>
               </w:rPr>
-              <w:t xml:space="preserve">Responsive UI; RBAC + </w:t>
-            </w:r>
-            <w:r>
-              <w:rPr>
-                <w:sz w:val="19"/>
-              </w:rPr>
-              <w:t>dual-end validation; consistent error shapes; layered design + shared modules; pagination; timeline audit trail</w:t>
+              <w:t>Responsive UI; RBAC + dual-end validation; consistent error shapes; layered design + shared modules; pagination; timeline audit trail</w:t>
             </w:r>
           </w:p>
         </w:tc>
@@ -15504,7 +14707,7 @@
       <w:pPr>
         <w:pStyle w:val="Heading2"/>
       </w:pPr>
-      <w:bookmarkStart w:id="54" w:name="_Toc240406132"/>
+      <w:bookmarkStart w:id="54" w:name="_Toc240543516"/>
       <w:r>
         <w:t>5.5 Evaluation Against the Assignment Brief</w:t>
       </w:r>
@@ -15515,16 +14718,7 @@
         <w:jc w:val="both"/>
       </w:pPr>
       <w:r>
-        <w:t>Every mandatory §2.1 frontend criterion is implemented and evidenced</w:t>
-      </w:r>
-      <w:r>
-        <w:t>: semantic HTML/CSS/JS with a fully responsive layout (92/92 layout checks), client-side form validation (shared module, inline errors, TC-01), dynamic UI updates, basic AJAX/Fetch integration with backend APIs (proven over real HTTP, TC-19), search and fi</w:t>
-      </w:r>
-      <w:r>
-        <w:t>ltering, pagination, role-based access control, and dashboard analytics. Code quality criteria are addressed through the strict layered design, shared modules, consistent naming, global error shapes, and validation on both ends (client-side verified; serve</w:t>
-      </w:r>
-      <w:r>
-        <w:t>r-side scheduled).</w:t>
+        <w:t>Every mandatory §2.1 frontend criterion is implemented and evidenced: semantic HTML/CSS/JS with a fully responsive layout (92/92 layout checks), client-side form validation (shared module, inline errors, TC-01), dynamic UI updates, basic AJAX/Fetch integration with backend APIs (proven over real HTTP, TC-19), search and filtering, pagination, role-based access control, and dashboard analytics. Code quality criteria are addressed through the strict layered design, shared modules, consistent naming, global error shapes, and validation on both ends (client-side verified; server-side scheduled).</w:t>
       </w:r>
     </w:p>
     <w:p>
@@ -15532,13 +14726,8 @@
         <w:jc w:val="both"/>
       </w:pPr>
       <w:r>
-        <w:t xml:space="preserve">The remaining mandatory criteria belong to the scheduled backend phase and are not claimed as complete: the Spring MVC N-Tier implementation (§2.2), MySQL + Hibernate persistence with 1:1, 1:N and N:N relationships (§2.3), SMTP </w:t>
-      </w:r>
-      <w:r>
-        <w:t>registration confirmation via environment-variable credentials (§2.4), the backend half of database-stored images (§2.5 — the frontend Base64 upload is done), and the Postman collection exported as JSON (§2.6 — the endpoint contract is implemented and HTTP</w:t>
-      </w:r>
-      <w:r>
-        <w:t>-verified against the stub, but the collection itself is exported with the backend). The demonstration build's persistence is browser-based and is explicitly not presented as the backend.</w:t>
+        <w:lastRenderedPageBreak/>
+        <w:t>The remaining mandatory criteria belong to the scheduled backend phase and are not claimed as complete: the Spring MVC N-Tier implementation (§2.2), MySQL + Hibernate persistence with 1:1, 1:N and N:N relationships (§2.3), SMTP registration confirmation via environment-variable credentials (§2.4), the backend half of database-stored images (§2.5 — the frontend Base64 upload is done), and the Postman collection exported as JSON (§2.6 — the endpoint contract is implemented and HTTP-verified against the stub, but the collection itself is exported with the backend). The demonstration build's persistence is browser-based and is explicitly not presented as the backend.</w:t>
       </w:r>
     </w:p>
     <w:p>
@@ -15550,7 +14739,7 @@
       <w:pPr>
         <w:pStyle w:val="Heading1"/>
       </w:pPr>
-      <w:bookmarkStart w:id="55" w:name="_Toc240406133"/>
+      <w:bookmarkStart w:id="55" w:name="_Toc240543517"/>
       <w:r>
         <w:lastRenderedPageBreak/>
         <w:t>CHAPTER 6: PROJECT TIMELINE</w:t>
@@ -15562,10 +14751,7 @@
         <w:jc w:val="both"/>
       </w:pPr>
       <w:r>
-        <w:t>The project followed the phase-depende</w:t>
-      </w:r>
-      <w:r>
-        <w:t>ncy order of the build roadmap (Table 4-1), with the automated QA checkpoint passing at the end of every phase before the next began. Periods are shown as project weeks; the backend phase is scheduled, not yet performed.</w:t>
+        <w:t>The project followed the phase-dependency order of the build roadmap (Table 4-1), with the automated QA checkpoint passing at the end of every phase before the next began. Periods are shown as project weeks; the backend phase is scheduled, not yet performed.</w:t>
       </w:r>
     </w:p>
     <w:p>
@@ -15573,10 +14759,7 @@
         <w:pStyle w:val="BBCaption"/>
       </w:pPr>
       <w:r>
-        <w:t>Table 6-1: Phase-Wise Project Timel</w:t>
-      </w:r>
-      <w:r>
-        <w:t>ine and Completion Status</w:t>
+        <w:t>Table 6-1: Phase-Wise Project Timeline and Completion Status</w:t>
       </w:r>
     </w:p>
     <w:tbl>
@@ -15770,13 +14953,7 @@
               <w:rPr>
                 <w:sz w:val="19"/>
               </w:rPr>
-              <w:t xml:space="preserve">Shared modules: validation, API facade, pagination, compatibility chart, </w:t>
-            </w:r>
-            <w:r>
-              <w:rPr>
-                <w:sz w:val="19"/>
-              </w:rPr>
-              <w:t>demo store</w:t>
+              <w:t>Shared modules: validation, API facade, pagination, compatibility chart, demo store</w:t>
             </w:r>
           </w:p>
         </w:tc>
@@ -15983,13 +15160,7 @@
               <w:rPr>
                 <w:sz w:val="19"/>
               </w:rPr>
-              <w:t>Request lifecycle (accept/match/fulfil</w:t>
-            </w:r>
-            <w:r>
-              <w:rPr>
-                <w:sz w:val="19"/>
-              </w:rPr>
-              <w:t>) + hospital inventory and queue</w:t>
+              <w:t>Request lifecycle (accept/match/fulfil) + hospital inventory and queue</w:t>
             </w:r>
           </w:p>
         </w:tc>
@@ -16403,13 +15574,7 @@
               <w:rPr>
                 <w:sz w:val="19"/>
               </w:rPr>
-              <w:t xml:space="preserve">Spring MVC </w:t>
-            </w:r>
-            <w:r>
-              <w:rPr>
-                <w:sz w:val="19"/>
-              </w:rPr>
-              <w:t>backend: entities, relationships, security, SMTP</w:t>
+              <w:t>Spring MVC backend: entities, relationships, security, SMTP</w:t>
             </w:r>
           </w:p>
         </w:tc>
@@ -16533,7 +15698,7 @@
         </w:rPr>
         <w:lastRenderedPageBreak/>
         <w:drawing>
-          <wp:inline distT="0" distB="0" distL="0" distR="0" wp14:anchorId="0A4C3D7B" wp14:editId="29DF5E0B">
+          <wp:inline distT="0" distB="0" distL="0" distR="0" wp14:anchorId="16C0B736" wp14:editId="7A415A3F">
             <wp:extent cx="5760000" cy="2641249"/>
             <wp:effectExtent l="0" t="0" r="0" b="0"/>
             <wp:docPr id="5" name="Picture 5"/>
@@ -16587,13 +15752,10 @@
       <w:pPr>
         <w:pStyle w:val="Heading1"/>
       </w:pPr>
-      <w:bookmarkStart w:id="56" w:name="_Toc240406134"/>
+      <w:bookmarkStart w:id="56" w:name="_Toc240543518"/>
       <w:r>
         <w:lastRenderedPageBreak/>
-        <w:t>CHAPTER 7: CONCLUSION, LIMITATIO</w:t>
-      </w:r>
-      <w:r>
-        <w:t>NS AND FUTURE SCOPE</w:t>
+        <w:t>CHAPTER 7: CONCLUSION, LIMITATIONS AND FUTURE SCOPE</w:t>
       </w:r>
       <w:bookmarkEnd w:id="56"/>
     </w:p>
@@ -16601,7 +15763,7 @@
       <w:pPr>
         <w:pStyle w:val="Heading2"/>
       </w:pPr>
-      <w:bookmarkStart w:id="57" w:name="_Toc240406135"/>
+      <w:bookmarkStart w:id="57" w:name="_Toc240543519"/>
       <w:r>
         <w:t>7.1 Conclusion</w:t>
       </w:r>
@@ -16612,13 +15774,7 @@
         <w:jc w:val="both"/>
       </w:pPr>
       <w:r>
-        <w:t>BloodBuddy set out to close five evidence-backed gaps — unstructured social-media requests, no searchable donor registry, manual hospital records, no automated alerting, and no moderation — with a structured, role-based w</w:t>
-      </w:r>
-      <w:r>
-        <w:t>eb platform, and the frontend through which users experience all five closures is complete and verified: 266/266 functional checks, 92/92 responsive page×width combinations, and 16/16 real-HTTP transport checks. The full request lifecycle — submission, mod</w:t>
-      </w:r>
-      <w:r>
-        <w:t>eration, hospital routing, compatibility-correct donor matching, fulfilment with stock decrement — works end-to-end across all four roles plus the guest emergency flow.</w:t>
+        <w:t>BloodBuddy set out to close five evidence-backed gaps — unstructured social-media requests, no searchable donor registry, manual hospital records, no automated alerting, and no moderation — with a structured, role-based web platform, and the frontend through which users experience all five closures is complete and verified: 266/266 functional checks, 92/92 responsive page×width combinations, and 16/16 real-HTTP transport checks. The full request lifecycle — submission, moderation, hospital routing, compatibility-correct donor matching, fulfilment with stock decrement — works end-to-end across all four roles plus the guest emergency flow.</w:t>
       </w:r>
     </w:p>
     <w:p>
@@ -16626,23 +15782,14 @@
         <w:jc w:val="both"/>
       </w:pPr>
       <w:r>
-        <w:t>The project's most instructive results are methodological. Centralising the compatibili</w:t>
-      </w:r>
-      <w:r>
-        <w:t>ty chart in one module exposed how easily a clinical rule drifts when duplicated — and how the matching direction itself is the safety-critical detail. The API facade design made the mock-to-real backend swap a one-flag change and, just as importantly, mad</w:t>
-      </w:r>
-      <w:r>
-        <w:t>e the transport layer testable: the one defect that would have silently broken every real call was invisible to 261 functional checks and was caught only by exercising the fetch path over HTTP, then pinned by a negative-tested guard. The project traces cle</w:t>
-      </w:r>
-      <w:r>
-        <w:t>anly from documented field evidence through requirements, layered design, phased implementation, and evidence-based verification — a complete software development lifecycle in miniature.</w:t>
+        <w:t>The project's most instructive results are methodological. Centralising the compatibility chart in one module exposed how easily a clinical rule drifts when duplicated — and how the matching direction itself is the safety-critical detail. The API facade design made the mock-to-real backend swap a one-flag change and, just as importantly, made the transport layer testable: the one defect that would have silently broken every real call was invisible to 261 functional checks and was caught only by exercising the fetch path over HTTP, then pinned by a negative-tested guard. The project traces cleanly from documented field evidence through requirements, layered design, phased implementation, and evidence-based verification — a complete software development lifecycle in miniature.</w:t>
       </w:r>
     </w:p>
     <w:p>
       <w:pPr>
         <w:pStyle w:val="Heading2"/>
       </w:pPr>
-      <w:bookmarkStart w:id="58" w:name="_Toc240406136"/>
+      <w:bookmarkStart w:id="58" w:name="_Toc240543520"/>
       <w:r>
         <w:t>7.2 Limitations</w:t>
       </w:r>
@@ -16654,10 +15801,7 @@
         <w:spacing w:after="60"/>
       </w:pPr>
       <w:r>
-        <w:t xml:space="preserve">The demonstration build persists data in the </w:t>
-      </w:r>
-      <w:r>
-        <w:t>browser; the Spring MVC + MySQL backend that makes the system durable and multi-user is the scheduled implementation phase, and the browser store is explicitly not a backend.</w:t>
+        <w:t>The demonstration build persists data in the browser; the Spring MVC + MySQL backend that makes the system durable and multi-user is the scheduled implementation phase, and the browser store is explicitly not a backend.</w:t>
       </w:r>
     </w:p>
     <w:p>
@@ -16666,10 +15810,7 @@
         <w:spacing w:after="60"/>
       </w:pPr>
       <w:r>
-        <w:t>Matching, authorisation, and status rules are enforced client-side in the demonst</w:t>
-      </w:r>
-      <w:r>
-        <w:t>ration; the authoritative service-layer enforcement specified in Section 3.9 must land with the backend or the security model is advisory.</w:t>
+        <w:t>Matching, authorisation, and status rules are enforced client-side in the demonstration; the authoritative service-layer enforcement specified in Section 3.9 must land with the backend or the security model is advisory.</w:t>
       </w:r>
     </w:p>
     <w:p>
@@ -16678,10 +15819,7 @@
         <w:spacing w:after="60"/>
       </w:pPr>
       <w:r>
-        <w:t>Hospital and inventory data is seeded demonstration data; no partner hospital is connected, and the local hospital AP</w:t>
-      </w:r>
-      <w:r>
-        <w:t>Is are designed and stubbed but not live.</w:t>
+        <w:t>Hospital and inventory data is seeded demonstration data; no partner hospital is connected, and the local hospital APIs are designed and stubbed but not live.</w:t>
       </w:r>
     </w:p>
     <w:p>
@@ -16699,10 +15837,7 @@
         <w:spacing w:after="60"/>
       </w:pPr>
       <w:r>
-        <w:t>Concurrency is untested beyond the automated</w:t>
-      </w:r>
-      <w:r>
-        <w:t xml:space="preserve"> suites' scope; server-side guarantees (e.g., a database-level uniqueness on request matching) are specified but not yet in force.</w:t>
+        <w:t>Concurrency is untested beyond the automated suites' scope; server-side guarantees (e.g., a database-level uniqueness on request matching) are specified but not yet in force.</w:t>
       </w:r>
     </w:p>
     <w:p>
@@ -16711,17 +15846,14 @@
         <w:spacing w:after="60"/>
       </w:pPr>
       <w:r>
-        <w:t>The requirement base derives from the proposal's document-based analysis; broader field validation with hospitals and donor c</w:t>
-      </w:r>
-      <w:r>
-        <w:t>ommunities remains future work.</w:t>
+        <w:t>The requirement base derives from the proposal's document-based analysis; broader field validation with hospitals and donor communities remains future work.</w:t>
       </w:r>
     </w:p>
     <w:p>
       <w:pPr>
         <w:pStyle w:val="Heading2"/>
       </w:pPr>
-      <w:bookmarkStart w:id="59" w:name="_Toc240406137"/>
+      <w:bookmarkStart w:id="59" w:name="_Toc240543521"/>
       <w:r>
         <w:t>7.3 Future Scope</w:t>
       </w:r>
@@ -16751,10 +15883,7 @@
         <w:spacing w:after="60"/>
       </w:pPr>
       <w:r>
-        <w:t>Onboard the five partner hospitals onto the local APIs for real-time inventory sharing; add cross-h</w:t>
-      </w:r>
-      <w:r>
-        <w:t>ospital stock search so requesters can locate scarce groups region-wide.</w:t>
+        <w:t>Onboard the five partner hospitals onto the local APIs for real-time inventory sharing; add cross-hospital stock search so requesters can locate scarce groups region-wide.</w:t>
       </w:r>
     </w:p>
     <w:p>
@@ -16773,10 +15902,7 @@
       </w:pPr>
       <w:r>
         <w:lastRenderedPageBreak/>
-        <w:t>Donor engagement: eligibility intervals, donation history verification, reminders, and recogni</w:t>
-      </w:r>
-      <w:r>
-        <w:t>tion badges to sustain the voluntary donor base.</w:t>
+        <w:t>Donor engagement: eligibility intervals, donation history verification, reminders, and recognition badges to sustain the voluntary donor base.</w:t>
       </w:r>
     </w:p>
     <w:p>
@@ -16797,7 +15923,7 @@
       <w:pPr>
         <w:pStyle w:val="Heading1"/>
       </w:pPr>
-      <w:bookmarkStart w:id="60" w:name="_Toc240406138"/>
+      <w:bookmarkStart w:id="60" w:name="_Toc240543522"/>
       <w:r>
         <w:lastRenderedPageBreak/>
         <w:t>REFERENCES</w:t>
@@ -16810,10 +15936,7 @@
         <w:ind w:left="567" w:hanging="567"/>
       </w:pPr>
       <w:r>
-        <w:t xml:space="preserve">Bauer, C., &amp; King, G. (2015). </w:t>
-      </w:r>
-      <w:r>
-        <w:t>Java persistence with Hibernate (2nd ed.). Manning Publications.</w:t>
+        <w:t>Bauer, C., &amp; King, G. (2015). Java persistence with Hibernate (2nd ed.). Manning Publications.</w:t>
       </w:r>
     </w:p>
     <w:p>
@@ -16831,10 +15954,7 @@
         <w:ind w:left="567" w:hanging="567"/>
       </w:pPr>
       <w:r>
-        <w:t>Hibern</w:t>
-      </w:r>
-      <w:r>
-        <w:t>ate ORM Documentation. (2024). Hibernate getting started guide. https://docs.jboss.org/hibernate/orm/current/quickstart/html_single/</w:t>
+        <w:t>Hibernate ORM Documentation. (2024). Hibernate getting started guide. https://docs.jboss.org/hibernate/orm/current/quickstart/html_single/</w:t>
       </w:r>
     </w:p>
     <w:p>
@@ -16843,10 +15963,7 @@
         <w:ind w:left="567" w:hanging="567"/>
       </w:pPr>
       <w:r>
-        <w:t>New Business Age. (2025). Nepal's digital crossroads: Growth vs barriers in the race to transform. https://www.newbusinessa</w:t>
-      </w:r>
-      <w:r>
-        <w:t>ge.com/news/43801</w:t>
+        <w:t>New Business Age. (2025). Nepal's digital crossroads: Growth vs barriers in the race to transform. https://www.newbusinessage.com/news/43801</w:t>
       </w:r>
     </w:p>
     <w:p>
@@ -16864,10 +15981,7 @@
         <w:ind w:left="567" w:hanging="567"/>
       </w:pPr>
       <w:r>
-        <w:t xml:space="preserve">NIPoRe. (2023). Digitalization of Nepal — few policies and possible </w:t>
-      </w:r>
-      <w:r>
-        <w:t>challenges. https://nipore.org/digitalization-of-nepal-few-policies-and-possible-challenges/</w:t>
+        <w:t>NIPoRe. (2023). Digitalization of Nepal — few policies and possible challenges. https://nipore.org/digitalization-of-nepal-few-policies-and-possible-challenges/</w:t>
       </w:r>
     </w:p>
     <w:p>
@@ -16885,10 +15999,7 @@
         <w:ind w:left="567" w:hanging="567"/>
       </w:pPr>
       <w:r>
-        <w:t xml:space="preserve">Spring Framework Documentation. (2024). </w:t>
-      </w:r>
-      <w:r>
-        <w:t>Spring MVC — Web on Servlet Stack. https://docs.spring.io/spring-framework/reference/web/webmvc.html</w:t>
+        <w:t>Spring Framework Documentation. (2024). Spring MVC — Web on Servlet Stack. https://docs.spring.io/spring-framework/reference/web/webmvc.html</w:t>
       </w:r>
     </w:p>
     <w:p>
@@ -16906,10 +16017,7 @@
         <w:ind w:left="567" w:hanging="567"/>
       </w:pPr>
       <w:r>
-        <w:t>World Health Organisation. (2023</w:t>
-      </w:r>
-      <w:r>
-        <w:t>). Blood safety and availability. WHO Fact Sheets. https://www.who.int/news-room/fact-sheets/detail/blood-safety-and-availability</w:t>
+        <w:t>World Health Organisation. (2023). Blood safety and availability. WHO Fact Sheets. https://www.who.int/news-room/fact-sheets/detail/blood-safety-and-availability</w:t>
       </w:r>
     </w:p>
     <w:p>
@@ -16921,7 +16029,7 @@
       <w:pPr>
         <w:pStyle w:val="Heading1"/>
       </w:pPr>
-      <w:bookmarkStart w:id="61" w:name="_Toc240406139"/>
+      <w:bookmarkStart w:id="61" w:name="_Toc240543523"/>
       <w:r>
         <w:lastRenderedPageBreak/>
         <w:t>APPENDICES</w:t>
@@ -16932,7 +16040,7 @@
       <w:pPr>
         <w:pStyle w:val="Heading2"/>
       </w:pPr>
-      <w:bookmarkStart w:id="62" w:name="_Toc240406140"/>
+      <w:bookmarkStart w:id="62" w:name="_Toc240543524"/>
       <w:r>
         <w:t>Appendix A: Blood Group Compatibility Chart</w:t>
       </w:r>
@@ -16943,10 +16051,7 @@
         <w:jc w:val="both"/>
       </w:pPr>
       <w:r>
-        <w:t xml:space="preserve">The compatibility chart below is the authoritative reference </w:t>
-      </w:r>
-      <w:r>
-        <w:t>implemented in bb-compat.js and used by the donor matching algorithm to suggest compatible donor blood groups when an exact match is unavailable. The chart is written recipient → compatible donor groups; matching code must read it in that direction.</w:t>
+        <w:t>The compatibility chart below is the authoritative reference implemented in bb-compat.js and used by the donor matching algorithm to suggest compatible donor blood groups when an exact match is unavailable. The chart is written recipient → compatible donor groups; matching code must read it in that direction.</w:t>
       </w:r>
     </w:p>
     <w:p>
@@ -16954,10 +16059,7 @@
         <w:pStyle w:val="BBCaption"/>
       </w:pPr>
       <w:r>
-        <w:t xml:space="preserve">Table </w:t>
-      </w:r>
-      <w:r>
-        <w:t>A-1: Recipient → Compatible Donor Blood Groups</w:t>
+        <w:t>Table A-1: Recipient → Compatible Donor Blood Groups</w:t>
       </w:r>
     </w:p>
     <w:tbl>
@@ -17303,13 +16405,7 @@
               <w:rPr>
                 <w:sz w:val="19"/>
               </w:rPr>
-              <w:t xml:space="preserve">O- </w:t>
-            </w:r>
-            <w:r>
-              <w:rPr>
-                <w:sz w:val="19"/>
-              </w:rPr>
-              <w:t>(Universal Donor)</w:t>
+              <w:t>O- (Universal Donor)</w:t>
             </w:r>
           </w:p>
         </w:tc>
@@ -17325,7 +16421,7 @@
       <w:pPr>
         <w:pStyle w:val="Heading2"/>
       </w:pPr>
-      <w:bookmarkStart w:id="63" w:name="_Toc240406141"/>
+      <w:bookmarkStart w:id="63" w:name="_Toc240543525"/>
       <w:r>
         <w:t>Appendix B: REST API Endpoint Reference</w:t>
       </w:r>
@@ -17344,10 +16440,7 @@
         <w:pStyle w:val="BBCaption"/>
       </w:pPr>
       <w:r>
-        <w:t>Table B-1: REST API Endpoint</w:t>
-      </w:r>
-      <w:r>
-        <w:t>s</w:t>
+        <w:t>Table B-1: REST API Endpoints</w:t>
       </w:r>
     </w:p>
     <w:tbl>
@@ -17575,13 +16668,7 @@
               <w:rPr>
                 <w:sz w:val="19"/>
               </w:rPr>
-              <w:t xml:space="preserve">Search donors by blood group and </w:t>
-            </w:r>
-            <w:r>
-              <w:rPr>
-                <w:sz w:val="19"/>
-              </w:rPr>
-              <w:t>location (paginated)</w:t>
+              <w:t>Search donors by blood group and location (paginated)</w:t>
             </w:r>
           </w:p>
         </w:tc>
@@ -17793,13 +16880,7 @@
               <w:rPr>
                 <w:sz w:val="19"/>
               </w:rPr>
-              <w:t xml:space="preserve">Retrieve details of a </w:t>
-            </w:r>
-            <w:r>
-              <w:rPr>
-                <w:sz w:val="19"/>
-              </w:rPr>
-              <w:t>specific blood request</w:t>
+              <w:t>Retrieve details of a specific blood request</w:t>
             </w:r>
           </w:p>
         </w:tc>
@@ -17958,13 +17039,7 @@
               <w:rPr>
                 <w:sz w:val="19"/>
               </w:rPr>
-              <w:t>Update blood bank s</w:t>
-            </w:r>
-            <w:r>
-              <w:rPr>
-                <w:sz w:val="19"/>
-              </w:rPr>
-              <w:t>tock levels</w:t>
+              <w:t>Update blood bank stock levels</w:t>
             </w:r>
           </w:p>
         </w:tc>
@@ -18123,20 +17198,7 @@
               <w:rPr>
                 <w:sz w:val="19"/>
               </w:rPr>
-              <w:t xml:space="preserve">Local: full blood inventory for a specific </w:t>
-            </w:r>
-            <w:r>
-              <w:rPr>
-                <w:sz w:val="19"/>
-              </w:rPr>
-              <w:lastRenderedPageBreak/>
-              <w:t xml:space="preserve">partner hospital </w:t>
-            </w:r>
-            <w:r>
-              <w:rPr>
-                <w:sz w:val="19"/>
-              </w:rPr>
-              <w:t>(TUTH, Bir, Patan, Manmohan, NMCTH)</w:t>
+              <w:t>Local: full blood inventory for a specific partner hospital (TUTH, Bir, Patan, Manmohan, NMCTH)</w:t>
             </w:r>
           </w:p>
         </w:tc>
@@ -18157,7 +17219,6 @@
               <w:rPr>
                 <w:sz w:val="19"/>
               </w:rPr>
-              <w:lastRenderedPageBreak/>
               <w:t>PUT</w:t>
             </w:r>
           </w:p>
@@ -18211,6 +17272,7 @@
               <w:rPr>
                 <w:sz w:val="19"/>
               </w:rPr>
+              <w:lastRenderedPageBreak/>
               <w:t>POST</w:t>
             </w:r>
           </w:p>
@@ -18243,13 +17305,7 @@
               <w:rPr>
                 <w:sz w:val="19"/>
               </w:rPr>
-              <w:t>Local: submit a blood request directly to a pa</w:t>
-            </w:r>
-            <w:r>
-              <w:rPr>
-                <w:sz w:val="19"/>
-              </w:rPr>
-              <w:t>rtner hospital's queue</w:t>
+              <w:t>Local: submit a blood request directly to a partner hospital's queue</w:t>
             </w:r>
           </w:p>
         </w:tc>
@@ -18355,13 +17411,7 @@
               <w:rPr>
                 <w:sz w:val="19"/>
               </w:rPr>
-              <w:t xml:space="preserve">Local: registered donors near a partner </w:t>
-            </w:r>
-            <w:r>
-              <w:rPr>
-                <w:sz w:val="19"/>
-              </w:rPr>
-              <w:t>hospital, filtered by blood group</w:t>
+              <w:t>Local: registered donors near a partner hospital, filtered by blood group</w:t>
             </w:r>
           </w:p>
         </w:tc>
@@ -18430,7 +17480,7 @@
       <w:pPr>
         <w:pStyle w:val="Heading2"/>
       </w:pPr>
-      <w:bookmarkStart w:id="64" w:name="_Toc240406142"/>
+      <w:bookmarkStart w:id="64" w:name="_Toc240543526"/>
       <w:r>
         <w:t>Appendix C: Database Schema</w:t>
       </w:r>
@@ -18441,10 +17491,7 @@
         <w:jc w:val="both"/>
       </w:pPr>
       <w:r>
-        <w:t xml:space="preserve">To be exported from MySQL Workbench during the backend phase: table </w:t>
-      </w:r>
-      <w:r>
-        <w:t>definitions for USER, DONOR, BLOOD_REQUEST, HOSPITAL, BLOOD_INVENTORY and EMAIL_NOTIFICATION with FK constraints, the role/status enums, and the hospital_id + blood_group uniqueness on inventory rows.</w:t>
+        <w:t>To be exported from MySQL Workbench during the backend phase: table definitions for USER, DONOR, BLOOD_REQUEST, HOSPITAL, BLOOD_INVENTORY and EMAIL_NOTIFICATION with FK constraints, the role/status enums, and the hospital_id + blood_group uniqueness on inventory rows.</w:t>
       </w:r>
     </w:p>
     <w:p/>
@@ -18452,7 +17499,7 @@
       <w:pPr>
         <w:pStyle w:val="Heading2"/>
       </w:pPr>
-      <w:bookmarkStart w:id="65" w:name="_Toc240406143"/>
+      <w:bookmarkStart w:id="65" w:name="_Toc240543527"/>
       <w:r>
         <w:t>Appendix D: Selected Source Code</w:t>
       </w:r>
@@ -18463,10 +17510,7 @@
         <w:jc w:val="both"/>
       </w:pPr>
       <w:r>
-        <w:t>Selected implementati</w:t>
-      </w:r>
-      <w:r>
-        <w:t>on excerpts (full files in the submitted codebase):</w:t>
+        <w:t>Selected implementation excerpts (full files in the submitted codebase):</w:t>
       </w:r>
     </w:p>
     <w:p>
@@ -18482,10 +17526,7 @@
         <w:jc w:val="both"/>
       </w:pPr>
       <w:r>
-        <w:t>• CODE/js/bb-api.js — the API facade: endpoint table, mock adapter, real fetch transport, error normalis</w:t>
-      </w:r>
-      <w:r>
-        <w:t>ation, and the documented BASE invariant.</w:t>
+        <w:t>• CODE/js/bb-api.js — the API facade: endpoint table, mock adapter, real fetch transport, error normalisation, and the documented BASE invariant.</w:t>
       </w:r>
     </w:p>
     <w:p>
@@ -18509,10 +17550,7 @@
         <w:jc w:val="both"/>
       </w:pPr>
       <w:r>
-        <w:t>• CODE/js/bb-paginate.</w:t>
-      </w:r>
-      <w:r>
-        <w:t>js — reusable pager (page sizes, prev/next, auto-hide).</w:t>
+        <w:t>• CODE/js/bb-paginate.js — reusable pager (page sizes, prev/next, auto-hide).</w:t>
       </w:r>
     </w:p>
     <w:p/>
@@ -18520,7 +17558,7 @@
       <w:pPr>
         <w:pStyle w:val="Heading2"/>
       </w:pPr>
-      <w:bookmarkStart w:id="66" w:name="_Toc240406144"/>
+      <w:bookmarkStart w:id="66" w:name="_Toc240543528"/>
       <w:r>
         <w:t>Appendix E: QA Evidence and Reproduction Steps</w:t>
       </w:r>
@@ -18539,10 +17577,7 @@
         <w:jc w:val="both"/>
       </w:pPr>
       <w:r>
-        <w:t xml:space="preserve">• resptest/qa-harness.html — 266/266 checks (functional, all four roles, guest flow, </w:t>
-      </w:r>
-      <w:r>
-        <w:t>transport guards). Run: serve the repo root, then headless Chrome with a fresh profile and virtual time budget; the harness prints a per-check PASS/FAIL report.</w:t>
+        <w:t>• resptest/qa-harness.html — 266/266 checks (functional, all four roles, guest flow, transport guards). Run: serve the repo root, then headless Chrome with a fresh profile and virtual time budget; the harness prints a per-check PASS/FAIL report.</w:t>
       </w:r>
     </w:p>
     <w:p>
@@ -18550,10 +17585,7 @@
         <w:jc w:val="both"/>
       </w:pPr>
       <w:r>
-        <w:t>• resptest/responsive-check.html — 92/92 page×width combinations (23 pages at 360/430/768/1280)</w:t>
-      </w:r>
-      <w:r>
-        <w:t xml:space="preserve"> with no horizontal overflow.</w:t>
+        <w:t>• resptest/responsive-check.html — 92/92 page×width combinations (23 pages at 360/430/768/1280) with no horizontal overflow.</w:t>
       </w:r>
     </w:p>
     <w:p>
@@ -18569,11 +17601,7 @@
         <w:jc w:val="both"/>
       </w:pPr>
       <w:r>
-        <w:lastRenderedPageBreak/>
-        <w:t>• resptest/visu</w:t>
-      </w:r>
-      <w:r>
-        <w:t>al-forms.html — computed-style validation-error probe (6.03:1 contrast, error ring cascade) with saved screenshots.</w:t>
+        <w:t>• resptest/visual-forms.html — computed-style validation-error probe (6.03:1 contrast, error ring cascade) with saved screenshots.</w:t>
       </w:r>
     </w:p>
     <w:p>
@@ -18589,7 +17617,7 @@
       <w:pPr>
         <w:pStyle w:val="Heading2"/>
       </w:pPr>
-      <w:bookmarkStart w:id="67" w:name="_Toc240406145"/>
+      <w:bookmarkStart w:id="67" w:name="_Toc240543529"/>
       <w:r>
         <w:t>Appendix F: Additional Screenshots</w:t>
       </w:r>
@@ -18600,10 +17628,7 @@
         <w:jc w:val="both"/>
       </w:pPr>
       <w:r>
-        <w:t>Additiona</w:t>
-      </w:r>
-      <w:r>
-        <w:t>l interface evidence beyond those placed in-chapter (landing, about, contact, legal pages, all four role portals, and the branded 404):</w:t>
+        <w:t>Additional interface evidence beyond those placed in-chapter (landing, about, contact, legal pages, all four role portals, and the branded 404):</w:t>
       </w:r>
     </w:p>
     <w:p>
@@ -18627,10 +17652,7 @@
         <w:jc w:val="both"/>
       </w:pPr>
       <w:r>
-        <w:t>[INS</w:t>
-      </w:r>
-      <w:r>
-        <w:t>ERT SCREENSHOT: donor-dashboard.html — nearby compatible requests with accept/decline]</w:t>
+        <w:t>[INSERT SCREENSHOT: donor-dashboard.html — nearby compatible requests with accept/decline]</w:t>
       </w:r>
     </w:p>
     <w:p>
@@ -19229,11 +18251,6 @@
     <w:lsdException w:name="Book Title" w:uiPriority="33" w:qFormat="1"/>
     <w:lsdException w:name="Bibliography" w:semiHidden="1" w:uiPriority="37" w:unhideWhenUsed="1"/>
     <w:lsdException w:name="TOC Heading" w:semiHidden="1" w:uiPriority="39" w:unhideWhenUsed="1" w:qFormat="1"/>
-    <w:lsdException w:name="Plain Table 5" w:semiHidden="1" w:unhideWhenUsed="1"/>
-    <w:lsdException w:name="Grid Table Light" w:semiHidden="1" w:unhideWhenUsed="1"/>
-    <w:lsdException w:name="Grid Table 1 Light" w:semiHidden="1" w:unhideWhenUsed="1"/>
-    <w:lsdException w:name="Grid Table 2" w:semiHidden="1" w:unhideWhenUsed="1"/>
-    <w:lsdException w:name="Grid Table 3" w:semiHidden="1" w:unhideWhenUsed="1"/>
     <w:lsdException w:name="Grid Table 4" w:uiPriority="49"/>
     <w:lsdException w:name="Grid Table 5 Dark" w:uiPriority="50"/>
     <w:lsdException w:name="Grid Table 6 Colorful" w:uiPriority="51"/>

</xml_diff>